<commit_message>
vault backup: 2026-03-31 18:19:52
</commit_message>
<xml_diff>
--- a/Курс 3/Архитектура ЭВМ/Курисовая/Кринкин_РПЗ.docx
+++ b/Курс 3/Архитектура ЭВМ/Курисовая/Кринкин_РПЗ.docx
@@ -2107,7 +2107,7 @@
             <w:pStyle w:val="11"/>
             <w:rPr>
               <w:rFonts w:asciiTheme="minorHAnsi" w:eastAsiaTheme="minorEastAsia" w:hAnsiTheme="minorHAnsi" w:cstheme="minorBidi"/>
-              <w:color w:val="ED7D31" w:themeColor="accent2"/>
+              <w:color w:val="70AD47" w:themeColor="accent6"/>
               <w:sz w:val="24"/>
               <w:szCs w:val="24"/>
               <w:lang w:val="en-US"/>
@@ -2117,55 +2117,55 @@
             <w:r>
               <w:rPr>
                 <w:rStyle w:val="af2"/>
-                <w:color w:val="ED7D31" w:themeColor="accent2"/>
+                <w:color w:val="70AD47" w:themeColor="accent6"/>
               </w:rPr>
               <w:t>2. Практическая часть</w:t>
             </w:r>
             <w:r>
               <w:rPr>
                 <w:webHidden/>
-                <w:color w:val="ED7D31" w:themeColor="accent2"/>
+                <w:color w:val="70AD47" w:themeColor="accent6"/>
               </w:rPr>
               <w:tab/>
             </w:r>
             <w:r>
               <w:rPr>
                 <w:webHidden/>
-                <w:color w:val="ED7D31" w:themeColor="accent2"/>
+                <w:color w:val="70AD47" w:themeColor="accent6"/>
               </w:rPr>
               <w:fldChar w:fldCharType="begin"/>
             </w:r>
             <w:r>
               <w:rPr>
                 <w:webHidden/>
-                <w:color w:val="ED7D31" w:themeColor="accent2"/>
+                <w:color w:val="70AD47" w:themeColor="accent6"/>
               </w:rPr>
               <w:instrText xml:space="preserve"> PAGEREF _Toc225692795 \h </w:instrText>
             </w:r>
             <w:r>
               <w:rPr>
                 <w:webHidden/>
-                <w:color w:val="ED7D31" w:themeColor="accent2"/>
+                <w:color w:val="70AD47" w:themeColor="accent6"/>
               </w:rPr>
             </w:r>
             <w:r>
               <w:rPr>
                 <w:webHidden/>
-                <w:color w:val="ED7D31" w:themeColor="accent2"/>
+                <w:color w:val="70AD47" w:themeColor="accent6"/>
               </w:rPr>
               <w:fldChar w:fldCharType="separate"/>
             </w:r>
             <w:r>
               <w:rPr>
                 <w:webHidden/>
-                <w:color w:val="ED7D31" w:themeColor="accent2"/>
+                <w:color w:val="70AD47" w:themeColor="accent6"/>
               </w:rPr>
               <w:t>6</w:t>
             </w:r>
             <w:r>
               <w:rPr>
                 <w:webHidden/>
-                <w:color w:val="ED7D31" w:themeColor="accent2"/>
+                <w:color w:val="70AD47" w:themeColor="accent6"/>
               </w:rPr>
               <w:fldChar w:fldCharType="end"/>
             </w:r>
@@ -2420,7 +2420,6 @@
             <w:pStyle w:val="23"/>
             <w:rPr>
               <w:rFonts w:asciiTheme="minorHAnsi" w:eastAsiaTheme="minorEastAsia" w:hAnsiTheme="minorHAnsi" w:cstheme="minorBidi"/>
-              <w:color w:val="ED7D31" w:themeColor="accent2"/>
               <w:sz w:val="24"/>
               <w:szCs w:val="24"/>
               <w:lang w:val="en-US"/>
@@ -2430,55 +2429,48 @@
             <w:r>
               <w:rPr>
                 <w:rStyle w:val="af2"/>
-                <w:color w:val="ED7D31" w:themeColor="accent2"/>
+                <w:color w:val="70AD47" w:themeColor="accent6"/>
               </w:rPr>
               <w:t>2.5. Кодирование</w:t>
             </w:r>
             <w:r>
               <w:rPr>
                 <w:webHidden/>
-                <w:color w:val="ED7D31" w:themeColor="accent2"/>
               </w:rPr>
               <w:tab/>
             </w:r>
             <w:r>
               <w:rPr>
                 <w:webHidden/>
-                <w:color w:val="ED7D31" w:themeColor="accent2"/>
               </w:rPr>
               <w:fldChar w:fldCharType="begin"/>
             </w:r>
             <w:r>
               <w:rPr>
                 <w:webHidden/>
-                <w:color w:val="ED7D31" w:themeColor="accent2"/>
               </w:rPr>
               <w:instrText xml:space="preserve"> PAGEREF _Toc225692800 \h </w:instrText>
             </w:r>
             <w:r>
               <w:rPr>
                 <w:webHidden/>
-                <w:color w:val="ED7D31" w:themeColor="accent2"/>
               </w:rPr>
             </w:r>
             <w:r>
               <w:rPr>
                 <w:webHidden/>
-                <w:color w:val="ED7D31" w:themeColor="accent2"/>
               </w:rPr>
               <w:fldChar w:fldCharType="separate"/>
             </w:r>
             <w:r>
               <w:rPr>
                 <w:webHidden/>
-                <w:color w:val="ED7D31" w:themeColor="accent2"/>
               </w:rPr>
               <w:t>13</w:t>
             </w:r>
             <w:r>
               <w:rPr>
                 <w:webHidden/>
-                <w:color w:val="ED7D31" w:themeColor="accent2"/>
               </w:rPr>
               <w:fldChar w:fldCharType="end"/>
             </w:r>
@@ -2865,7 +2857,19 @@
               <w:rPr>
                 <w:rStyle w:val="af2"/>
               </w:rPr>
-              <w:t>. Руководство пользователя</w:t>
+              <w:t>. Руководство по</w:t>
+            </w:r>
+            <w:r>
+              <w:rPr>
+                <w:rStyle w:val="af2"/>
+              </w:rPr>
+              <w:t>л</w:t>
+            </w:r>
+            <w:r>
+              <w:rPr>
+                <w:rStyle w:val="af2"/>
+              </w:rPr>
+              <w:t>ьзователя</w:t>
             </w:r>
             <w:r>
               <w:rPr>
@@ -4475,7 +4479,7 @@
           <w:noProof/>
         </w:rPr>
         <w:drawing>
-          <wp:inline distT="0" distB="0" distL="0" distR="0" wp14:anchorId="34D2DCCC" wp14:editId="423D6DE2">
+          <wp:inline distT="0" distB="0" distL="0" distR="0" wp14:anchorId="34D2DCCC" wp14:editId="57E029DE">
             <wp:extent cx="3587750" cy="2690627"/>
             <wp:effectExtent l="0" t="0" r="0" b="0"/>
             <wp:docPr id="203042834" name="Рисунок 2" descr="Купить Макетная плата без пайки (400 точек) для Ардуино (KZY0005)  официальный магазин"/>
@@ -6588,7 +6592,6 @@
           <w:p>
             <w:pPr>
               <w:ind w:firstLine="0"/>
-              <w:jc w:val="center"/>
               <w:rPr>
                 <w:sz w:val="24"/>
                 <w:lang w:val="en-US"/>
@@ -6599,7 +6602,7 @@
                 <w:sz w:val="24"/>
                 <w:lang w:val="en-US"/>
               </w:rPr>
-              <w:t>1</w:t>
+              <w:t>display</w:t>
             </w:r>
           </w:p>
         </w:tc>
@@ -6611,18 +6614,17 @@
           <w:p>
             <w:pPr>
               <w:ind w:firstLine="0"/>
-              <w:jc w:val="center"/>
-              <w:rPr>
-                <w:sz w:val="24"/>
-                <w:lang w:val="en-US"/>
-              </w:rPr>
-            </w:pPr>
-            <w:r>
-              <w:rPr>
-                <w:sz w:val="24"/>
-                <w:lang w:val="en-US"/>
-              </w:rPr>
-              <w:t>2</w:t>
+              <w:rPr>
+                <w:sz w:val="24"/>
+                <w:lang w:val="ru-RU"/>
+              </w:rPr>
+            </w:pPr>
+            <w:r>
+              <w:rPr>
+                <w:sz w:val="24"/>
+                <w:lang w:val="ru-RU"/>
+              </w:rPr>
+              <w:t>Adafruit_SSD1306</w:t>
             </w:r>
           </w:p>
         </w:tc>
@@ -6634,18 +6636,17 @@
           <w:p>
             <w:pPr>
               <w:ind w:firstLine="0"/>
-              <w:jc w:val="center"/>
-              <w:rPr>
-                <w:sz w:val="24"/>
-                <w:lang w:val="en-US"/>
-              </w:rPr>
-            </w:pPr>
-            <w:r>
-              <w:rPr>
-                <w:sz w:val="24"/>
-                <w:lang w:val="en-US"/>
-              </w:rPr>
-              <w:t>3</w:t>
+              <w:rPr>
+                <w:sz w:val="24"/>
+                <w:lang w:val="ru-RU"/>
+              </w:rPr>
+            </w:pPr>
+            <w:r>
+              <w:rPr>
+                <w:sz w:val="24"/>
+                <w:lang w:val="ru-RU"/>
+              </w:rPr>
+              <w:t>Объект, представляющий интерфейс для работы с дисплеем</w:t>
             </w:r>
           </w:p>
         </w:tc>
@@ -6664,13 +6665,15 @@
                 <w:lang w:val="en-US"/>
               </w:rPr>
             </w:pPr>
+            <w:proofErr w:type="spellStart"/>
             <w:r>
               <w:rPr>
                 <w:sz w:val="24"/>
                 <w:lang w:val="en-US"/>
               </w:rPr>
-              <w:t>display</w:t>
-            </w:r>
+              <w:t>current_mode</w:t>
+            </w:r>
+            <w:proofErr w:type="spellEnd"/>
           </w:p>
         </w:tc>
         <w:tc>
@@ -6691,7 +6694,7 @@
                 <w:sz w:val="24"/>
                 <w:lang w:val="ru-RU"/>
               </w:rPr>
-              <w:t>Adafruit_SSD1306</w:t>
+              <w:t>int8_t</w:t>
             </w:r>
           </w:p>
         </w:tc>
@@ -6708,6 +6711,13 @@
                 <w:lang w:val="ru-RU"/>
               </w:rPr>
             </w:pPr>
+            <w:r>
+              <w:rPr>
+                <w:sz w:val="24"/>
+                <w:lang w:val="ru-RU"/>
+              </w:rPr>
+              <w:t>Текущий выбранный режим работы</w:t>
+            </w:r>
           </w:p>
         </w:tc>
       </w:tr>
@@ -6731,7 +6741,7 @@
                 <w:sz w:val="24"/>
                 <w:lang w:val="en-US"/>
               </w:rPr>
-              <w:t>current_mode</w:t>
+              <w:t>left_pressed</w:t>
             </w:r>
             <w:proofErr w:type="spellEnd"/>
           </w:p>
@@ -6749,13 +6759,15 @@
                 <w:lang w:val="ru-RU"/>
               </w:rPr>
             </w:pPr>
-            <w:r>
-              <w:rPr>
-                <w:sz w:val="24"/>
-                <w:lang w:val="ru-RU"/>
-              </w:rPr>
-              <w:t>int8_t</w:t>
-            </w:r>
+            <w:proofErr w:type="spellStart"/>
+            <w:r>
+              <w:rPr>
+                <w:sz w:val="24"/>
+                <w:lang w:val="ru-RU"/>
+              </w:rPr>
+              <w:t>bool</w:t>
+            </w:r>
+            <w:proofErr w:type="spellEnd"/>
           </w:p>
         </w:tc>
         <w:tc>
@@ -6771,6 +6783,13 @@
                 <w:lang w:val="ru-RU"/>
               </w:rPr>
             </w:pPr>
+            <w:r>
+              <w:rPr>
+                <w:sz w:val="24"/>
+                <w:lang w:val="ru-RU"/>
+              </w:rPr>
+              <w:t>Была ли уже нажата левая клавиша</w:t>
+            </w:r>
           </w:p>
         </w:tc>
       </w:tr>
@@ -6794,7 +6813,7 @@
                 <w:sz w:val="24"/>
                 <w:lang w:val="en-US"/>
               </w:rPr>
-              <w:t>left_pressed</w:t>
+              <w:t>right_pressed</w:t>
             </w:r>
             <w:proofErr w:type="spellEnd"/>
           </w:p>
@@ -6836,6 +6855,41 @@
                 <w:lang w:val="ru-RU"/>
               </w:rPr>
             </w:pPr>
+            <w:r>
+              <w:rPr>
+                <w:sz w:val="24"/>
+                <w:lang w:val="ru-RU"/>
+              </w:rPr>
+              <w:t xml:space="preserve">Была ли </w:t>
+            </w:r>
+            <w:r>
+              <w:rPr>
+                <w:sz w:val="24"/>
+                <w:lang w:val="ru-RU"/>
+              </w:rPr>
+              <w:t xml:space="preserve">уже </w:t>
+            </w:r>
+            <w:r>
+              <w:rPr>
+                <w:sz w:val="24"/>
+                <w:lang w:val="ru-RU"/>
+              </w:rPr>
+              <w:t xml:space="preserve">нажата </w:t>
+            </w:r>
+            <w:r>
+              <w:rPr>
+                <w:sz w:val="24"/>
+                <w:lang w:val="ru-RU"/>
+              </w:rPr>
+              <w:t>правая</w:t>
+            </w:r>
+            <w:r>
+              <w:rPr>
+                <w:sz w:val="24"/>
+                <w:lang w:val="ru-RU"/>
+              </w:rPr>
+              <w:t xml:space="preserve"> клавиша</w:t>
+            </w:r>
           </w:p>
         </w:tc>
       </w:tr>
@@ -6853,15 +6907,13 @@
                 <w:lang w:val="en-US"/>
               </w:rPr>
             </w:pPr>
-            <w:proofErr w:type="spellStart"/>
             <w:r>
               <w:rPr>
                 <w:sz w:val="24"/>
                 <w:lang w:val="en-US"/>
               </w:rPr>
-              <w:t>right_pressed</w:t>
-            </w:r>
-            <w:proofErr w:type="spellEnd"/>
+              <w:t>released</w:t>
+            </w:r>
           </w:p>
         </w:tc>
         <w:tc>
@@ -6901,6 +6953,13 @@
                 <w:lang w:val="ru-RU"/>
               </w:rPr>
             </w:pPr>
+            <w:r>
+              <w:rPr>
+                <w:sz w:val="24"/>
+                <w:lang w:val="ru-RU"/>
+              </w:rPr>
+              <w:t>Была ли ранее нажатая клавиша уже опущена</w:t>
+            </w:r>
           </w:p>
         </w:tc>
       </w:tr>
@@ -6918,13 +6977,15 @@
                 <w:lang w:val="en-US"/>
               </w:rPr>
             </w:pPr>
+            <w:proofErr w:type="spellStart"/>
             <w:r>
               <w:rPr>
                 <w:sz w:val="24"/>
                 <w:lang w:val="en-US"/>
               </w:rPr>
-              <w:t>released</w:t>
-            </w:r>
+              <w:t>key_index</w:t>
+            </w:r>
+            <w:proofErr w:type="spellEnd"/>
           </w:p>
         </w:tc>
         <w:tc>
@@ -6940,15 +7001,13 @@
                 <w:lang w:val="ru-RU"/>
               </w:rPr>
             </w:pPr>
-            <w:proofErr w:type="spellStart"/>
-            <w:r>
-              <w:rPr>
-                <w:sz w:val="24"/>
-                <w:lang w:val="ru-RU"/>
-              </w:rPr>
-              <w:t>bool</w:t>
-            </w:r>
-            <w:proofErr w:type="spellEnd"/>
+            <w:r>
+              <w:rPr>
+                <w:sz w:val="24"/>
+                <w:lang w:val="ru-RU"/>
+              </w:rPr>
+              <w:t>int8_t</w:t>
+            </w:r>
           </w:p>
         </w:tc>
         <w:tc>
@@ -6964,6 +7023,13 @@
                 <w:lang w:val="ru-RU"/>
               </w:rPr>
             </w:pPr>
+            <w:r>
+              <w:rPr>
+                <w:sz w:val="24"/>
+                <w:lang w:val="ru-RU"/>
+              </w:rPr>
+              <w:t>Индекс текущего вводимого символа</w:t>
+            </w:r>
           </w:p>
         </w:tc>
       </w:tr>
@@ -6981,15 +7047,13 @@
                 <w:lang w:val="en-US"/>
               </w:rPr>
             </w:pPr>
-            <w:proofErr w:type="spellStart"/>
             <w:r>
               <w:rPr>
                 <w:sz w:val="24"/>
                 <w:lang w:val="en-US"/>
               </w:rPr>
-              <w:t>key_index</w:t>
-            </w:r>
-            <w:proofErr w:type="spellEnd"/>
+              <w:t>state</w:t>
+            </w:r>
           </w:p>
         </w:tc>
         <w:tc>
@@ -7027,6 +7091,13 @@
                 <w:lang w:val="ru-RU"/>
               </w:rPr>
             </w:pPr>
+            <w:r>
+              <w:rPr>
+                <w:sz w:val="24"/>
+                <w:lang w:val="ru-RU"/>
+              </w:rPr>
+              <w:t>Состояние буфера обмена</w:t>
+            </w:r>
           </w:p>
         </w:tc>
       </w:tr>
@@ -7044,13 +7115,15 @@
                 <w:lang w:val="en-US"/>
               </w:rPr>
             </w:pPr>
+            <w:proofErr w:type="spellStart"/>
             <w:r>
               <w:rPr>
                 <w:sz w:val="24"/>
                 <w:lang w:val="en-US"/>
               </w:rPr>
-              <w:t>state</w:t>
-            </w:r>
+              <w:t>mode_changed</w:t>
+            </w:r>
+            <w:proofErr w:type="spellEnd"/>
           </w:p>
         </w:tc>
         <w:tc>
@@ -7066,13 +7139,15 @@
                 <w:lang w:val="ru-RU"/>
               </w:rPr>
             </w:pPr>
-            <w:r>
-              <w:rPr>
-                <w:sz w:val="24"/>
-                <w:lang w:val="ru-RU"/>
-              </w:rPr>
-              <w:t>int8_t</w:t>
-            </w:r>
+            <w:proofErr w:type="spellStart"/>
+            <w:r>
+              <w:rPr>
+                <w:sz w:val="24"/>
+                <w:lang w:val="ru-RU"/>
+              </w:rPr>
+              <w:t>bool</w:t>
+            </w:r>
+            <w:proofErr w:type="spellEnd"/>
           </w:p>
         </w:tc>
         <w:tc>
@@ -7088,6 +7163,13 @@
                 <w:lang w:val="ru-RU"/>
               </w:rPr>
             </w:pPr>
+            <w:r>
+              <w:rPr>
+                <w:sz w:val="24"/>
+                <w:lang w:val="ru-RU"/>
+              </w:rPr>
+              <w:t>Был ли уже поменян режим в момент нажатия двух клавиш</w:t>
+            </w:r>
           </w:p>
         </w:tc>
       </w:tr>
@@ -7105,15 +7187,13 @@
                 <w:lang w:val="en-US"/>
               </w:rPr>
             </w:pPr>
-            <w:proofErr w:type="spellStart"/>
             <w:r>
               <w:rPr>
                 <w:sz w:val="24"/>
                 <w:lang w:val="en-US"/>
               </w:rPr>
-              <w:t>mode_changed</w:t>
-            </w:r>
-            <w:proofErr w:type="spellEnd"/>
+              <w:t>LEFT_BUTTON</w:t>
+            </w:r>
           </w:p>
         </w:tc>
         <w:tc>
@@ -7126,18 +7206,23 @@
               <w:ind w:firstLine="0"/>
               <w:rPr>
                 <w:sz w:val="24"/>
-                <w:lang w:val="ru-RU"/>
-              </w:rPr>
-            </w:pPr>
-            <w:proofErr w:type="spellStart"/>
-            <w:r>
-              <w:rPr>
-                <w:sz w:val="24"/>
-                <w:lang w:val="ru-RU"/>
-              </w:rPr>
-              <w:t>bool</w:t>
-            </w:r>
-            <w:proofErr w:type="spellEnd"/>
+                <w:lang w:val="en-US"/>
+              </w:rPr>
+            </w:pPr>
+            <w:r>
+              <w:rPr>
+                <w:sz w:val="24"/>
+                <w:lang w:val="en-US"/>
+              </w:rPr>
+              <w:t xml:space="preserve">const </w:t>
+            </w:r>
+            <w:r>
+              <w:rPr>
+                <w:sz w:val="24"/>
+                <w:lang w:val="en-US"/>
+              </w:rPr>
+              <w:t>int</w:t>
+            </w:r>
           </w:p>
         </w:tc>
         <w:tc>
@@ -7153,6 +7238,13 @@
                 <w:lang w:val="ru-RU"/>
               </w:rPr>
             </w:pPr>
+            <w:r>
+              <w:rPr>
+                <w:sz w:val="24"/>
+                <w:lang w:val="ru-RU"/>
+              </w:rPr>
+              <w:t>Константа, хранящая номер пина, к которому подключена левая кнопка</w:t>
+            </w:r>
           </w:p>
         </w:tc>
       </w:tr>
@@ -7175,7 +7267,7 @@
                 <w:sz w:val="24"/>
                 <w:lang w:val="en-US"/>
               </w:rPr>
-              <w:t>LEFT_BUTTON</w:t>
+              <w:t>RIGHT_BUTTON</w:t>
             </w:r>
           </w:p>
         </w:tc>
@@ -7197,14 +7289,7 @@
                 <w:sz w:val="24"/>
                 <w:lang w:val="en-US"/>
               </w:rPr>
-              <w:t xml:space="preserve">const </w:t>
-            </w:r>
-            <w:r>
-              <w:rPr>
-                <w:sz w:val="24"/>
-                <w:lang w:val="en-US"/>
-              </w:rPr>
-              <w:t>int</w:t>
+              <w:t>const int</w:t>
             </w:r>
           </w:p>
         </w:tc>
@@ -7221,6 +7306,27 @@
                 <w:lang w:val="ru-RU"/>
               </w:rPr>
             </w:pPr>
+            <w:r>
+              <w:rPr>
+                <w:sz w:val="24"/>
+                <w:lang w:val="ru-RU"/>
+              </w:rPr>
+              <w:t xml:space="preserve">Константа, хранящая номер пина, к которому подключена </w:t>
+            </w:r>
+            <w:r>
+              <w:rPr>
+                <w:sz w:val="24"/>
+                <w:lang w:val="ru-RU"/>
+              </w:rPr>
+              <w:t>правая</w:t>
+            </w:r>
+            <w:r>
+              <w:rPr>
+                <w:sz w:val="24"/>
+                <w:lang w:val="ru-RU"/>
+              </w:rPr>
+              <w:t xml:space="preserve"> кнопка</w:t>
+            </w:r>
           </w:p>
         </w:tc>
       </w:tr>
@@ -7243,7 +7349,7 @@
                 <w:sz w:val="24"/>
                 <w:lang w:val="en-US"/>
               </w:rPr>
-              <w:t>RIGHT_BUTTON</w:t>
+              <w:t>KEY_SPACE</w:t>
             </w:r>
           </w:p>
         </w:tc>
@@ -7282,6 +7388,20 @@
                 <w:lang w:val="ru-RU"/>
               </w:rPr>
             </w:pPr>
+            <w:r>
+              <w:rPr>
+                <w:sz w:val="24"/>
+                <w:lang w:val="ru-RU"/>
+              </w:rPr>
+              <w:t>Константа, хранящая</w:t>
+            </w:r>
+            <w:r>
+              <w:rPr>
+                <w:sz w:val="24"/>
+                <w:lang w:val="ru-RU"/>
+              </w:rPr>
+              <w:t xml:space="preserve"> код клавиши «Пробел» на клавиатуре</w:t>
+            </w:r>
           </w:p>
         </w:tc>
       </w:tr>
@@ -7304,7 +7424,7 @@
                 <w:sz w:val="24"/>
                 <w:lang w:val="en-US"/>
               </w:rPr>
-              <w:t>KEY_SPACE</w:t>
+              <w:t>KEYS</w:t>
             </w:r>
           </w:p>
         </w:tc>
@@ -7343,6 +7463,20 @@
                 <w:lang w:val="ru-RU"/>
               </w:rPr>
             </w:pPr>
+            <w:r>
+              <w:rPr>
+                <w:sz w:val="24"/>
+                <w:lang w:val="ru-RU"/>
+              </w:rPr>
+              <w:t>Константа, хранящая</w:t>
+            </w:r>
+            <w:r>
+              <w:rPr>
+                <w:sz w:val="24"/>
+                <w:lang w:val="ru-RU"/>
+              </w:rPr>
+              <w:t xml:space="preserve"> количество описанных в раскладке клавиш</w:t>
+            </w:r>
           </w:p>
         </w:tc>
       </w:tr>
@@ -7360,13 +7494,15 @@
                 <w:lang w:val="en-US"/>
               </w:rPr>
             </w:pPr>
+            <w:proofErr w:type="spellStart"/>
             <w:r>
               <w:rPr>
                 <w:sz w:val="24"/>
                 <w:lang w:val="en-US"/>
               </w:rPr>
-              <w:t>KEYS</w:t>
-            </w:r>
+              <w:t>keys_arr</w:t>
+            </w:r>
+            <w:proofErr w:type="spellEnd"/>
           </w:p>
         </w:tc>
         <w:tc>
@@ -7382,13 +7518,15 @@
                 <w:lang w:val="en-US"/>
               </w:rPr>
             </w:pPr>
+            <w:proofErr w:type="spellStart"/>
             <w:r>
               <w:rPr>
                 <w:sz w:val="24"/>
                 <w:lang w:val="en-US"/>
               </w:rPr>
-              <w:t>const int</w:t>
-            </w:r>
+              <w:t>KeyboardLayout</w:t>
+            </w:r>
+            <w:proofErr w:type="spellEnd"/>
           </w:p>
         </w:tc>
         <w:tc>
@@ -7401,74 +7539,37 @@
               <w:ind w:firstLine="0"/>
               <w:rPr>
                 <w:sz w:val="24"/>
-                <w:lang w:val="ru-RU"/>
-              </w:rPr>
-            </w:pPr>
-          </w:p>
-        </w:tc>
-      </w:tr>
-      <w:tr>
-        <w:tc>
-          <w:tcPr>
-            <w:tcW w:w="2039" w:type="dxa"/>
-            <w:vAlign w:val="center"/>
-          </w:tcPr>
-          <w:p>
-            <w:pPr>
-              <w:ind w:firstLine="0"/>
-              <w:rPr>
-                <w:sz w:val="24"/>
                 <w:lang w:val="en-US"/>
               </w:rPr>
             </w:pPr>
-            <w:proofErr w:type="spellStart"/>
+            <w:r>
+              <w:rPr>
+                <w:sz w:val="24"/>
+                <w:lang w:val="ru-RU"/>
+              </w:rPr>
+              <w:t xml:space="preserve">Массив структур </w:t>
+            </w:r>
+            <w:r>
+              <w:rPr>
+                <w:sz w:val="24"/>
+                <w:lang w:val="ru-RU"/>
+              </w:rPr>
+              <w:t xml:space="preserve">размером </w:t>
+            </w:r>
             <w:r>
               <w:rPr>
                 <w:sz w:val="24"/>
                 <w:lang w:val="en-US"/>
               </w:rPr>
-              <w:t>keys_arr</w:t>
-            </w:r>
-            <w:proofErr w:type="spellEnd"/>
-          </w:p>
-        </w:tc>
-        <w:tc>
-          <w:tcPr>
-            <w:tcW w:w="2070" w:type="dxa"/>
-            <w:vAlign w:val="center"/>
-          </w:tcPr>
-          <w:p>
-            <w:pPr>
-              <w:ind w:firstLine="0"/>
-              <w:rPr>
-                <w:sz w:val="24"/>
-                <w:lang w:val="en-US"/>
-              </w:rPr>
-            </w:pPr>
-            <w:proofErr w:type="spellStart"/>
-            <w:r>
-              <w:rPr>
-                <w:sz w:val="24"/>
-                <w:lang w:val="en-US"/>
-              </w:rPr>
-              <w:t>KeyboardLayout</w:t>
-            </w:r>
-            <w:proofErr w:type="spellEnd"/>
-          </w:p>
-        </w:tc>
-        <w:tc>
-          <w:tcPr>
-            <w:tcW w:w="5519" w:type="dxa"/>
-            <w:vAlign w:val="center"/>
-          </w:tcPr>
-          <w:p>
-            <w:pPr>
-              <w:ind w:firstLine="0"/>
-              <w:rPr>
-                <w:sz w:val="24"/>
-                <w:lang w:val="ru-RU"/>
-              </w:rPr>
-            </w:pPr>
+              <w:t>KEYS</w:t>
+            </w:r>
+            <w:r>
+              <w:rPr>
+                <w:sz w:val="24"/>
+                <w:lang w:val="ru-RU"/>
+              </w:rPr>
+              <w:t>, представляющий собой раскладку клавиатуры</w:t>
+            </w:r>
           </w:p>
         </w:tc>
       </w:tr>
@@ -7476,7 +7577,7 @@
     <w:p>
       <w:pPr>
         <w:rPr>
-          <w:lang w:val="en-US"/>
+          <w:lang w:val="ru-RU"/>
         </w:rPr>
       </w:pPr>
     </w:p>
@@ -7550,6 +7651,22 @@
     </w:p>
     <w:p>
       <w:pPr>
+        <w:ind w:firstLine="426"/>
+        <w:rPr>
+          <w:szCs w:val="28"/>
+        </w:rPr>
+      </w:pPr>
+    </w:p>
+    <w:p>
+      <w:pPr>
+        <w:ind w:firstLine="426"/>
+        <w:rPr>
+          <w:szCs w:val="28"/>
+        </w:rPr>
+      </w:pPr>
+    </w:p>
+    <w:p>
+      <w:pPr>
         <w:jc w:val="right"/>
         <w:rPr>
           <w:szCs w:val="28"/>
@@ -7559,6 +7676,7 @@
         <w:rPr>
           <w:szCs w:val="28"/>
         </w:rPr>
+        <w:lastRenderedPageBreak/>
         <w:t>Таблица 3</w:t>
       </w:r>
     </w:p>
@@ -7584,9 +7702,9 @@
       </w:tblPr>
       <w:tblGrid>
         <w:gridCol w:w="1962"/>
-        <w:gridCol w:w="1025"/>
-        <w:gridCol w:w="2561"/>
-        <w:gridCol w:w="4080"/>
+        <w:gridCol w:w="1023"/>
+        <w:gridCol w:w="2547"/>
+        <w:gridCol w:w="4096"/>
       </w:tblGrid>
       <w:tr>
         <w:tc>
@@ -7836,6 +7954,13 @@
                 <w:lang w:val="ru-RU"/>
               </w:rPr>
             </w:pPr>
+            <w:r>
+              <w:rPr>
+                <w:sz w:val="24"/>
+                <w:lang w:val="ru-RU"/>
+              </w:rPr>
+              <w:t>Функция, инициализирующая микроконтроллер и дисплей</w:t>
+            </w:r>
           </w:p>
         </w:tc>
       </w:tr>
@@ -7915,6 +8040,20 @@
                 <w:lang w:val="ru-RU"/>
               </w:rPr>
             </w:pPr>
+            <w:r>
+              <w:rPr>
+                <w:sz w:val="24"/>
+                <w:lang w:val="ru-RU"/>
+              </w:rPr>
+              <w:t xml:space="preserve">Функция, исполняющаяся циклично всё время работы микроконтроллера. </w:t>
+            </w:r>
+            <w:r>
+              <w:rPr>
+                <w:sz w:val="24"/>
+                <w:lang w:val="ru-RU"/>
+              </w:rPr>
+              <w:t>Вызывает текущий режим работы</w:t>
+            </w:r>
           </w:p>
         </w:tc>
       </w:tr>
@@ -7937,7 +8076,6 @@
                 <w:sz w:val="24"/>
                 <w:lang w:val="en-US"/>
               </w:rPr>
-              <w:lastRenderedPageBreak/>
               <w:t>key_press</w:t>
             </w:r>
             <w:proofErr w:type="spellEnd"/>
@@ -8012,9 +8150,16 @@
               <w:ind w:firstLine="0"/>
               <w:rPr>
                 <w:sz w:val="24"/>
-                <w:lang w:val="en-US"/>
-              </w:rPr>
-            </w:pPr>
+                <w:lang w:val="ru-RU"/>
+              </w:rPr>
+            </w:pPr>
+            <w:r>
+              <w:rPr>
+                <w:sz w:val="24"/>
+                <w:lang w:val="ru-RU"/>
+              </w:rPr>
+              <w:t>Функция, реализующая логику обработки нажатий на одну из клавиш</w:t>
+            </w:r>
           </w:p>
         </w:tc>
       </w:tr>
@@ -8096,6 +8241,13 @@
                 <w:lang w:val="ru-RU"/>
               </w:rPr>
             </w:pPr>
+            <w:r>
+              <w:rPr>
+                <w:sz w:val="24"/>
+                <w:lang w:val="ru-RU"/>
+              </w:rPr>
+              <w:t>Функция работы микроконтроллера в первом режиме</w:t>
+            </w:r>
           </w:p>
         </w:tc>
       </w:tr>
@@ -8177,6 +8329,41 @@
                 <w:lang w:val="ru-RU"/>
               </w:rPr>
             </w:pPr>
+            <w:r>
+              <w:rPr>
+                <w:sz w:val="24"/>
+                <w:lang w:val="ru-RU"/>
+              </w:rPr>
+              <w:t>Функция работы микроконтроллера в</w:t>
+            </w:r>
+            <w:r>
+              <w:rPr>
+                <w:sz w:val="24"/>
+                <w:lang w:val="ru-RU"/>
+              </w:rPr>
+              <w:t>о</w:t>
+            </w:r>
+            <w:r>
+              <w:rPr>
+                <w:sz w:val="24"/>
+                <w:lang w:val="ru-RU"/>
+              </w:rPr>
+              <w:t xml:space="preserve"> </w:t>
+            </w:r>
+            <w:r>
+              <w:rPr>
+                <w:sz w:val="24"/>
+                <w:lang w:val="ru-RU"/>
+              </w:rPr>
+              <w:t>втором</w:t>
+            </w:r>
+            <w:r>
+              <w:rPr>
+                <w:sz w:val="24"/>
+                <w:lang w:val="ru-RU"/>
+              </w:rPr>
+              <w:t xml:space="preserve"> режиме</w:t>
+            </w:r>
           </w:p>
         </w:tc>
       </w:tr>
@@ -8258,6 +8445,27 @@
                 <w:lang w:val="ru-RU"/>
               </w:rPr>
             </w:pPr>
+            <w:r>
+              <w:rPr>
+                <w:sz w:val="24"/>
+                <w:lang w:val="ru-RU"/>
+              </w:rPr>
+              <w:t xml:space="preserve">Функция работы микроконтроллера в </w:t>
+            </w:r>
+            <w:r>
+              <w:rPr>
+                <w:sz w:val="24"/>
+                <w:lang w:val="ru-RU"/>
+              </w:rPr>
+              <w:t>третьем</w:t>
+            </w:r>
+            <w:r>
+              <w:rPr>
+                <w:sz w:val="24"/>
+                <w:lang w:val="ru-RU"/>
+              </w:rPr>
+              <w:t xml:space="preserve"> режиме</w:t>
+            </w:r>
           </w:p>
         </w:tc>
       </w:tr>
@@ -8339,6 +8547,13 @@
                 <w:lang w:val="ru-RU"/>
               </w:rPr>
             </w:pPr>
+            <w:r>
+              <w:rPr>
+                <w:sz w:val="24"/>
+                <w:lang w:val="ru-RU"/>
+              </w:rPr>
+              <w:t>Функция смены режима на следующий</w:t>
+            </w:r>
           </w:p>
         </w:tc>
       </w:tr>
@@ -8420,6 +8635,29 @@
                 <w:lang w:val="ru-RU"/>
               </w:rPr>
             </w:pPr>
+            <w:r>
+              <w:rPr>
+                <w:sz w:val="24"/>
+                <w:lang w:val="ru-RU"/>
+              </w:rPr>
+              <w:t xml:space="preserve">Получение номера </w:t>
+            </w:r>
+            <w:proofErr w:type="gramStart"/>
+            <w:r>
+              <w:rPr>
+                <w:sz w:val="24"/>
+                <w:lang w:val="ru-RU"/>
+              </w:rPr>
+              <w:t>режима</w:t>
+            </w:r>
+            <w:proofErr w:type="gramEnd"/>
+            <w:r>
+              <w:rPr>
+                <w:sz w:val="24"/>
+                <w:lang w:val="ru-RU"/>
+              </w:rPr>
+              <w:t xml:space="preserve"> в котором на данный момент находится микроконтроллер</w:t>
+            </w:r>
           </w:p>
         </w:tc>
       </w:tr>
@@ -8427,7 +8665,7 @@
     <w:p>
       <w:pPr>
         <w:rPr>
-          <w:lang w:val="en-US"/>
+          <w:lang w:val="ru-RU"/>
         </w:rPr>
       </w:pPr>
     </w:p>
@@ -9080,6 +9318,7 @@
                 <w:sz w:val="18"/>
                 <w:szCs w:val="18"/>
               </w:rPr>
+              <w:lastRenderedPageBreak/>
               <w:t xml:space="preserve">    </w:t>
             </w:r>
             <w:r>
@@ -9942,7 +10181,6 @@
         <w:rPr>
           <w:lang w:val="ru-RU"/>
         </w:rPr>
-        <w:lastRenderedPageBreak/>
         <w:t xml:space="preserve">Функция </w:t>
       </w:r>
       <w:r>
@@ -11324,6 +11562,7 @@
                 <w:sz w:val="18"/>
                 <w:szCs w:val="18"/>
               </w:rPr>
+              <w:lastRenderedPageBreak/>
               <w:t xml:space="preserve">            </w:t>
             </w:r>
             <w:r>
@@ -12355,7 +12594,6 @@
         <w:rPr>
           <w:lang w:val="ru-RU"/>
         </w:rPr>
-        <w:lastRenderedPageBreak/>
         <w:t xml:space="preserve">Функции режимов выводят нужную для конкретного её режима информацию на экран и вызывает функцию </w:t>
       </w:r>
       <w:r>
@@ -12596,6 +12834,112 @@
               <w:bottom w:val="single" w:sz="4" w:space="0" w:color="auto"/>
               <w:right w:val="single" w:sz="4" w:space="0" w:color="auto"/>
             </w:tcBorders>
+          </w:tcPr>
+          <w:p>
+            <w:pPr>
+              <w:ind w:firstLine="0"/>
+              <w:jc w:val="center"/>
+              <w:rPr>
+                <w:sz w:val="24"/>
+              </w:rPr>
+            </w:pPr>
+            <w:r>
+              <w:rPr>
+                <w:sz w:val="24"/>
+              </w:rPr>
+              <w:t>1</w:t>
+            </w:r>
+          </w:p>
+        </w:tc>
+        <w:tc>
+          <w:tcPr>
+            <w:tcW w:w="2219" w:type="dxa"/>
+            <w:tcBorders>
+              <w:top w:val="single" w:sz="4" w:space="0" w:color="auto"/>
+              <w:left w:val="single" w:sz="4" w:space="0" w:color="auto"/>
+              <w:bottom w:val="single" w:sz="4" w:space="0" w:color="auto"/>
+              <w:right w:val="single" w:sz="4" w:space="0" w:color="auto"/>
+            </w:tcBorders>
+          </w:tcPr>
+          <w:p>
+            <w:pPr>
+              <w:ind w:firstLine="0"/>
+              <w:jc w:val="center"/>
+              <w:rPr>
+                <w:sz w:val="24"/>
+              </w:rPr>
+            </w:pPr>
+            <w:r>
+              <w:rPr>
+                <w:sz w:val="24"/>
+              </w:rPr>
+              <w:t>2</w:t>
+            </w:r>
+          </w:p>
+        </w:tc>
+        <w:tc>
+          <w:tcPr>
+            <w:tcW w:w="2078" w:type="dxa"/>
+            <w:tcBorders>
+              <w:top w:val="single" w:sz="4" w:space="0" w:color="auto"/>
+              <w:left w:val="single" w:sz="4" w:space="0" w:color="auto"/>
+              <w:bottom w:val="single" w:sz="4" w:space="0" w:color="auto"/>
+              <w:right w:val="single" w:sz="4" w:space="0" w:color="auto"/>
+            </w:tcBorders>
+          </w:tcPr>
+          <w:p>
+            <w:pPr>
+              <w:ind w:firstLine="0"/>
+              <w:jc w:val="center"/>
+              <w:rPr>
+                <w:sz w:val="24"/>
+              </w:rPr>
+            </w:pPr>
+            <w:r>
+              <w:rPr>
+                <w:sz w:val="24"/>
+              </w:rPr>
+              <w:t>3</w:t>
+            </w:r>
+          </w:p>
+        </w:tc>
+        <w:tc>
+          <w:tcPr>
+            <w:tcW w:w="4886" w:type="dxa"/>
+            <w:tcBorders>
+              <w:top w:val="single" w:sz="4" w:space="0" w:color="auto"/>
+              <w:left w:val="single" w:sz="4" w:space="0" w:color="auto"/>
+              <w:bottom w:val="single" w:sz="4" w:space="0" w:color="auto"/>
+              <w:right w:val="single" w:sz="4" w:space="0" w:color="auto"/>
+            </w:tcBorders>
+          </w:tcPr>
+          <w:p>
+            <w:pPr>
+              <w:ind w:firstLine="0"/>
+              <w:jc w:val="center"/>
+              <w:rPr>
+                <w:sz w:val="24"/>
+              </w:rPr>
+            </w:pPr>
+            <w:r>
+              <w:rPr>
+                <w:sz w:val="24"/>
+              </w:rPr>
+              <w:t>4</w:t>
+            </w:r>
+          </w:p>
+        </w:tc>
+      </w:tr>
+      <w:tr>
+        <w:tc>
+          <w:tcPr>
+            <w:tcW w:w="445" w:type="dxa"/>
+            <w:tcBorders>
+              <w:top w:val="single" w:sz="4" w:space="0" w:color="auto"/>
+              <w:left w:val="single" w:sz="4" w:space="0" w:color="auto"/>
+              <w:bottom w:val="single" w:sz="4" w:space="0" w:color="auto"/>
+              <w:right w:val="single" w:sz="4" w:space="0" w:color="auto"/>
+            </w:tcBorders>
             <w:hideMark/>
           </w:tcPr>
           <w:p>
@@ -12734,6 +13078,7 @@
                 <w:sz w:val="24"/>
                 <w:lang w:val="en-US"/>
               </w:rPr>
+              <w:lastRenderedPageBreak/>
               <w:t>2</w:t>
             </w:r>
           </w:p>
@@ -13629,7 +13974,6 @@
               <w:rPr>
                 <w:sz w:val="24"/>
               </w:rPr>
-              <w:lastRenderedPageBreak/>
               <w:t>22.01.2026</w:t>
             </w:r>
           </w:p>
@@ -14147,6 +14491,7 @@
                 <w:sz w:val="24"/>
                 <w:lang w:val="ru-RU"/>
               </w:rPr>
+              <w:lastRenderedPageBreak/>
               <w:t>3</w:t>
             </w:r>
           </w:p>
@@ -14857,7 +15202,6 @@
         <w:rPr>
           <w:lang w:val="ru-RU"/>
         </w:rPr>
-        <w:lastRenderedPageBreak/>
         <w:t>Таблица 7</w:t>
       </w:r>
     </w:p>
@@ -15763,6 +16107,7 @@
                 <w:sz w:val="24"/>
                 <w:lang w:val="en-US"/>
               </w:rPr>
+              <w:lastRenderedPageBreak/>
               <w:t>2</w:t>
             </w:r>
             <w:r>
@@ -16781,7 +17126,6 @@
                 <w:sz w:val="24"/>
                 <w:lang w:val="en-US"/>
               </w:rPr>
-              <w:lastRenderedPageBreak/>
               <w:t>14</w:t>
             </w:r>
             <w:r>
@@ -17512,6 +17856,7 @@
                 <w:sz w:val="24"/>
                 <w:lang w:val="en-US"/>
               </w:rPr>
+              <w:lastRenderedPageBreak/>
               <w:t>14</w:t>
             </w:r>
             <w:r>
@@ -19416,7 +19761,7 @@
         <w:rPr>
           <w:color w:val="000000"/>
           <w:szCs w:val="28"/>
-          <w:lang w:val="en-US"/>
+          <w:lang w:val="ru-RU"/>
         </w:rPr>
         <w:t>5</w:t>
       </w:r>
@@ -20869,28 +21214,7 @@
           <w:szCs w:val="28"/>
           <w:lang w:val="ru-RU"/>
         </w:rPr>
-        <w:t>У</w:t>
-      </w:r>
-      <w:r>
-        <w:rPr>
-          <w:szCs w:val="28"/>
-          <w:lang w:val="ru-RU"/>
-        </w:rPr>
-        <w:t>стройств</w:t>
-      </w:r>
-      <w:r>
-        <w:rPr>
-          <w:szCs w:val="28"/>
-          <w:lang w:val="ru-RU"/>
-        </w:rPr>
-        <w:t>о</w:t>
-      </w:r>
-      <w:r>
-        <w:rPr>
-          <w:szCs w:val="28"/>
-          <w:lang w:val="ru-RU"/>
-        </w:rPr>
-        <w:t xml:space="preserve"> ввода </w:t>
+        <w:t xml:space="preserve">Устройство ввода </w:t>
       </w:r>
       <w:r>
         <w:rPr>

</xml_diff>

<commit_message>
vault backup: 2026-04-07 16:38:22
</commit_message>
<xml_diff>
--- a/Курс 3/Архитектура ЭВМ/Курисовая/Кринкин_РПЗ.docx
+++ b/Курс 3/Архитектура ЭВМ/Курисовая/Кринкин_РПЗ.docx
@@ -1640,12 +1640,12 @@
     </w:p>
     <w:p>
       <w:pPr>
-        <w:pStyle w:val="1"/>
-        <w:rPr>
-          <w:lang w:val="ru-RU"/>
-        </w:rPr>
-      </w:pPr>
-      <w:bookmarkStart w:id="0" w:name="_Toc225692790"/>
+        <w:spacing w:line="720" w:lineRule="auto"/>
+        <w:jc w:val="center"/>
+        <w:rPr>
+          <w:lang w:val="ru-RU"/>
+        </w:rPr>
+      </w:pPr>
       <w:r>
         <w:rPr>
           <w:lang w:val="ru-RU"/>
@@ -1653,7 +1653,6 @@
         <w:lastRenderedPageBreak/>
         <w:t>Аннотация</w:t>
       </w:r>
-      <w:bookmarkEnd w:id="0"/>
     </w:p>
     <w:p>
       <w:r>
@@ -1802,7 +1801,7 @@
               <w:color w:val="auto"/>
               <w:sz w:val="24"/>
               <w:szCs w:val="24"/>
-              <w:lang w:val="en-US"/>
+              <w:lang w:val="ru-US" w:eastAsia="ru-RU"/>
             </w:rPr>
           </w:pPr>
           <w:r>
@@ -1825,13 +1824,13 @@
             </w:rPr>
             <w:fldChar w:fldCharType="separate"/>
           </w:r>
-          <w:hyperlink w:anchor="_Toc225692790" w:history="1">
+          <w:hyperlink w:anchor="_Toc226019981" w:history="1">
             <w:r>
               <w:rPr>
                 <w:rStyle w:val="af2"/>
                 <w:color w:val="auto"/>
               </w:rPr>
-              <w:t>Аннотация</w:t>
+              <w:t>Введение</w:t>
             </w:r>
             <w:r>
               <w:rPr>
@@ -1852,7 +1851,7 @@
                 <w:webHidden/>
                 <w:color w:val="auto"/>
               </w:rPr>
-              <w:instrText xml:space="preserve"> PAGEREF _Toc225692790 \h </w:instrText>
+              <w:instrText xml:space="preserve"> PAGEREF _Toc226019981 \h </w:instrText>
             </w:r>
             <w:r>
               <w:rPr>
@@ -1872,7 +1871,7 @@
                 <w:webHidden/>
                 <w:color w:val="auto"/>
               </w:rPr>
-              <w:t>2</w:t>
+              <w:t>4</w:t>
             </w:r>
             <w:r>
               <w:rPr>
@@ -1891,30 +1890,154 @@
               <w:color w:val="auto"/>
               <w:sz w:val="24"/>
               <w:szCs w:val="24"/>
-              <w:lang w:val="en-US"/>
+              <w:lang w:val="ru-US" w:eastAsia="ru-RU"/>
             </w:rPr>
           </w:pPr>
-          <w:hyperlink w:anchor="_Toc225692791" w:history="1">
+          <w:hyperlink w:anchor="_Toc226019982" w:history="1">
             <w:r>
               <w:rPr>
                 <w:rStyle w:val="af2"/>
                 <w:color w:val="auto"/>
               </w:rPr>
-              <w:t>Введ</w:t>
-            </w:r>
+              <w:t>1. Теоретическая часть</w:t>
+            </w:r>
+            <w:r>
+              <w:rPr>
+                <w:webHidden/>
+                <w:color w:val="auto"/>
+              </w:rPr>
+              <w:tab/>
+            </w:r>
+            <w:r>
+              <w:rPr>
+                <w:webHidden/>
+                <w:color w:val="auto"/>
+              </w:rPr>
+              <w:fldChar w:fldCharType="begin"/>
+            </w:r>
+            <w:r>
+              <w:rPr>
+                <w:webHidden/>
+                <w:color w:val="auto"/>
+              </w:rPr>
+              <w:instrText xml:space="preserve"> PAGEREF _Toc226019982 \h </w:instrText>
+            </w:r>
+            <w:r>
+              <w:rPr>
+                <w:webHidden/>
+                <w:color w:val="auto"/>
+              </w:rPr>
+            </w:r>
+            <w:r>
+              <w:rPr>
+                <w:webHidden/>
+                <w:color w:val="auto"/>
+              </w:rPr>
+              <w:fldChar w:fldCharType="separate"/>
+            </w:r>
+            <w:r>
+              <w:rPr>
+                <w:webHidden/>
+                <w:color w:val="auto"/>
+              </w:rPr>
+              <w:t>5</w:t>
+            </w:r>
+            <w:r>
+              <w:rPr>
+                <w:webHidden/>
+                <w:color w:val="auto"/>
+              </w:rPr>
+              <w:fldChar w:fldCharType="end"/>
+            </w:r>
+          </w:hyperlink>
+        </w:p>
+        <w:p>
+          <w:pPr>
+            <w:pStyle w:val="23"/>
+            <w:rPr>
+              <w:rFonts w:asciiTheme="minorHAnsi" w:eastAsiaTheme="minorEastAsia" w:hAnsiTheme="minorHAnsi" w:cstheme="minorBidi"/>
+              <w:color w:val="auto"/>
+              <w:sz w:val="24"/>
+              <w:szCs w:val="24"/>
+              <w:lang w:val="ru-US" w:eastAsia="ru-RU"/>
+            </w:rPr>
+          </w:pPr>
+          <w:hyperlink w:anchor="_Toc226019983" w:history="1">
             <w:r>
               <w:rPr>
                 <w:rStyle w:val="af2"/>
                 <w:color w:val="auto"/>
               </w:rPr>
-              <w:t>е</w:t>
-            </w:r>
+              <w:t>1.1. Анализ предметной области</w:t>
+            </w:r>
+            <w:r>
+              <w:rPr>
+                <w:webHidden/>
+                <w:color w:val="auto"/>
+              </w:rPr>
+              <w:tab/>
+            </w:r>
+            <w:r>
+              <w:rPr>
+                <w:webHidden/>
+                <w:color w:val="auto"/>
+              </w:rPr>
+              <w:fldChar w:fldCharType="begin"/>
+            </w:r>
+            <w:r>
+              <w:rPr>
+                <w:webHidden/>
+                <w:color w:val="auto"/>
+              </w:rPr>
+              <w:instrText xml:space="preserve"> PAGEREF _Toc226019983 \h </w:instrText>
+            </w:r>
+            <w:r>
+              <w:rPr>
+                <w:webHidden/>
+                <w:color w:val="auto"/>
+              </w:rPr>
+            </w:r>
+            <w:r>
+              <w:rPr>
+                <w:webHidden/>
+                <w:color w:val="auto"/>
+              </w:rPr>
+              <w:fldChar w:fldCharType="separate"/>
+            </w:r>
+            <w:r>
+              <w:rPr>
+                <w:webHidden/>
+                <w:color w:val="auto"/>
+              </w:rPr>
+              <w:t>5</w:t>
+            </w:r>
+            <w:r>
+              <w:rPr>
+                <w:webHidden/>
+                <w:color w:val="auto"/>
+              </w:rPr>
+              <w:fldChar w:fldCharType="end"/>
+            </w:r>
+          </w:hyperlink>
+        </w:p>
+        <w:p>
+          <w:pPr>
+            <w:pStyle w:val="23"/>
+            <w:rPr>
+              <w:rFonts w:asciiTheme="minorHAnsi" w:eastAsiaTheme="minorEastAsia" w:hAnsiTheme="minorHAnsi" w:cstheme="minorBidi"/>
+              <w:color w:val="auto"/>
+              <w:sz w:val="24"/>
+              <w:szCs w:val="24"/>
+              <w:lang w:val="ru-US" w:eastAsia="ru-RU"/>
+            </w:rPr>
+          </w:pPr>
+          <w:hyperlink w:anchor="_Toc226019984" w:history="1">
             <w:r>
               <w:rPr>
                 <w:rStyle w:val="af2"/>
                 <w:color w:val="auto"/>
               </w:rPr>
-              <w:t>ние</w:t>
+              <w:t>1.2. Принцип работы устройства</w:t>
             </w:r>
             <w:r>
               <w:rPr>
@@ -1935,7 +2058,7 @@
                 <w:webHidden/>
                 <w:color w:val="auto"/>
               </w:rPr>
-              <w:instrText xml:space="preserve"> PAGEREF _Toc225692791 \h </w:instrText>
+              <w:instrText xml:space="preserve"> PAGEREF _Toc226019984 \h </w:instrText>
             </w:r>
             <w:r>
               <w:rPr>
@@ -1955,7 +2078,7 @@
                 <w:webHidden/>
                 <w:color w:val="auto"/>
               </w:rPr>
-              <w:t>4</w:t>
+              <w:t>7</w:t>
             </w:r>
             <w:r>
               <w:rPr>
@@ -1974,16 +2097,16 @@
               <w:color w:val="auto"/>
               <w:sz w:val="24"/>
               <w:szCs w:val="24"/>
-              <w:lang w:val="en-US"/>
+              <w:lang w:val="ru-US" w:eastAsia="ru-RU"/>
             </w:rPr>
           </w:pPr>
-          <w:hyperlink w:anchor="_Toc225692792" w:history="1">
+          <w:hyperlink w:anchor="_Toc226019985" w:history="1">
             <w:r>
               <w:rPr>
                 <w:rStyle w:val="af2"/>
                 <w:color w:val="auto"/>
               </w:rPr>
-              <w:t>1. Теоретическая часть</w:t>
+              <w:t>2. Практическая часть</w:t>
             </w:r>
             <w:r>
               <w:rPr>
@@ -2004,7 +2127,7 @@
                 <w:webHidden/>
                 <w:color w:val="auto"/>
               </w:rPr>
-              <w:instrText xml:space="preserve"> PAGEREF _Toc225692792 \h </w:instrText>
+              <w:instrText xml:space="preserve"> PAGEREF _Toc226019985 \h </w:instrText>
             </w:r>
             <w:r>
               <w:rPr>
@@ -2024,7 +2147,7 @@
                 <w:webHidden/>
                 <w:color w:val="auto"/>
               </w:rPr>
-              <w:t>5</w:t>
+              <w:t>9</w:t>
             </w:r>
             <w:r>
               <w:rPr>
@@ -2043,16 +2166,16 @@
               <w:color w:val="auto"/>
               <w:sz w:val="24"/>
               <w:szCs w:val="24"/>
-              <w:lang w:val="en-US"/>
+              <w:lang w:val="ru-US" w:eastAsia="ru-RU"/>
             </w:rPr>
           </w:pPr>
-          <w:hyperlink w:anchor="_Toc225692793" w:history="1">
+          <w:hyperlink w:anchor="_Toc226019986" w:history="1">
             <w:r>
               <w:rPr>
                 <w:rStyle w:val="af2"/>
                 <w:color w:val="auto"/>
               </w:rPr>
-              <w:t>1.1. Анализ предметной области</w:t>
+              <w:t>2.1. Выбор микросхемы изделия</w:t>
             </w:r>
             <w:r>
               <w:rPr>
@@ -2073,7 +2196,7 @@
                 <w:webHidden/>
                 <w:color w:val="auto"/>
               </w:rPr>
-              <w:instrText xml:space="preserve"> PAGEREF _Toc225692793 \h </w:instrText>
+              <w:instrText xml:space="preserve"> PAGEREF _Toc226019986 \h </w:instrText>
             </w:r>
             <w:r>
               <w:rPr>
@@ -2093,7 +2216,7 @@
                 <w:webHidden/>
                 <w:color w:val="auto"/>
               </w:rPr>
-              <w:t>5</w:t>
+              <w:t>9</w:t>
             </w:r>
             <w:r>
               <w:rPr>
@@ -2112,16 +2235,16 @@
               <w:color w:val="auto"/>
               <w:sz w:val="24"/>
               <w:szCs w:val="24"/>
-              <w:lang w:val="en-US"/>
+              <w:lang w:val="ru-US" w:eastAsia="ru-RU"/>
             </w:rPr>
           </w:pPr>
-          <w:hyperlink w:anchor="_Toc225692794" w:history="1">
+          <w:hyperlink w:anchor="_Toc226019987" w:history="1">
             <w:r>
               <w:rPr>
                 <w:rStyle w:val="af2"/>
                 <w:color w:val="auto"/>
               </w:rPr>
-              <w:t>1.2. Принцип работы устройства</w:t>
+              <w:t>2.2. Описание составных частей электронного изделия</w:t>
             </w:r>
             <w:r>
               <w:rPr>
@@ -2142,7 +2265,7 @@
                 <w:webHidden/>
                 <w:color w:val="auto"/>
               </w:rPr>
-              <w:instrText xml:space="preserve"> PAGEREF _Toc225692794 \h </w:instrText>
+              <w:instrText xml:space="preserve"> PAGEREF _Toc226019987 \h </w:instrText>
             </w:r>
             <w:r>
               <w:rPr>
@@ -2162,7 +2285,283 @@
                 <w:webHidden/>
                 <w:color w:val="auto"/>
               </w:rPr>
-              <w:t>7</w:t>
+              <w:t>9</w:t>
+            </w:r>
+            <w:r>
+              <w:rPr>
+                <w:webHidden/>
+                <w:color w:val="auto"/>
+              </w:rPr>
+              <w:fldChar w:fldCharType="end"/>
+            </w:r>
+          </w:hyperlink>
+        </w:p>
+        <w:p>
+          <w:pPr>
+            <w:pStyle w:val="23"/>
+            <w:rPr>
+              <w:rFonts w:asciiTheme="minorHAnsi" w:eastAsiaTheme="minorEastAsia" w:hAnsiTheme="minorHAnsi" w:cstheme="minorBidi"/>
+              <w:color w:val="auto"/>
+              <w:sz w:val="24"/>
+              <w:szCs w:val="24"/>
+              <w:lang w:val="ru-US" w:eastAsia="ru-RU"/>
+            </w:rPr>
+          </w:pPr>
+          <w:hyperlink w:anchor="_Toc226019988" w:history="1">
+            <w:r>
+              <w:rPr>
+                <w:rStyle w:val="af2"/>
+                <w:color w:val="auto"/>
+              </w:rPr>
+              <w:t>2.3. Разработка структурной схемы изделия</w:t>
+            </w:r>
+            <w:r>
+              <w:rPr>
+                <w:webHidden/>
+                <w:color w:val="auto"/>
+              </w:rPr>
+              <w:tab/>
+            </w:r>
+            <w:r>
+              <w:rPr>
+                <w:webHidden/>
+                <w:color w:val="auto"/>
+              </w:rPr>
+              <w:fldChar w:fldCharType="begin"/>
+            </w:r>
+            <w:r>
+              <w:rPr>
+                <w:webHidden/>
+                <w:color w:val="auto"/>
+              </w:rPr>
+              <w:instrText xml:space="preserve"> PAGEREF _Toc226019988 \h </w:instrText>
+            </w:r>
+            <w:r>
+              <w:rPr>
+                <w:webHidden/>
+                <w:color w:val="auto"/>
+              </w:rPr>
+            </w:r>
+            <w:r>
+              <w:rPr>
+                <w:webHidden/>
+                <w:color w:val="auto"/>
+              </w:rPr>
+              <w:fldChar w:fldCharType="separate"/>
+            </w:r>
+            <w:r>
+              <w:rPr>
+                <w:webHidden/>
+                <w:color w:val="auto"/>
+              </w:rPr>
+              <w:t>13</w:t>
+            </w:r>
+            <w:r>
+              <w:rPr>
+                <w:webHidden/>
+                <w:color w:val="auto"/>
+              </w:rPr>
+              <w:fldChar w:fldCharType="end"/>
+            </w:r>
+          </w:hyperlink>
+        </w:p>
+        <w:p>
+          <w:pPr>
+            <w:pStyle w:val="23"/>
+            <w:rPr>
+              <w:rFonts w:asciiTheme="minorHAnsi" w:eastAsiaTheme="minorEastAsia" w:hAnsiTheme="minorHAnsi" w:cstheme="minorBidi"/>
+              <w:color w:val="auto"/>
+              <w:sz w:val="24"/>
+              <w:szCs w:val="24"/>
+              <w:lang w:val="ru-US" w:eastAsia="ru-RU"/>
+            </w:rPr>
+          </w:pPr>
+          <w:hyperlink w:anchor="_Toc226019989" w:history="1">
+            <w:r>
+              <w:rPr>
+                <w:rStyle w:val="af2"/>
+                <w:color w:val="auto"/>
+              </w:rPr>
+              <w:t>2.4. Разработка принципиальной схемы изделия</w:t>
+            </w:r>
+            <w:r>
+              <w:rPr>
+                <w:webHidden/>
+                <w:color w:val="auto"/>
+              </w:rPr>
+              <w:tab/>
+            </w:r>
+            <w:r>
+              <w:rPr>
+                <w:webHidden/>
+                <w:color w:val="auto"/>
+              </w:rPr>
+              <w:fldChar w:fldCharType="begin"/>
+            </w:r>
+            <w:r>
+              <w:rPr>
+                <w:webHidden/>
+                <w:color w:val="auto"/>
+              </w:rPr>
+              <w:instrText xml:space="preserve"> PAGEREF _Toc226019989 \h </w:instrText>
+            </w:r>
+            <w:r>
+              <w:rPr>
+                <w:webHidden/>
+                <w:color w:val="auto"/>
+              </w:rPr>
+            </w:r>
+            <w:r>
+              <w:rPr>
+                <w:webHidden/>
+                <w:color w:val="auto"/>
+              </w:rPr>
+              <w:fldChar w:fldCharType="separate"/>
+            </w:r>
+            <w:r>
+              <w:rPr>
+                <w:webHidden/>
+                <w:color w:val="auto"/>
+              </w:rPr>
+              <w:t>14</w:t>
+            </w:r>
+            <w:r>
+              <w:rPr>
+                <w:webHidden/>
+                <w:color w:val="auto"/>
+              </w:rPr>
+              <w:fldChar w:fldCharType="end"/>
+            </w:r>
+          </w:hyperlink>
+        </w:p>
+        <w:p>
+          <w:pPr>
+            <w:pStyle w:val="23"/>
+            <w:rPr>
+              <w:rFonts w:asciiTheme="minorHAnsi" w:eastAsiaTheme="minorEastAsia" w:hAnsiTheme="minorHAnsi" w:cstheme="minorBidi"/>
+              <w:color w:val="auto"/>
+              <w:sz w:val="24"/>
+              <w:szCs w:val="24"/>
+              <w:lang w:val="ru-US" w:eastAsia="ru-RU"/>
+            </w:rPr>
+          </w:pPr>
+          <w:hyperlink w:anchor="_Toc226019990" w:history="1">
+            <w:r>
+              <w:rPr>
+                <w:rStyle w:val="af2"/>
+                <w:color w:val="auto"/>
+              </w:rPr>
+              <w:t>2.5. Кодирование</w:t>
+            </w:r>
+            <w:r>
+              <w:rPr>
+                <w:webHidden/>
+                <w:color w:val="auto"/>
+              </w:rPr>
+              <w:tab/>
+            </w:r>
+            <w:r>
+              <w:rPr>
+                <w:webHidden/>
+                <w:color w:val="auto"/>
+              </w:rPr>
+              <w:fldChar w:fldCharType="begin"/>
+            </w:r>
+            <w:r>
+              <w:rPr>
+                <w:webHidden/>
+                <w:color w:val="auto"/>
+              </w:rPr>
+              <w:instrText xml:space="preserve"> PAGEREF _Toc226019990 \h </w:instrText>
+            </w:r>
+            <w:r>
+              <w:rPr>
+                <w:webHidden/>
+                <w:color w:val="auto"/>
+              </w:rPr>
+            </w:r>
+            <w:r>
+              <w:rPr>
+                <w:webHidden/>
+                <w:color w:val="auto"/>
+              </w:rPr>
+              <w:fldChar w:fldCharType="separate"/>
+            </w:r>
+            <w:r>
+              <w:rPr>
+                <w:webHidden/>
+                <w:color w:val="auto"/>
+              </w:rPr>
+              <w:t>16</w:t>
+            </w:r>
+            <w:r>
+              <w:rPr>
+                <w:webHidden/>
+                <w:color w:val="auto"/>
+              </w:rPr>
+              <w:fldChar w:fldCharType="end"/>
+            </w:r>
+          </w:hyperlink>
+        </w:p>
+        <w:p>
+          <w:pPr>
+            <w:pStyle w:val="23"/>
+            <w:rPr>
+              <w:rFonts w:asciiTheme="minorHAnsi" w:eastAsiaTheme="minorEastAsia" w:hAnsiTheme="minorHAnsi" w:cstheme="minorBidi"/>
+              <w:color w:val="auto"/>
+              <w:sz w:val="24"/>
+              <w:szCs w:val="24"/>
+              <w:lang w:val="ru-US" w:eastAsia="ru-RU"/>
+            </w:rPr>
+          </w:pPr>
+          <w:hyperlink w:anchor="_Toc226019991" w:history="1">
+            <w:r>
+              <w:rPr>
+                <w:rStyle w:val="af2"/>
+                <w:color w:val="auto"/>
+              </w:rPr>
+              <w:t>2.6. Тестирование работы изделия</w:t>
+            </w:r>
+            <w:r>
+              <w:rPr>
+                <w:webHidden/>
+                <w:color w:val="auto"/>
+              </w:rPr>
+              <w:tab/>
+            </w:r>
+            <w:r>
+              <w:rPr>
+                <w:webHidden/>
+                <w:color w:val="auto"/>
+              </w:rPr>
+              <w:fldChar w:fldCharType="begin"/>
+            </w:r>
+            <w:r>
+              <w:rPr>
+                <w:webHidden/>
+                <w:color w:val="auto"/>
+              </w:rPr>
+              <w:instrText xml:space="preserve"> PAGEREF _Toc226019991 \h </w:instrText>
+            </w:r>
+            <w:r>
+              <w:rPr>
+                <w:webHidden/>
+                <w:color w:val="auto"/>
+              </w:rPr>
+            </w:r>
+            <w:r>
+              <w:rPr>
+                <w:webHidden/>
+                <w:color w:val="auto"/>
+              </w:rPr>
+              <w:fldChar w:fldCharType="separate"/>
+            </w:r>
+            <w:r>
+              <w:rPr>
+                <w:webHidden/>
+                <w:color w:val="auto"/>
+              </w:rPr>
+              <w:t>19</w:t>
             </w:r>
             <w:r>
               <w:rPr>
@@ -2181,16 +2580,16 @@
               <w:color w:val="auto"/>
               <w:sz w:val="24"/>
               <w:szCs w:val="24"/>
-              <w:lang w:val="en-US"/>
+              <w:lang w:val="ru-US" w:eastAsia="ru-RU"/>
             </w:rPr>
           </w:pPr>
-          <w:hyperlink w:anchor="_Toc225692795" w:history="1">
+          <w:hyperlink w:anchor="_Toc226019992" w:history="1">
             <w:r>
               <w:rPr>
                 <w:rStyle w:val="af2"/>
                 <w:color w:val="auto"/>
               </w:rPr>
-              <w:t>2. Практическая часть</w:t>
+              <w:t>Заключение</w:t>
             </w:r>
             <w:r>
               <w:rPr>
@@ -2211,7 +2610,7 @@
                 <w:webHidden/>
                 <w:color w:val="auto"/>
               </w:rPr>
-              <w:instrText xml:space="preserve"> PAGEREF _Toc225692795 \h </w:instrText>
+              <w:instrText xml:space="preserve"> PAGEREF _Toc226019992 \h </w:instrText>
             </w:r>
             <w:r>
               <w:rPr>
@@ -2231,421 +2630,7 @@
                 <w:webHidden/>
                 <w:color w:val="auto"/>
               </w:rPr>
-              <w:t>9</w:t>
-            </w:r>
-            <w:r>
-              <w:rPr>
-                <w:webHidden/>
-                <w:color w:val="auto"/>
-              </w:rPr>
-              <w:fldChar w:fldCharType="end"/>
-            </w:r>
-          </w:hyperlink>
-        </w:p>
-        <w:p>
-          <w:pPr>
-            <w:pStyle w:val="23"/>
-            <w:rPr>
-              <w:rFonts w:asciiTheme="minorHAnsi" w:eastAsiaTheme="minorEastAsia" w:hAnsiTheme="minorHAnsi" w:cstheme="minorBidi"/>
-              <w:color w:val="auto"/>
-              <w:sz w:val="24"/>
-              <w:szCs w:val="24"/>
-              <w:lang w:val="en-US"/>
-            </w:rPr>
-          </w:pPr>
-          <w:hyperlink w:anchor="_Toc225692796" w:history="1">
-            <w:r>
-              <w:rPr>
-                <w:rStyle w:val="af2"/>
-                <w:color w:val="auto"/>
-              </w:rPr>
-              <w:t>2.1. Выбор микросхемы изделия</w:t>
-            </w:r>
-            <w:r>
-              <w:rPr>
-                <w:webHidden/>
-                <w:color w:val="auto"/>
-              </w:rPr>
-              <w:tab/>
-            </w:r>
-            <w:r>
-              <w:rPr>
-                <w:webHidden/>
-                <w:color w:val="auto"/>
-              </w:rPr>
-              <w:fldChar w:fldCharType="begin"/>
-            </w:r>
-            <w:r>
-              <w:rPr>
-                <w:webHidden/>
-                <w:color w:val="auto"/>
-              </w:rPr>
-              <w:instrText xml:space="preserve"> PAGEREF _Toc225692796 \h </w:instrText>
-            </w:r>
-            <w:r>
-              <w:rPr>
-                <w:webHidden/>
-                <w:color w:val="auto"/>
-              </w:rPr>
-            </w:r>
-            <w:r>
-              <w:rPr>
-                <w:webHidden/>
-                <w:color w:val="auto"/>
-              </w:rPr>
-              <w:fldChar w:fldCharType="separate"/>
-            </w:r>
-            <w:r>
-              <w:rPr>
-                <w:webHidden/>
-                <w:color w:val="auto"/>
-              </w:rPr>
-              <w:t>9</w:t>
-            </w:r>
-            <w:r>
-              <w:rPr>
-                <w:webHidden/>
-                <w:color w:val="auto"/>
-              </w:rPr>
-              <w:fldChar w:fldCharType="end"/>
-            </w:r>
-          </w:hyperlink>
-        </w:p>
-        <w:p>
-          <w:pPr>
-            <w:pStyle w:val="23"/>
-            <w:rPr>
-              <w:rFonts w:asciiTheme="minorHAnsi" w:eastAsiaTheme="minorEastAsia" w:hAnsiTheme="minorHAnsi" w:cstheme="minorBidi"/>
-              <w:color w:val="auto"/>
-              <w:sz w:val="24"/>
-              <w:szCs w:val="24"/>
-              <w:lang w:val="en-US"/>
-            </w:rPr>
-          </w:pPr>
-          <w:hyperlink w:anchor="_Toc225692797" w:history="1">
-            <w:r>
-              <w:rPr>
-                <w:rStyle w:val="af2"/>
-                <w:color w:val="auto"/>
-              </w:rPr>
-              <w:t>2.2. Описание составных частей электронного изделия</w:t>
-            </w:r>
-            <w:r>
-              <w:rPr>
-                <w:webHidden/>
-                <w:color w:val="auto"/>
-              </w:rPr>
-              <w:tab/>
-            </w:r>
-            <w:r>
-              <w:rPr>
-                <w:webHidden/>
-                <w:color w:val="auto"/>
-              </w:rPr>
-              <w:fldChar w:fldCharType="begin"/>
-            </w:r>
-            <w:r>
-              <w:rPr>
-                <w:webHidden/>
-                <w:color w:val="auto"/>
-              </w:rPr>
-              <w:instrText xml:space="preserve"> PAGEREF _Toc225692797 \h </w:instrText>
-            </w:r>
-            <w:r>
-              <w:rPr>
-                <w:webHidden/>
-                <w:color w:val="auto"/>
-              </w:rPr>
-            </w:r>
-            <w:r>
-              <w:rPr>
-                <w:webHidden/>
-                <w:color w:val="auto"/>
-              </w:rPr>
-              <w:fldChar w:fldCharType="separate"/>
-            </w:r>
-            <w:r>
-              <w:rPr>
-                <w:webHidden/>
-                <w:color w:val="auto"/>
-              </w:rPr>
-              <w:t>9</w:t>
-            </w:r>
-            <w:r>
-              <w:rPr>
-                <w:webHidden/>
-                <w:color w:val="auto"/>
-              </w:rPr>
-              <w:fldChar w:fldCharType="end"/>
-            </w:r>
-          </w:hyperlink>
-        </w:p>
-        <w:p>
-          <w:pPr>
-            <w:pStyle w:val="23"/>
-            <w:rPr>
-              <w:rFonts w:asciiTheme="minorHAnsi" w:eastAsiaTheme="minorEastAsia" w:hAnsiTheme="minorHAnsi" w:cstheme="minorBidi"/>
-              <w:color w:val="auto"/>
-              <w:sz w:val="24"/>
-              <w:szCs w:val="24"/>
-              <w:lang w:val="en-US"/>
-            </w:rPr>
-          </w:pPr>
-          <w:hyperlink w:anchor="_Toc225692798" w:history="1">
-            <w:r>
-              <w:rPr>
-                <w:rStyle w:val="af2"/>
-                <w:color w:val="auto"/>
-              </w:rPr>
-              <w:t>2.3. Разработка структурной схемы изделия</w:t>
-            </w:r>
-            <w:r>
-              <w:rPr>
-                <w:webHidden/>
-                <w:color w:val="auto"/>
-              </w:rPr>
-              <w:tab/>
-            </w:r>
-            <w:r>
-              <w:rPr>
-                <w:webHidden/>
-                <w:color w:val="auto"/>
-              </w:rPr>
-              <w:fldChar w:fldCharType="begin"/>
-            </w:r>
-            <w:r>
-              <w:rPr>
-                <w:webHidden/>
-                <w:color w:val="auto"/>
-              </w:rPr>
-              <w:instrText xml:space="preserve"> PAGEREF _Toc225692798 \h </w:instrText>
-            </w:r>
-            <w:r>
-              <w:rPr>
-                <w:webHidden/>
-                <w:color w:val="auto"/>
-              </w:rPr>
-            </w:r>
-            <w:r>
-              <w:rPr>
-                <w:webHidden/>
-                <w:color w:val="auto"/>
-              </w:rPr>
-              <w:fldChar w:fldCharType="separate"/>
-            </w:r>
-            <w:r>
-              <w:rPr>
-                <w:webHidden/>
-                <w:color w:val="auto"/>
-              </w:rPr>
-              <w:t>13</w:t>
-            </w:r>
-            <w:r>
-              <w:rPr>
-                <w:webHidden/>
-                <w:color w:val="auto"/>
-              </w:rPr>
-              <w:fldChar w:fldCharType="end"/>
-            </w:r>
-          </w:hyperlink>
-        </w:p>
-        <w:p>
-          <w:pPr>
-            <w:pStyle w:val="23"/>
-            <w:rPr>
-              <w:rFonts w:asciiTheme="minorHAnsi" w:eastAsiaTheme="minorEastAsia" w:hAnsiTheme="minorHAnsi" w:cstheme="minorBidi"/>
-              <w:color w:val="auto"/>
-              <w:sz w:val="24"/>
-              <w:szCs w:val="24"/>
-              <w:lang w:val="en-US"/>
-            </w:rPr>
-          </w:pPr>
-          <w:hyperlink w:anchor="_Toc225692799" w:history="1">
-            <w:r>
-              <w:rPr>
-                <w:rStyle w:val="af2"/>
-                <w:color w:val="auto"/>
-              </w:rPr>
-              <w:t>2.4. Разработка принципиальной схемы изделия</w:t>
-            </w:r>
-            <w:r>
-              <w:rPr>
-                <w:webHidden/>
-                <w:color w:val="auto"/>
-              </w:rPr>
-              <w:tab/>
-            </w:r>
-            <w:r>
-              <w:rPr>
-                <w:webHidden/>
-                <w:color w:val="auto"/>
-              </w:rPr>
-              <w:fldChar w:fldCharType="begin"/>
-            </w:r>
-            <w:r>
-              <w:rPr>
-                <w:webHidden/>
-                <w:color w:val="auto"/>
-              </w:rPr>
-              <w:instrText xml:space="preserve"> PAGEREF _Toc225692799 \h </w:instrText>
-            </w:r>
-            <w:r>
-              <w:rPr>
-                <w:webHidden/>
-                <w:color w:val="auto"/>
-              </w:rPr>
-            </w:r>
-            <w:r>
-              <w:rPr>
-                <w:webHidden/>
-                <w:color w:val="auto"/>
-              </w:rPr>
-              <w:fldChar w:fldCharType="separate"/>
-            </w:r>
-            <w:r>
-              <w:rPr>
-                <w:webHidden/>
-                <w:color w:val="auto"/>
-              </w:rPr>
-              <w:t>14</w:t>
-            </w:r>
-            <w:r>
-              <w:rPr>
-                <w:webHidden/>
-                <w:color w:val="auto"/>
-              </w:rPr>
-              <w:fldChar w:fldCharType="end"/>
-            </w:r>
-          </w:hyperlink>
-        </w:p>
-        <w:p>
-          <w:pPr>
-            <w:pStyle w:val="23"/>
-            <w:rPr>
-              <w:rFonts w:asciiTheme="minorHAnsi" w:eastAsiaTheme="minorEastAsia" w:hAnsiTheme="minorHAnsi" w:cstheme="minorBidi"/>
-              <w:color w:val="auto"/>
-              <w:sz w:val="24"/>
-              <w:szCs w:val="24"/>
-              <w:lang w:val="en-US"/>
-            </w:rPr>
-          </w:pPr>
-          <w:hyperlink w:anchor="_Toc225692800" w:history="1">
-            <w:r>
-              <w:rPr>
-                <w:rStyle w:val="af2"/>
-                <w:color w:val="auto"/>
-              </w:rPr>
-              <w:t>2.5. Кодирование</w:t>
-            </w:r>
-            <w:r>
-              <w:rPr>
-                <w:webHidden/>
-                <w:color w:val="auto"/>
-              </w:rPr>
-              <w:tab/>
-            </w:r>
-            <w:r>
-              <w:rPr>
-                <w:webHidden/>
-                <w:color w:val="auto"/>
-              </w:rPr>
-              <w:fldChar w:fldCharType="begin"/>
-            </w:r>
-            <w:r>
-              <w:rPr>
-                <w:webHidden/>
-                <w:color w:val="auto"/>
-              </w:rPr>
-              <w:instrText xml:space="preserve"> PAGEREF _Toc225692800 \h </w:instrText>
-            </w:r>
-            <w:r>
-              <w:rPr>
-                <w:webHidden/>
-                <w:color w:val="auto"/>
-              </w:rPr>
-            </w:r>
-            <w:r>
-              <w:rPr>
-                <w:webHidden/>
-                <w:color w:val="auto"/>
-              </w:rPr>
-              <w:fldChar w:fldCharType="separate"/>
-            </w:r>
-            <w:r>
-              <w:rPr>
-                <w:webHidden/>
-                <w:color w:val="auto"/>
-              </w:rPr>
-              <w:t>16</w:t>
-            </w:r>
-            <w:r>
-              <w:rPr>
-                <w:webHidden/>
-                <w:color w:val="auto"/>
-              </w:rPr>
-              <w:fldChar w:fldCharType="end"/>
-            </w:r>
-          </w:hyperlink>
-        </w:p>
-        <w:p>
-          <w:pPr>
-            <w:pStyle w:val="23"/>
-            <w:rPr>
-              <w:rFonts w:asciiTheme="minorHAnsi" w:eastAsiaTheme="minorEastAsia" w:hAnsiTheme="minorHAnsi" w:cstheme="minorBidi"/>
-              <w:color w:val="auto"/>
-              <w:sz w:val="24"/>
-              <w:szCs w:val="24"/>
-              <w:lang w:val="en-US"/>
-            </w:rPr>
-          </w:pPr>
-          <w:hyperlink w:anchor="_Toc225692801" w:history="1">
-            <w:r>
-              <w:rPr>
-                <w:rStyle w:val="af2"/>
-                <w:color w:val="auto"/>
-              </w:rPr>
-              <w:t>2.6. Тестирование работы изделия</w:t>
-            </w:r>
-            <w:r>
-              <w:rPr>
-                <w:webHidden/>
-                <w:color w:val="auto"/>
-              </w:rPr>
-              <w:tab/>
-            </w:r>
-            <w:r>
-              <w:rPr>
-                <w:webHidden/>
-                <w:color w:val="auto"/>
-              </w:rPr>
-              <w:fldChar w:fldCharType="begin"/>
-            </w:r>
-            <w:r>
-              <w:rPr>
-                <w:webHidden/>
-                <w:color w:val="auto"/>
-              </w:rPr>
-              <w:instrText xml:space="preserve"> PAGEREF _Toc225692801 \h </w:instrText>
-            </w:r>
-            <w:r>
-              <w:rPr>
-                <w:webHidden/>
-                <w:color w:val="auto"/>
-              </w:rPr>
-            </w:r>
-            <w:r>
-              <w:rPr>
-                <w:webHidden/>
-                <w:color w:val="auto"/>
-              </w:rPr>
-              <w:fldChar w:fldCharType="separate"/>
-            </w:r>
-            <w:r>
-              <w:rPr>
-                <w:webHidden/>
-                <w:color w:val="auto"/>
-              </w:rPr>
-              <w:t>19</w:t>
+              <w:t>24</w:t>
             </w:r>
             <w:r>
               <w:rPr>
@@ -2664,16 +2649,16 @@
               <w:color w:val="auto"/>
               <w:sz w:val="24"/>
               <w:szCs w:val="24"/>
-              <w:lang w:val="en-US"/>
+              <w:lang w:val="ru-US" w:eastAsia="ru-RU"/>
             </w:rPr>
           </w:pPr>
-          <w:hyperlink w:anchor="_Toc225692802" w:history="1">
+          <w:hyperlink w:anchor="_Toc226019993" w:history="1">
             <w:r>
               <w:rPr>
                 <w:rStyle w:val="af2"/>
                 <w:color w:val="auto"/>
               </w:rPr>
-              <w:t>Заключение</w:t>
+              <w:t>Список литературы</w:t>
             </w:r>
             <w:r>
               <w:rPr>
@@ -2694,7 +2679,7 @@
                 <w:webHidden/>
                 <w:color w:val="auto"/>
               </w:rPr>
-              <w:instrText xml:space="preserve"> PAGEREF _Toc225692802 \h </w:instrText>
+              <w:instrText xml:space="preserve"> PAGEREF _Toc226019993 \h </w:instrText>
             </w:r>
             <w:r>
               <w:rPr>
@@ -2714,7 +2699,7 @@
                 <w:webHidden/>
                 <w:color w:val="auto"/>
               </w:rPr>
-              <w:t>24</w:t>
+              <w:t>25</w:t>
             </w:r>
             <w:r>
               <w:rPr>
@@ -2733,30 +2718,31 @@
               <w:color w:val="auto"/>
               <w:sz w:val="24"/>
               <w:szCs w:val="24"/>
-              <w:lang w:val="en-US"/>
+              <w:lang w:val="ru-US" w:eastAsia="ru-RU"/>
             </w:rPr>
           </w:pPr>
-          <w:hyperlink w:anchor="_Toc225692803" w:history="1">
+          <w:hyperlink w:anchor="_Toc226019994" w:history="1">
             <w:r>
               <w:rPr>
                 <w:rStyle w:val="af2"/>
                 <w:color w:val="auto"/>
               </w:rPr>
-              <w:t xml:space="preserve">Список </w:t>
+              <w:t>Приложение 1</w:t>
             </w:r>
             <w:r>
               <w:rPr>
                 <w:rStyle w:val="af2"/>
                 <w:color w:val="auto"/>
-              </w:rPr>
-              <w:t>л</w:t>
+                <w:lang w:val="en-US"/>
+              </w:rPr>
+              <w:t xml:space="preserve">. </w:t>
             </w:r>
             <w:r>
               <w:rPr>
                 <w:rStyle w:val="af2"/>
                 <w:color w:val="auto"/>
               </w:rPr>
-              <w:t>итературы</w:t>
+              <w:t>Техническое задание</w:t>
             </w:r>
             <w:r>
               <w:rPr>
@@ -2777,7 +2763,7 @@
                 <w:webHidden/>
                 <w:color w:val="auto"/>
               </w:rPr>
-              <w:instrText xml:space="preserve"> PAGEREF _Toc225692803 \h </w:instrText>
+              <w:instrText xml:space="preserve"> PAGEREF _Toc226019994 \h </w:instrText>
             </w:r>
             <w:r>
               <w:rPr>
@@ -2797,7 +2783,7 @@
                 <w:webHidden/>
                 <w:color w:val="auto"/>
               </w:rPr>
-              <w:t>25</w:t>
+              <w:t>27</w:t>
             </w:r>
             <w:r>
               <w:rPr>
@@ -2816,23 +2802,37 @@
               <w:color w:val="auto"/>
               <w:sz w:val="24"/>
               <w:szCs w:val="24"/>
-              <w:lang w:val="en-US"/>
+              <w:lang w:val="ru-US" w:eastAsia="ru-RU"/>
             </w:rPr>
           </w:pPr>
-          <w:hyperlink w:anchor="_Toc225692804" w:history="1">
+          <w:hyperlink w:anchor="_Toc226019995" w:history="1">
             <w:r>
               <w:rPr>
                 <w:rStyle w:val="af2"/>
                 <w:color w:val="auto"/>
               </w:rPr>
-              <w:t>Приложение 1.</w:t>
+              <w:t>Приложение 2.</w:t>
             </w:r>
             <w:r>
               <w:rPr>
                 <w:rStyle w:val="af2"/>
                 <w:color w:val="auto"/>
               </w:rPr>
-              <w:t xml:space="preserve"> Техническое задание</w:t>
+              <w:t xml:space="preserve"> Текст про</w:t>
+            </w:r>
+            <w:r>
+              <w:rPr>
+                <w:rStyle w:val="af2"/>
+                <w:color w:val="auto"/>
+              </w:rPr>
+              <w:t>г</w:t>
+            </w:r>
+            <w:r>
+              <w:rPr>
+                <w:rStyle w:val="af2"/>
+                <w:color w:val="auto"/>
+              </w:rPr>
+              <w:t>раммы</w:t>
             </w:r>
             <w:r>
               <w:rPr>
@@ -2853,7 +2853,7 @@
                 <w:webHidden/>
                 <w:color w:val="auto"/>
               </w:rPr>
-              <w:instrText xml:space="preserve"> PAGEREF _Toc225692804 \h </w:instrText>
+              <w:instrText xml:space="preserve"> PAGEREF _Toc226019995 \h </w:instrText>
             </w:r>
             <w:r>
               <w:rPr>
@@ -2873,7 +2873,7 @@
                 <w:webHidden/>
                 <w:color w:val="auto"/>
               </w:rPr>
-              <w:t>27</w:t>
+              <w:t>35</w:t>
             </w:r>
             <w:r>
               <w:rPr>
@@ -2892,31 +2892,23 @@
               <w:color w:val="auto"/>
               <w:sz w:val="24"/>
               <w:szCs w:val="24"/>
-              <w:lang w:val="en-US"/>
+              <w:lang w:val="ru-US" w:eastAsia="ru-RU"/>
             </w:rPr>
           </w:pPr>
-          <w:hyperlink w:anchor="_Toc225692805" w:history="1">
+          <w:hyperlink w:anchor="_Toc226019996" w:history="1">
             <w:r>
               <w:rPr>
                 <w:rStyle w:val="af2"/>
                 <w:color w:val="auto"/>
               </w:rPr>
-              <w:t>Приложение 2.</w:t>
+              <w:t>Приложение 3.</w:t>
             </w:r>
             <w:r>
               <w:rPr>
                 <w:rStyle w:val="af2"/>
                 <w:color w:val="auto"/>
-                <w:lang w:val="en-US"/>
-              </w:rPr>
-              <w:t xml:space="preserve"> </w:t>
-            </w:r>
-            <w:r>
-              <w:rPr>
-                <w:rStyle w:val="af2"/>
-                <w:color w:val="auto"/>
-              </w:rPr>
-              <w:t>Текст программы</w:t>
+              </w:rPr>
+              <w:t xml:space="preserve"> Руководство пользователя</w:t>
             </w:r>
             <w:r>
               <w:rPr>
@@ -2937,90 +2929,7 @@
                 <w:webHidden/>
                 <w:color w:val="auto"/>
               </w:rPr>
-              <w:instrText xml:space="preserve"> PAGEREF _Toc225692805 \h </w:instrText>
-            </w:r>
-            <w:r>
-              <w:rPr>
-                <w:webHidden/>
-                <w:color w:val="auto"/>
-              </w:rPr>
-            </w:r>
-            <w:r>
-              <w:rPr>
-                <w:webHidden/>
-                <w:color w:val="auto"/>
-              </w:rPr>
-              <w:fldChar w:fldCharType="separate"/>
-            </w:r>
-            <w:r>
-              <w:rPr>
-                <w:webHidden/>
-                <w:color w:val="auto"/>
-              </w:rPr>
-              <w:t>35</w:t>
-            </w:r>
-            <w:r>
-              <w:rPr>
-                <w:webHidden/>
-                <w:color w:val="auto"/>
-              </w:rPr>
-              <w:fldChar w:fldCharType="end"/>
-            </w:r>
-          </w:hyperlink>
-        </w:p>
-        <w:p>
-          <w:pPr>
-            <w:pStyle w:val="11"/>
-            <w:rPr>
-              <w:rFonts w:asciiTheme="minorHAnsi" w:eastAsiaTheme="minorEastAsia" w:hAnsiTheme="minorHAnsi" w:cstheme="minorBidi"/>
-              <w:color w:val="auto"/>
-              <w:sz w:val="24"/>
-              <w:szCs w:val="24"/>
-              <w:lang w:val="en-US"/>
-            </w:rPr>
-          </w:pPr>
-          <w:hyperlink w:anchor="_Toc225692806" w:history="1">
-            <w:r>
-              <w:rPr>
-                <w:rStyle w:val="af2"/>
-                <w:color w:val="auto"/>
-              </w:rPr>
-              <w:t>Приложение 3</w:t>
-            </w:r>
-            <w:r>
-              <w:rPr>
-                <w:rStyle w:val="af2"/>
-                <w:color w:val="auto"/>
-              </w:rPr>
-              <w:t>. Руководство пользователя</w:t>
-            </w:r>
-            <w:r>
-              <w:rPr>
-                <w:rStyle w:val="af2"/>
-                <w:color w:val="auto"/>
-              </w:rPr>
-              <w:t>.</w:t>
-            </w:r>
-            <w:r>
-              <w:rPr>
-                <w:webHidden/>
-                <w:color w:val="auto"/>
-              </w:rPr>
-              <w:tab/>
-            </w:r>
-            <w:r>
-              <w:rPr>
-                <w:webHidden/>
-                <w:color w:val="auto"/>
-              </w:rPr>
-              <w:fldChar w:fldCharType="begin"/>
-            </w:r>
-            <w:r>
-              <w:rPr>
-                <w:webHidden/>
-                <w:color w:val="auto"/>
-              </w:rPr>
-              <w:instrText xml:space="preserve"> PAGEREF _Toc225692806 \h </w:instrText>
+              <w:instrText xml:space="preserve"> PAGEREF _Toc226019996 \h </w:instrText>
             </w:r>
             <w:r>
               <w:rPr>
@@ -3092,7 +3001,7 @@
           <w:lang w:val="ru-RU"/>
         </w:rPr>
       </w:pPr>
-      <w:bookmarkStart w:id="1" w:name="_Toc225692791"/>
+      <w:bookmarkStart w:id="0" w:name="_Toc226019981"/>
       <w:r>
         <w:rPr>
           <w:lang w:val="ru-RU"/>
@@ -3100,7 +3009,7 @@
         <w:lastRenderedPageBreak/>
         <w:t>Введение</w:t>
       </w:r>
-      <w:bookmarkEnd w:id="1"/>
+      <w:bookmarkEnd w:id="0"/>
     </w:p>
     <w:p>
       <w:r>
@@ -3375,7 +3284,7 @@
           <w:lang w:val="ru-RU"/>
         </w:rPr>
       </w:pPr>
-      <w:bookmarkStart w:id="2" w:name="_Toc225692792"/>
+      <w:bookmarkStart w:id="1" w:name="_Toc226019982"/>
       <w:r>
         <w:rPr>
           <w:lang w:val="ru-RU"/>
@@ -3395,32 +3304,32 @@
         </w:rPr>
         <w:t xml:space="preserve"> часть</w:t>
       </w:r>
+      <w:bookmarkEnd w:id="1"/>
+    </w:p>
+    <w:p>
+      <w:pPr>
+        <w:pStyle w:val="2"/>
+        <w:rPr>
+          <w:lang w:val="ru-RU"/>
+        </w:rPr>
+      </w:pPr>
+      <w:bookmarkStart w:id="2" w:name="_Toc226019983"/>
+      <w:r>
+        <w:rPr>
+          <w:lang w:val="ru-RU"/>
+        </w:rPr>
+        <w:t xml:space="preserve">1.1. </w:t>
+      </w:r>
+      <w:r>
+        <w:rPr>
+          <w:lang w:val="ru-RU"/>
+        </w:rPr>
+        <w:t>Анализ предметной области</w:t>
+      </w:r>
       <w:bookmarkEnd w:id="2"/>
     </w:p>
     <w:p>
       <w:pPr>
-        <w:pStyle w:val="2"/>
-        <w:rPr>
-          <w:lang w:val="ru-RU"/>
-        </w:rPr>
-      </w:pPr>
-      <w:bookmarkStart w:id="3" w:name="_Toc225692793"/>
-      <w:r>
-        <w:rPr>
-          <w:lang w:val="ru-RU"/>
-        </w:rPr>
-        <w:t xml:space="preserve">1.1. </w:t>
-      </w:r>
-      <w:r>
-        <w:rPr>
-          <w:lang w:val="ru-RU"/>
-        </w:rPr>
-        <w:t>Анализ предметной области</w:t>
-      </w:r>
-      <w:bookmarkEnd w:id="3"/>
-    </w:p>
-    <w:p>
-      <w:pPr>
         <w:rPr>
           <w:lang w:val="ru-RU"/>
         </w:rPr>
@@ -3466,7 +3375,19 @@
         <w:rPr>
           <w:lang w:val="ru-RU"/>
         </w:rPr>
-        <w:t>Формат клавиатуры — это ее размер, количество и расположение клавиш (раскладка).</w:t>
+        <w:t xml:space="preserve">Формат клавиатуры — это ее размер, количество и расположение клавиш (раскладка). </w:t>
+      </w:r>
+      <w:r>
+        <w:rPr>
+          <w:lang w:val="ru-RU"/>
+        </w:rPr>
+        <w:t xml:space="preserve">Популярными форматами являются </w:t>
+      </w:r>
+      <w:r>
+        <w:rPr>
+          <w:lang w:val="en-US"/>
+        </w:rPr>
+        <w:t>ISO</w:t>
       </w:r>
       <w:r>
         <w:rPr>
@@ -3478,30 +3399,12 @@
         <w:rPr>
           <w:lang w:val="ru-RU"/>
         </w:rPr>
-        <w:t xml:space="preserve">Популярными форматами являются </w:t>
+        <w:t xml:space="preserve">(Европа) и </w:t>
       </w:r>
       <w:r>
         <w:rPr>
           <w:lang w:val="en-US"/>
         </w:rPr>
-        <w:t>ISO</w:t>
-      </w:r>
-      <w:r>
-        <w:rPr>
-          <w:lang w:val="ru-RU"/>
-        </w:rPr>
-        <w:t xml:space="preserve"> </w:t>
-      </w:r>
-      <w:r>
-        <w:rPr>
-          <w:lang w:val="ru-RU"/>
-        </w:rPr>
-        <w:t xml:space="preserve">(Европа) и </w:t>
-      </w:r>
-      <w:r>
-        <w:rPr>
-          <w:lang w:val="en-US"/>
-        </w:rPr>
         <w:t>ANSI</w:t>
       </w:r>
       <w:r>
@@ -3551,19 +3454,7 @@
         <w:rPr>
           <w:lang w:val="ru-RU"/>
         </w:rPr>
-        <w:t xml:space="preserve"> содержат 104 клавиши (ANSI) или 105 (ISO), но множество моделей отходят от этого стандарта</w:t>
-      </w:r>
-      <w:r>
-        <w:rPr>
-          <w:lang w:val="ru-RU"/>
-        </w:rPr>
-        <w:t xml:space="preserve"> </w:t>
-      </w:r>
-      <w:r>
-        <w:rPr>
-          <w:lang w:val="ru-RU"/>
-        </w:rPr>
-        <w:t>[12].</w:t>
+        <w:t xml:space="preserve"> содержат 104 клавиши (ANSI) или 105 (ISO), но множество моделей отходят от этого стандарта [12].</w:t>
       </w:r>
       <w:r>
         <w:rPr>
@@ -3731,19 +3622,7 @@
         <w:rPr>
           <w:lang w:val="ru-RU"/>
         </w:rPr>
-        <w:t xml:space="preserve"> содержат 87 клавиш (80%) и не имеют цифрового блока, в остальном аналогичны классическим</w:t>
-      </w:r>
-      <w:r>
-        <w:rPr>
-          <w:lang w:val="ru-RU"/>
-        </w:rPr>
-        <w:t xml:space="preserve"> </w:t>
-      </w:r>
-      <w:r>
-        <w:rPr>
-          <w:lang w:val="ru-RU"/>
-        </w:rPr>
-        <w:t>[12].</w:t>
+        <w:t xml:space="preserve"> содержат 87 клавиш (80%) и не имеют цифрового блока, в остальном аналогичны классическим [12].</w:t>
       </w:r>
       <w:r>
         <w:rPr>
@@ -3778,7 +3657,7 @@
           <w:noProof/>
         </w:rPr>
         <w:drawing>
-          <wp:inline distT="0" distB="0" distL="0" distR="0" wp14:anchorId="10AEB3E8" wp14:editId="2C307BBE">
+          <wp:inline distT="0" distB="0" distL="0" distR="0" wp14:anchorId="10AEB3E8" wp14:editId="7BF16700">
             <wp:extent cx="4066596" cy="1877379"/>
             <wp:effectExtent l="0" t="0" r="0" b="2540"/>
             <wp:docPr id="1888014512" name="Рисунок 2"/>
@@ -3943,19 +3822,7 @@
         <w:rPr>
           <w:lang w:val="ru-RU"/>
         </w:rPr>
-        <w:t>) втрамбованы в основной блок</w:t>
-      </w:r>
-      <w:r>
-        <w:rPr>
-          <w:lang w:val="ru-RU"/>
-        </w:rPr>
-        <w:t xml:space="preserve"> </w:t>
-      </w:r>
-      <w:r>
-        <w:rPr>
-          <w:lang w:val="ru-RU"/>
-        </w:rPr>
-        <w:t>[12].</w:t>
+        <w:t>) втрамбованы в основной блок [12].</w:t>
       </w:r>
     </w:p>
     <w:p>
@@ -4113,13 +3980,7 @@
         <w:rPr>
           <w:lang w:val="en-US"/>
         </w:rPr>
-        <w:t xml:space="preserve"> </w:t>
-      </w:r>
-      <w:r>
-        <w:rPr>
-          <w:lang w:val="en-US"/>
-        </w:rPr>
-        <w:t>[12]</w:t>
+        <w:t xml:space="preserve"> [12]</w:t>
       </w:r>
       <w:r>
         <w:rPr>
@@ -4147,7 +4008,7 @@
           <w:noProof/>
         </w:rPr>
         <w:drawing>
-          <wp:inline distT="0" distB="0" distL="0" distR="0" wp14:anchorId="44960C30" wp14:editId="25BF0506">
+          <wp:inline distT="0" distB="0" distL="0" distR="0" wp14:anchorId="44960C30" wp14:editId="4AC4D377">
             <wp:extent cx="3523043" cy="1204929"/>
             <wp:effectExtent l="0" t="0" r="0" b="1905"/>
             <wp:docPr id="995729567" name="Рисунок 4" descr="Механическая клавиатура Leopold FC660C Topre"/>
@@ -4323,7 +4184,7 @@
           <w:noProof/>
         </w:rPr>
         <w:drawing>
-          <wp:inline distT="0" distB="0" distL="0" distR="0" wp14:anchorId="03C0CEA3" wp14:editId="336E339E">
+          <wp:inline distT="0" distB="0" distL="0" distR="0" wp14:anchorId="03C0CEA3" wp14:editId="47134EDA">
             <wp:extent cx="3542169" cy="1296687"/>
             <wp:effectExtent l="0" t="0" r="1270" b="0"/>
             <wp:docPr id="129535283" name="Рисунок 5" descr="Механическая клавиатура Vortex Core"/>
@@ -4487,7 +4348,7 @@
           <w:lang w:val="ru-RU"/>
         </w:rPr>
       </w:pPr>
-      <w:bookmarkStart w:id="4" w:name="_Toc225692794"/>
+      <w:bookmarkStart w:id="3" w:name="_Toc226019984"/>
       <w:r>
         <w:rPr>
           <w:lang w:val="ru-RU"/>
@@ -4500,7 +4361,7 @@
         </w:rPr>
         <w:t>Принцип работы устройства</w:t>
       </w:r>
-      <w:bookmarkEnd w:id="4"/>
+      <w:bookmarkEnd w:id="3"/>
     </w:p>
     <w:p>
       <w:pPr>
@@ -4833,7 +4694,7 @@
           <w:lang w:val="ru-RU"/>
         </w:rPr>
       </w:pPr>
-      <w:bookmarkStart w:id="5" w:name="_Toc225692795"/>
+      <w:bookmarkStart w:id="4" w:name="_Toc226019985"/>
       <w:r>
         <w:rPr>
           <w:lang w:val="ru-RU"/>
@@ -4847,29 +4708,29 @@
         </w:rPr>
         <w:t>Практическая часть</w:t>
       </w:r>
+      <w:bookmarkEnd w:id="4"/>
+    </w:p>
+    <w:p>
+      <w:pPr>
+        <w:pStyle w:val="2"/>
+        <w:rPr>
+          <w:lang w:val="ru-RU"/>
+        </w:rPr>
+      </w:pPr>
+      <w:bookmarkStart w:id="5" w:name="_Toc226019986"/>
+      <w:r>
+        <w:rPr>
+          <w:lang w:val="ru-RU"/>
+        </w:rPr>
+        <w:t xml:space="preserve">2.1. </w:t>
+      </w:r>
+      <w:r>
+        <w:rPr>
+          <w:lang w:val="ru-RU"/>
+        </w:rPr>
+        <w:t>Выбор микросхемы изделия</w:t>
+      </w:r>
       <w:bookmarkEnd w:id="5"/>
-    </w:p>
-    <w:p>
-      <w:pPr>
-        <w:pStyle w:val="2"/>
-        <w:rPr>
-          <w:lang w:val="ru-RU"/>
-        </w:rPr>
-      </w:pPr>
-      <w:bookmarkStart w:id="6" w:name="_Toc225692796"/>
-      <w:r>
-        <w:rPr>
-          <w:lang w:val="ru-RU"/>
-        </w:rPr>
-        <w:t xml:space="preserve">2.1. </w:t>
-      </w:r>
-      <w:r>
-        <w:rPr>
-          <w:lang w:val="ru-RU"/>
-        </w:rPr>
-        <w:t>Выбор микросхемы изделия</w:t>
-      </w:r>
-      <w:bookmarkEnd w:id="6"/>
     </w:p>
     <w:p>
       <w:pPr>
@@ -5484,7 +5345,7 @@
           <w:lang w:val="ru-RU"/>
         </w:rPr>
       </w:pPr>
-      <w:bookmarkStart w:id="7" w:name="_Toc225692797"/>
+      <w:bookmarkStart w:id="6" w:name="_Toc226019987"/>
       <w:r>
         <w:rPr>
           <w:lang w:val="ru-RU"/>
@@ -5497,7 +5358,7 @@
         </w:rPr>
         <w:t>Описание составных частей электронного изделия</w:t>
       </w:r>
-      <w:bookmarkEnd w:id="7"/>
+      <w:bookmarkEnd w:id="6"/>
     </w:p>
     <w:p>
       <w:pPr>
@@ -5519,6 +5380,7 @@
           <w:ilvl w:val="0"/>
           <w:numId w:val="1"/>
         </w:numPr>
+        <w:ind w:left="851" w:hanging="349"/>
       </w:pPr>
       <w:r>
         <w:t xml:space="preserve">Микроконтроллер SparkFun Pro Micro </w:t>
@@ -5578,14 +5440,14 @@
         <w:rPr>
           <w:lang w:val="ru-RU"/>
         </w:rPr>
-        <w:t xml:space="preserve"> – это специальная микросхема, которая предназначена для управления различными приборами и электронными устройствами; позволяет не </w:t>
+        <w:t xml:space="preserve"> – это специальная микросхема, которая предназначена для управления различными приборами и электронными устройствами; позволяет не только контролировать их </w:t>
       </w:r>
       <w:r>
         <w:rPr>
           <w:lang w:val="ru-RU"/>
         </w:rPr>
         <w:lastRenderedPageBreak/>
-        <w:t>только контролировать их работу, но и обеспечивать взаимодействия между ними согласно заложенной программе [</w:t>
+        <w:t>работу, но и обеспечивать взаимодействия между ними согласно заложенной программе [</w:t>
       </w:r>
       <w:r>
         <w:rPr>
@@ -5603,7 +5465,7 @@
     <w:p>
       <w:pPr>
         <w:pStyle w:val="a7"/>
-        <w:ind w:left="1145" w:firstLine="0"/>
+        <w:ind w:left="851" w:firstLine="294"/>
         <w:rPr>
           <w:lang w:val="ru-RU"/>
         </w:rPr>
@@ -5684,7 +5546,43 @@
         <w:rPr>
           <w:lang w:val="ru-RU"/>
         </w:rPr>
-        <w:t xml:space="preserve"> эта обладает весьма небольшими размерами, что идеально для маленького устройства.</w:t>
+        <w:t xml:space="preserve"> эта обладает </w:t>
+      </w:r>
+      <w:r>
+        <w:rPr>
+          <w:lang w:val="ru-RU"/>
+        </w:rPr>
+        <w:t>сравнительно</w:t>
+      </w:r>
+      <w:r>
+        <w:rPr>
+          <w:lang w:val="ru-RU"/>
+        </w:rPr>
+        <w:t xml:space="preserve"> небольшими размерами, что идеально для </w:t>
+      </w:r>
+      <w:r>
+        <w:rPr>
+          <w:lang w:val="ru-RU"/>
+        </w:rPr>
+        <w:t xml:space="preserve">сборки </w:t>
+      </w:r>
+      <w:r>
+        <w:rPr>
+          <w:lang w:val="ru-RU"/>
+        </w:rPr>
+        <w:t>маленького устройства</w:t>
+      </w:r>
+      <w:r>
+        <w:rPr>
+          <w:lang w:val="ru-RU"/>
+        </w:rPr>
+        <w:t xml:space="preserve"> ввода</w:t>
+      </w:r>
+      <w:r>
+        <w:rPr>
+          <w:lang w:val="ru-RU"/>
+        </w:rPr>
+        <w:t>.</w:t>
       </w:r>
     </w:p>
     <w:p>
@@ -5833,6 +5731,7 @@
         </w:numPr>
         <w:autoSpaceDE w:val="0"/>
         <w:autoSpaceDN w:val="0"/>
+        <w:ind w:left="851"/>
         <w:rPr>
           <w:szCs w:val="28"/>
         </w:rPr>
@@ -5924,7 +5823,7 @@
           <w:noProof/>
         </w:rPr>
         <w:drawing>
-          <wp:inline distT="0" distB="0" distL="0" distR="0" wp14:anchorId="34D2DCCC" wp14:editId="5E4A719F">
+          <wp:inline distT="0" distB="0" distL="0" distR="0" wp14:anchorId="34D2DCCC" wp14:editId="1F241A57">
             <wp:extent cx="3587750" cy="2690627"/>
             <wp:effectExtent l="0" t="0" r="0" b="0"/>
             <wp:docPr id="203042834" name="Рисунок 2" descr="Купить Макетная плата без пайки (400 точек) для Ардуино (KZY0005)  официальный магазин"/>
@@ -6038,7 +5937,7 @@
         </w:numPr>
         <w:autoSpaceDE w:val="0"/>
         <w:autoSpaceDN w:val="0"/>
-        <w:ind w:left="1560"/>
+        <w:ind w:left="1276"/>
         <w:rPr>
           <w:szCs w:val="28"/>
         </w:rPr>
@@ -6066,7 +5965,7 @@
         </w:numPr>
         <w:autoSpaceDE w:val="0"/>
         <w:autoSpaceDN w:val="0"/>
-        <w:ind w:left="1560"/>
+        <w:ind w:left="1276"/>
         <w:rPr>
           <w:szCs w:val="28"/>
         </w:rPr>
@@ -6094,7 +5993,7 @@
         </w:numPr>
         <w:autoSpaceDE w:val="0"/>
         <w:autoSpaceDN w:val="0"/>
-        <w:ind w:left="1560"/>
+        <w:ind w:left="1276"/>
         <w:rPr>
           <w:szCs w:val="28"/>
         </w:rPr>
@@ -6146,7 +6045,7 @@
         </w:numPr>
         <w:autoSpaceDE w:val="0"/>
         <w:autoSpaceDN w:val="0"/>
-        <w:ind w:left="1560"/>
+        <w:ind w:left="1276"/>
         <w:rPr>
           <w:szCs w:val="28"/>
         </w:rPr>
@@ -6222,7 +6121,7 @@
         </w:numPr>
         <w:autoSpaceDE w:val="0"/>
         <w:autoSpaceDN w:val="0"/>
-        <w:ind w:left="1560"/>
+        <w:ind w:left="1276"/>
         <w:rPr>
           <w:szCs w:val="28"/>
         </w:rPr>
@@ -6256,7 +6155,7 @@
     <w:p>
       <w:pPr>
         <w:pStyle w:val="a7"/>
-        <w:ind w:left="1145" w:firstLine="0"/>
+        <w:ind w:left="851" w:firstLine="0"/>
         <w:rPr>
           <w:szCs w:val="28"/>
           <w:lang w:val="ru-RU"/>
@@ -6289,6 +6188,7 @@
           <w:ilvl w:val="0"/>
           <w:numId w:val="1"/>
         </w:numPr>
+        <w:ind w:left="851"/>
       </w:pPr>
       <w:r>
         <w:rPr>
@@ -6525,6 +6425,7 @@
           <w:ilvl w:val="0"/>
           <w:numId w:val="1"/>
         </w:numPr>
+        <w:ind w:left="851"/>
       </w:pPr>
       <w:r>
         <w:lastRenderedPageBreak/>
@@ -6771,6 +6672,7 @@
           <w:ilvl w:val="0"/>
           <w:numId w:val="1"/>
         </w:numPr>
+        <w:ind w:left="851"/>
       </w:pPr>
       <w:r>
         <w:rPr>
@@ -6926,6 +6828,7 @@
           <w:ilvl w:val="0"/>
           <w:numId w:val="1"/>
         </w:numPr>
+        <w:ind w:left="851"/>
       </w:pPr>
       <w:r>
         <w:rPr>
@@ -7094,7 +6997,7 @@
     <w:p>
       <w:pPr>
         <w:pStyle w:val="a7"/>
-        <w:ind w:left="1145" w:firstLine="0"/>
+        <w:ind w:left="851" w:firstLine="294"/>
         <w:rPr>
           <w:lang w:val="ru-RU"/>
         </w:rPr>
@@ -7289,7 +7192,7 @@
           <w:lang w:val="ru-RU"/>
         </w:rPr>
       </w:pPr>
-      <w:bookmarkStart w:id="8" w:name="_Toc225692798"/>
+      <w:bookmarkStart w:id="7" w:name="_Toc226019988"/>
       <w:r>
         <w:rPr>
           <w:lang w:val="ru-RU"/>
@@ -7302,7 +7205,7 @@
         </w:rPr>
         <w:t>Разработка структурной схемы изделия</w:t>
       </w:r>
-      <w:bookmarkEnd w:id="8"/>
+      <w:bookmarkEnd w:id="7"/>
     </w:p>
     <w:p>
       <w:r>
@@ -7442,27 +7345,14 @@
       <w:r>
         <w:t xml:space="preserve">Рис. </w:t>
       </w:r>
-      <w:r>
-        <w:fldChar w:fldCharType="begin"/>
-      </w:r>
-      <w:r>
-        <w:instrText xml:space="preserve"> SEQ Рис. \* ARABIC </w:instrText>
-      </w:r>
-      <w:r>
-        <w:fldChar w:fldCharType="separate"/>
-      </w:r>
-      <w:r>
-        <w:rPr>
-          <w:noProof/>
-        </w:rPr>
-        <w:t>12</w:t>
-      </w:r>
-      <w:r>
-        <w:rPr>
-          <w:noProof/>
-        </w:rPr>
-        <w:fldChar w:fldCharType="end"/>
-      </w:r>
+      <w:fldSimple w:instr=" SEQ Рис. \* ARABIC ">
+        <w:r>
+          <w:rPr>
+            <w:noProof/>
+          </w:rPr>
+          <w:t>12</w:t>
+        </w:r>
+      </w:fldSimple>
       <w:r>
         <w:rPr>
           <w:lang w:val="ru-RU"/>
@@ -7569,7 +7459,7 @@
           <w:lang w:val="ru-RU"/>
         </w:rPr>
       </w:pPr>
-      <w:bookmarkStart w:id="9" w:name="_Toc225692799"/>
+      <w:bookmarkStart w:id="8" w:name="_Toc226019989"/>
       <w:r>
         <w:rPr>
           <w:lang w:val="ru-RU"/>
@@ -7582,7 +7472,7 @@
         </w:rPr>
         <w:t>Разработка принципиальной схемы изделия</w:t>
       </w:r>
-      <w:bookmarkEnd w:id="9"/>
+      <w:bookmarkEnd w:id="8"/>
     </w:p>
     <w:p>
       <w:r>
@@ -7736,27 +7626,14 @@
       <w:r>
         <w:t xml:space="preserve">Рис. </w:t>
       </w:r>
-      <w:r>
-        <w:fldChar w:fldCharType="begin"/>
-      </w:r>
-      <w:r>
-        <w:instrText xml:space="preserve"> SEQ Рис. \* ARABIC </w:instrText>
-      </w:r>
-      <w:r>
-        <w:fldChar w:fldCharType="separate"/>
-      </w:r>
-      <w:r>
-        <w:rPr>
-          <w:noProof/>
-        </w:rPr>
-        <w:t>13</w:t>
-      </w:r>
-      <w:r>
-        <w:rPr>
-          <w:noProof/>
-        </w:rPr>
-        <w:fldChar w:fldCharType="end"/>
-      </w:r>
+      <w:fldSimple w:instr=" SEQ Рис. \* ARABIC ">
+        <w:r>
+          <w:rPr>
+            <w:noProof/>
+          </w:rPr>
+          <w:t>13</w:t>
+        </w:r>
+      </w:fldSimple>
       <w:r>
         <w:rPr>
           <w:lang w:val="ru-RU"/>
@@ -7826,27 +7703,14 @@
       <w:r>
         <w:t xml:space="preserve">Рис. </w:t>
       </w:r>
-      <w:r>
-        <w:fldChar w:fldCharType="begin"/>
-      </w:r>
-      <w:r>
-        <w:instrText xml:space="preserve"> SEQ Рис. \* ARABIC </w:instrText>
-      </w:r>
-      <w:r>
-        <w:fldChar w:fldCharType="separate"/>
-      </w:r>
-      <w:r>
-        <w:rPr>
-          <w:noProof/>
-        </w:rPr>
-        <w:t>14</w:t>
-      </w:r>
-      <w:r>
-        <w:rPr>
-          <w:noProof/>
-        </w:rPr>
-        <w:fldChar w:fldCharType="end"/>
-      </w:r>
+      <w:fldSimple w:instr=" SEQ Рис. \* ARABIC ">
+        <w:r>
+          <w:rPr>
+            <w:noProof/>
+          </w:rPr>
+          <w:t>14</w:t>
+        </w:r>
+      </w:fldSimple>
       <w:r>
         <w:rPr>
           <w:lang w:val="ru-RU"/>
@@ -7861,7 +7725,7 @@
           <w:lang w:val="ru-RU"/>
         </w:rPr>
       </w:pPr>
-      <w:bookmarkStart w:id="10" w:name="_Toc225692800"/>
+      <w:bookmarkStart w:id="9" w:name="_Toc226019990"/>
       <w:r>
         <w:rPr>
           <w:lang w:val="ru-RU"/>
@@ -7875,7 +7739,7 @@
         </w:rPr>
         <w:t>Кодирование</w:t>
       </w:r>
-      <w:bookmarkEnd w:id="10"/>
+      <w:bookmarkEnd w:id="9"/>
     </w:p>
     <w:p>
       <w:pPr>
@@ -9154,7 +9018,7 @@
       <w:tr>
         <w:tc>
           <w:tcPr>
-            <w:tcW w:w="1550" w:type="dxa"/>
+            <w:tcW w:w="1962" w:type="dxa"/>
           </w:tcPr>
           <w:p>
             <w:pPr>
@@ -9174,7 +9038,7 @@
         </w:tc>
         <w:tc>
           <w:tcPr>
-            <w:tcW w:w="1034" w:type="dxa"/>
+            <w:tcW w:w="1023" w:type="dxa"/>
           </w:tcPr>
           <w:p>
             <w:pPr>
@@ -9194,7 +9058,7 @@
         </w:tc>
         <w:tc>
           <w:tcPr>
-            <w:tcW w:w="2602" w:type="dxa"/>
+            <w:tcW w:w="2547" w:type="dxa"/>
           </w:tcPr>
           <w:p>
             <w:pPr>
@@ -9214,7 +9078,7 @@
         </w:tc>
         <w:tc>
           <w:tcPr>
-            <w:tcW w:w="4442" w:type="dxa"/>
+            <w:tcW w:w="4096" w:type="dxa"/>
           </w:tcPr>
           <w:p>
             <w:pPr>
@@ -9236,12 +9100,11 @@
       <w:tr>
         <w:tc>
           <w:tcPr>
-            <w:tcW w:w="1550" w:type="dxa"/>
-          </w:tcPr>
-          <w:p>
-            <w:pPr>
-              <w:ind w:firstLine="0"/>
-              <w:jc w:val="center"/>
+            <w:tcW w:w="1962" w:type="dxa"/>
+          </w:tcPr>
+          <w:p>
+            <w:pPr>
+              <w:ind w:firstLine="0"/>
               <w:rPr>
                 <w:sz w:val="24"/>
                 <w:lang w:val="en-US"/>
@@ -9252,18 +9115,17 @@
                 <w:sz w:val="24"/>
                 <w:lang w:val="en-US"/>
               </w:rPr>
-              <w:t>1</w:t>
-            </w:r>
-          </w:p>
-        </w:tc>
-        <w:tc>
-          <w:tcPr>
-            <w:tcW w:w="1034" w:type="dxa"/>
-          </w:tcPr>
-          <w:p>
-            <w:pPr>
-              <w:ind w:firstLine="0"/>
-              <w:jc w:val="center"/>
+              <w:t>setup</w:t>
+            </w:r>
+          </w:p>
+        </w:tc>
+        <w:tc>
+          <w:tcPr>
+            <w:tcW w:w="1023" w:type="dxa"/>
+          </w:tcPr>
+          <w:p>
+            <w:pPr>
+              <w:ind w:firstLine="0"/>
               <w:rPr>
                 <w:sz w:val="24"/>
                 <w:lang w:val="en-US"/>
@@ -9274,51 +9136,49 @@
                 <w:sz w:val="24"/>
                 <w:lang w:val="en-US"/>
               </w:rPr>
-              <w:t>2</w:t>
-            </w:r>
-          </w:p>
-        </w:tc>
-        <w:tc>
-          <w:tcPr>
-            <w:tcW w:w="2602" w:type="dxa"/>
-          </w:tcPr>
-          <w:p>
-            <w:pPr>
-              <w:ind w:firstLine="0"/>
-              <w:jc w:val="center"/>
-              <w:rPr>
-                <w:sz w:val="24"/>
-                <w:lang w:val="en-US"/>
-              </w:rPr>
-            </w:pPr>
-            <w:r>
-              <w:rPr>
-                <w:sz w:val="24"/>
-                <w:lang w:val="en-US"/>
-              </w:rPr>
-              <w:t>3</w:t>
-            </w:r>
-          </w:p>
-        </w:tc>
-        <w:tc>
-          <w:tcPr>
-            <w:tcW w:w="4442" w:type="dxa"/>
-          </w:tcPr>
-          <w:p>
-            <w:pPr>
-              <w:ind w:firstLine="0"/>
-              <w:jc w:val="center"/>
-              <w:rPr>
-                <w:sz w:val="24"/>
-                <w:lang w:val="en-US"/>
-              </w:rPr>
-            </w:pPr>
-            <w:r>
-              <w:rPr>
-                <w:sz w:val="24"/>
-                <w:lang w:val="en-US"/>
-              </w:rPr>
-              <w:t>4</w:t>
+              <w:t>void</w:t>
+            </w:r>
+          </w:p>
+        </w:tc>
+        <w:tc>
+          <w:tcPr>
+            <w:tcW w:w="2547" w:type="dxa"/>
+          </w:tcPr>
+          <w:p>
+            <w:pPr>
+              <w:ind w:firstLine="0"/>
+              <w:rPr>
+                <w:sz w:val="24"/>
+                <w:lang w:val="ru-RU"/>
+              </w:rPr>
+            </w:pPr>
+            <w:r>
+              <w:rPr>
+                <w:sz w:val="24"/>
+                <w:lang w:val="ru-RU"/>
+              </w:rPr>
+              <w:t>нет</w:t>
+            </w:r>
+          </w:p>
+        </w:tc>
+        <w:tc>
+          <w:tcPr>
+            <w:tcW w:w="4096" w:type="dxa"/>
+          </w:tcPr>
+          <w:p>
+            <w:pPr>
+              <w:ind w:firstLine="0"/>
+              <w:rPr>
+                <w:sz w:val="24"/>
+                <w:lang w:val="ru-RU"/>
+              </w:rPr>
+            </w:pPr>
+            <w:r>
+              <w:rPr>
+                <w:sz w:val="24"/>
+                <w:lang w:val="ru-RU"/>
+              </w:rPr>
+              <w:t>Функция, инициализирующая микроконтроллер и дисплей</w:t>
             </w:r>
           </w:p>
         </w:tc>
@@ -9326,7 +9186,7 @@
       <w:tr>
         <w:tc>
           <w:tcPr>
-            <w:tcW w:w="1550" w:type="dxa"/>
+            <w:tcW w:w="1962" w:type="dxa"/>
           </w:tcPr>
           <w:p>
             <w:pPr>
@@ -9341,13 +9201,13 @@
                 <w:sz w:val="24"/>
                 <w:lang w:val="en-US"/>
               </w:rPr>
-              <w:t>setup</w:t>
-            </w:r>
-          </w:p>
-        </w:tc>
-        <w:tc>
-          <w:tcPr>
-            <w:tcW w:w="1034" w:type="dxa"/>
+              <w:t>loop</w:t>
+            </w:r>
+          </w:p>
+        </w:tc>
+        <w:tc>
+          <w:tcPr>
+            <w:tcW w:w="1023" w:type="dxa"/>
           </w:tcPr>
           <w:p>
             <w:pPr>
@@ -9368,7 +9228,7 @@
         </w:tc>
         <w:tc>
           <w:tcPr>
-            <w:tcW w:w="2602" w:type="dxa"/>
+            <w:tcW w:w="2547" w:type="dxa"/>
           </w:tcPr>
           <w:p>
             <w:pPr>
@@ -9389,22 +9249,29 @@
         </w:tc>
         <w:tc>
           <w:tcPr>
-            <w:tcW w:w="4442" w:type="dxa"/>
-          </w:tcPr>
-          <w:p>
-            <w:pPr>
-              <w:ind w:firstLine="0"/>
-              <w:rPr>
-                <w:sz w:val="24"/>
-                <w:lang w:val="ru-RU"/>
-              </w:rPr>
-            </w:pPr>
-            <w:r>
-              <w:rPr>
-                <w:sz w:val="24"/>
-                <w:lang w:val="ru-RU"/>
-              </w:rPr>
-              <w:t>Функция, инициализирующая микроконтроллер и дисплей</w:t>
+            <w:tcW w:w="4096" w:type="dxa"/>
+          </w:tcPr>
+          <w:p>
+            <w:pPr>
+              <w:ind w:firstLine="0"/>
+              <w:rPr>
+                <w:sz w:val="24"/>
+                <w:lang w:val="ru-RU"/>
+              </w:rPr>
+            </w:pPr>
+            <w:r>
+              <w:rPr>
+                <w:sz w:val="24"/>
+                <w:lang w:val="ru-RU"/>
+              </w:rPr>
+              <w:t xml:space="preserve">Функция, исполняющаяся циклично всё время работы микроконтроллера. </w:t>
+            </w:r>
+            <w:r>
+              <w:rPr>
+                <w:sz w:val="24"/>
+                <w:lang w:val="ru-RU"/>
+              </w:rPr>
+              <w:t>Вызывает текущий режим работы</w:t>
             </w:r>
           </w:p>
         </w:tc>
@@ -9412,7 +9279,7 @@
       <w:tr>
         <w:tc>
           <w:tcPr>
-            <w:tcW w:w="1550" w:type="dxa"/>
+            <w:tcW w:w="1962" w:type="dxa"/>
           </w:tcPr>
           <w:p>
             <w:pPr>
@@ -9422,18 +9289,20 @@
                 <w:lang w:val="en-US"/>
               </w:rPr>
             </w:pPr>
+            <w:proofErr w:type="spellStart"/>
             <w:r>
               <w:rPr>
                 <w:sz w:val="24"/>
                 <w:lang w:val="en-US"/>
               </w:rPr>
-              <w:t>loop</w:t>
-            </w:r>
-          </w:p>
-        </w:tc>
-        <w:tc>
-          <w:tcPr>
-            <w:tcW w:w="1034" w:type="dxa"/>
+              <w:t>key_press</w:t>
+            </w:r>
+            <w:proofErr w:type="spellEnd"/>
+          </w:p>
+        </w:tc>
+        <w:tc>
+          <w:tcPr>
+            <w:tcW w:w="1023" w:type="dxa"/>
           </w:tcPr>
           <w:p>
             <w:pPr>
@@ -9454,50 +9323,61 @@
         </w:tc>
         <w:tc>
           <w:tcPr>
-            <w:tcW w:w="2602" w:type="dxa"/>
-          </w:tcPr>
-          <w:p>
-            <w:pPr>
-              <w:ind w:firstLine="0"/>
-              <w:rPr>
-                <w:sz w:val="24"/>
-                <w:lang w:val="ru-RU"/>
-              </w:rPr>
-            </w:pPr>
-            <w:r>
-              <w:rPr>
-                <w:sz w:val="24"/>
-                <w:lang w:val="ru-RU"/>
-              </w:rPr>
-              <w:t>нет</w:t>
-            </w:r>
-          </w:p>
-        </w:tc>
-        <w:tc>
-          <w:tcPr>
-            <w:tcW w:w="4442" w:type="dxa"/>
-          </w:tcPr>
-          <w:p>
-            <w:pPr>
-              <w:ind w:firstLine="0"/>
-              <w:rPr>
-                <w:sz w:val="24"/>
-                <w:lang w:val="ru-RU"/>
-              </w:rPr>
-            </w:pPr>
-            <w:r>
-              <w:rPr>
-                <w:sz w:val="24"/>
-                <w:lang w:val="ru-RU"/>
-              </w:rPr>
-              <w:t xml:space="preserve">Функция, исполняющаяся циклично всё время работы микроконтроллера. </w:t>
-            </w:r>
-            <w:r>
-              <w:rPr>
-                <w:sz w:val="24"/>
-                <w:lang w:val="ru-RU"/>
-              </w:rPr>
-              <w:t>Вызывает текущий режим работы</w:t>
+            <w:tcW w:w="2547" w:type="dxa"/>
+          </w:tcPr>
+          <w:p>
+            <w:pPr>
+              <w:ind w:firstLine="0"/>
+              <w:rPr>
+                <w:sz w:val="24"/>
+                <w:lang w:val="ru-RU"/>
+              </w:rPr>
+            </w:pPr>
+            <w:proofErr w:type="spellStart"/>
+            <w:r>
+              <w:rPr>
+                <w:sz w:val="24"/>
+                <w:lang w:val="ru-RU"/>
+              </w:rPr>
+              <w:t>void</w:t>
+            </w:r>
+            <w:proofErr w:type="spellEnd"/>
+            <w:r>
+              <w:rPr>
+                <w:sz w:val="24"/>
+                <w:lang w:val="ru-RU"/>
+              </w:rPr>
+              <w:t xml:space="preserve"> (*)(), </w:t>
+            </w:r>
+            <w:proofErr w:type="spellStart"/>
+            <w:r>
+              <w:rPr>
+                <w:sz w:val="24"/>
+                <w:lang w:val="ru-RU"/>
+              </w:rPr>
+              <w:t>int</w:t>
+            </w:r>
+            <w:proofErr w:type="spellEnd"/>
+          </w:p>
+        </w:tc>
+        <w:tc>
+          <w:tcPr>
+            <w:tcW w:w="4096" w:type="dxa"/>
+          </w:tcPr>
+          <w:p>
+            <w:pPr>
+              <w:ind w:firstLine="0"/>
+              <w:rPr>
+                <w:sz w:val="24"/>
+                <w:lang w:val="ru-RU"/>
+              </w:rPr>
+            </w:pPr>
+            <w:r>
+              <w:rPr>
+                <w:sz w:val="24"/>
+                <w:lang w:val="ru-RU"/>
+              </w:rPr>
+              <w:t>Функция, реализующая логику обработки нажатий на одну из клавиш</w:t>
             </w:r>
           </w:p>
         </w:tc>
@@ -9505,7 +9385,7 @@
       <w:tr>
         <w:tc>
           <w:tcPr>
-            <w:tcW w:w="1550" w:type="dxa"/>
+            <w:tcW w:w="1962" w:type="dxa"/>
           </w:tcPr>
           <w:p>
             <w:pPr>
@@ -9521,14 +9401,14 @@
                 <w:sz w:val="24"/>
                 <w:lang w:val="en-US"/>
               </w:rPr>
-              <w:t>key_press</w:t>
+              <w:t>key_mode</w:t>
             </w:r>
             <w:proofErr w:type="spellEnd"/>
           </w:p>
         </w:tc>
         <w:tc>
           <w:tcPr>
-            <w:tcW w:w="1034" w:type="dxa"/>
+            <w:tcW w:w="1023" w:type="dxa"/>
           </w:tcPr>
           <w:p>
             <w:pPr>
@@ -9549,61 +9429,43 @@
         </w:tc>
         <w:tc>
           <w:tcPr>
-            <w:tcW w:w="2602" w:type="dxa"/>
-          </w:tcPr>
-          <w:p>
-            <w:pPr>
-              <w:ind w:firstLine="0"/>
-              <w:rPr>
-                <w:sz w:val="24"/>
-                <w:lang w:val="ru-RU"/>
-              </w:rPr>
-            </w:pPr>
-            <w:proofErr w:type="spellStart"/>
-            <w:r>
-              <w:rPr>
-                <w:sz w:val="24"/>
-                <w:lang w:val="ru-RU"/>
-              </w:rPr>
-              <w:t>void</w:t>
-            </w:r>
-            <w:proofErr w:type="spellEnd"/>
-            <w:r>
-              <w:rPr>
-                <w:sz w:val="24"/>
-                <w:lang w:val="ru-RU"/>
-              </w:rPr>
-              <w:t xml:space="preserve"> (*)(), </w:t>
-            </w:r>
-            <w:proofErr w:type="spellStart"/>
-            <w:r>
-              <w:rPr>
-                <w:sz w:val="24"/>
-                <w:lang w:val="ru-RU"/>
-              </w:rPr>
-              <w:t>int</w:t>
-            </w:r>
-            <w:proofErr w:type="spellEnd"/>
-          </w:p>
-        </w:tc>
-        <w:tc>
-          <w:tcPr>
-            <w:tcW w:w="4442" w:type="dxa"/>
-          </w:tcPr>
-          <w:p>
-            <w:pPr>
-              <w:ind w:firstLine="0"/>
-              <w:rPr>
-                <w:sz w:val="24"/>
-                <w:lang w:val="ru-RU"/>
-              </w:rPr>
-            </w:pPr>
-            <w:r>
-              <w:rPr>
-                <w:sz w:val="24"/>
-                <w:lang w:val="ru-RU"/>
-              </w:rPr>
-              <w:t>Функция, реализующая логику обработки нажатий на одну из клавиш</w:t>
+            <w:tcW w:w="2547" w:type="dxa"/>
+          </w:tcPr>
+          <w:p>
+            <w:pPr>
+              <w:ind w:firstLine="0"/>
+              <w:rPr>
+                <w:sz w:val="24"/>
+                <w:lang w:val="ru-RU"/>
+              </w:rPr>
+            </w:pPr>
+            <w:r>
+              <w:rPr>
+                <w:sz w:val="24"/>
+                <w:lang w:val="ru-RU"/>
+              </w:rPr>
+              <w:t>Adafruit_SSD1306&amp;</w:t>
+            </w:r>
+          </w:p>
+        </w:tc>
+        <w:tc>
+          <w:tcPr>
+            <w:tcW w:w="4096" w:type="dxa"/>
+          </w:tcPr>
+          <w:p>
+            <w:pPr>
+              <w:ind w:firstLine="0"/>
+              <w:rPr>
+                <w:sz w:val="24"/>
+                <w:lang w:val="ru-RU"/>
+              </w:rPr>
+            </w:pPr>
+            <w:r>
+              <w:rPr>
+                <w:sz w:val="24"/>
+                <w:lang w:val="ru-RU"/>
+              </w:rPr>
+              <w:t>Функция работы микроконтроллера в первом режиме</w:t>
             </w:r>
           </w:p>
         </w:tc>
@@ -9611,7 +9473,7 @@
       <w:tr>
         <w:tc>
           <w:tcPr>
-            <w:tcW w:w="1550" w:type="dxa"/>
+            <w:tcW w:w="1962" w:type="dxa"/>
           </w:tcPr>
           <w:p>
             <w:pPr>
@@ -9627,14 +9489,14 @@
                 <w:sz w:val="24"/>
                 <w:lang w:val="en-US"/>
               </w:rPr>
-              <w:t>key_mode</w:t>
+              <w:t>copy_mode</w:t>
             </w:r>
             <w:proofErr w:type="spellEnd"/>
           </w:p>
         </w:tc>
         <w:tc>
           <w:tcPr>
-            <w:tcW w:w="1034" w:type="dxa"/>
+            <w:tcW w:w="1023" w:type="dxa"/>
           </w:tcPr>
           <w:p>
             <w:pPr>
@@ -9655,7 +9517,7 @@
         </w:tc>
         <w:tc>
           <w:tcPr>
-            <w:tcW w:w="2602" w:type="dxa"/>
+            <w:tcW w:w="2547" w:type="dxa"/>
           </w:tcPr>
           <w:p>
             <w:pPr>
@@ -9676,22 +9538,22 @@
         </w:tc>
         <w:tc>
           <w:tcPr>
-            <w:tcW w:w="4442" w:type="dxa"/>
-          </w:tcPr>
-          <w:p>
-            <w:pPr>
-              <w:ind w:firstLine="0"/>
-              <w:rPr>
-                <w:sz w:val="24"/>
-                <w:lang w:val="ru-RU"/>
-              </w:rPr>
-            </w:pPr>
-            <w:r>
-              <w:rPr>
-                <w:sz w:val="24"/>
-                <w:lang w:val="ru-RU"/>
-              </w:rPr>
-              <w:t>Функция работы микроконтроллера в первом режиме</w:t>
+            <w:tcW w:w="4096" w:type="dxa"/>
+          </w:tcPr>
+          <w:p>
+            <w:pPr>
+              <w:ind w:firstLine="0"/>
+              <w:rPr>
+                <w:sz w:val="24"/>
+                <w:lang w:val="ru-RU"/>
+              </w:rPr>
+            </w:pPr>
+            <w:r>
+              <w:rPr>
+                <w:sz w:val="24"/>
+                <w:lang w:val="ru-RU"/>
+              </w:rPr>
+              <w:t>Функция работы микроконтроллера во втором режиме</w:t>
             </w:r>
           </w:p>
         </w:tc>
@@ -9699,7 +9561,7 @@
       <w:tr>
         <w:tc>
           <w:tcPr>
-            <w:tcW w:w="1550" w:type="dxa"/>
+            <w:tcW w:w="1962" w:type="dxa"/>
           </w:tcPr>
           <w:p>
             <w:pPr>
@@ -9715,14 +9577,14 @@
                 <w:sz w:val="24"/>
                 <w:lang w:val="en-US"/>
               </w:rPr>
-              <w:t>copy_mode</w:t>
+              <w:t>mouse_mode</w:t>
             </w:r>
             <w:proofErr w:type="spellEnd"/>
           </w:p>
         </w:tc>
         <w:tc>
           <w:tcPr>
-            <w:tcW w:w="1034" w:type="dxa"/>
+            <w:tcW w:w="1023" w:type="dxa"/>
           </w:tcPr>
           <w:p>
             <w:pPr>
@@ -9743,7 +9605,7 @@
         </w:tc>
         <w:tc>
           <w:tcPr>
-            <w:tcW w:w="2602" w:type="dxa"/>
+            <w:tcW w:w="2547" w:type="dxa"/>
           </w:tcPr>
           <w:p>
             <w:pPr>
@@ -9764,22 +9626,22 @@
         </w:tc>
         <w:tc>
           <w:tcPr>
-            <w:tcW w:w="4442" w:type="dxa"/>
-          </w:tcPr>
-          <w:p>
-            <w:pPr>
-              <w:ind w:firstLine="0"/>
-              <w:rPr>
-                <w:sz w:val="24"/>
-                <w:lang w:val="ru-RU"/>
-              </w:rPr>
-            </w:pPr>
-            <w:r>
-              <w:rPr>
-                <w:sz w:val="24"/>
-                <w:lang w:val="ru-RU"/>
-              </w:rPr>
-              <w:t>Функция работы микроконтроллера во втором режиме</w:t>
+            <w:tcW w:w="4096" w:type="dxa"/>
+          </w:tcPr>
+          <w:p>
+            <w:pPr>
+              <w:ind w:firstLine="0"/>
+              <w:rPr>
+                <w:sz w:val="24"/>
+                <w:lang w:val="ru-RU"/>
+              </w:rPr>
+            </w:pPr>
+            <w:r>
+              <w:rPr>
+                <w:sz w:val="24"/>
+                <w:lang w:val="ru-RU"/>
+              </w:rPr>
+              <w:t>Функция работы микроконтроллера в третьем режиме</w:t>
             </w:r>
           </w:p>
         </w:tc>
@@ -9787,7 +9649,7 @@
       <w:tr>
         <w:tc>
           <w:tcPr>
-            <w:tcW w:w="1550" w:type="dxa"/>
+            <w:tcW w:w="1962" w:type="dxa"/>
           </w:tcPr>
           <w:p>
             <w:pPr>
@@ -9803,14 +9665,14 @@
                 <w:sz w:val="24"/>
                 <w:lang w:val="en-US"/>
               </w:rPr>
-              <w:t>mouse_mode</w:t>
+              <w:t>mode_change</w:t>
             </w:r>
             <w:proofErr w:type="spellEnd"/>
           </w:p>
         </w:tc>
         <w:tc>
           <w:tcPr>
-            <w:tcW w:w="1034" w:type="dxa"/>
+            <w:tcW w:w="1023" w:type="dxa"/>
           </w:tcPr>
           <w:p>
             <w:pPr>
@@ -9831,7 +9693,7 @@
         </w:tc>
         <w:tc>
           <w:tcPr>
-            <w:tcW w:w="2602" w:type="dxa"/>
+            <w:tcW w:w="2547" w:type="dxa"/>
           </w:tcPr>
           <w:p>
             <w:pPr>
@@ -9852,22 +9714,22 @@
         </w:tc>
         <w:tc>
           <w:tcPr>
-            <w:tcW w:w="4442" w:type="dxa"/>
-          </w:tcPr>
-          <w:p>
-            <w:pPr>
-              <w:ind w:firstLine="0"/>
-              <w:rPr>
-                <w:sz w:val="24"/>
-                <w:lang w:val="ru-RU"/>
-              </w:rPr>
-            </w:pPr>
-            <w:r>
-              <w:rPr>
-                <w:sz w:val="24"/>
-                <w:lang w:val="ru-RU"/>
-              </w:rPr>
-              <w:t>Функция работы микроконтроллера в третьем режиме</w:t>
+            <w:tcW w:w="4096" w:type="dxa"/>
+          </w:tcPr>
+          <w:p>
+            <w:pPr>
+              <w:ind w:firstLine="0"/>
+              <w:rPr>
+                <w:sz w:val="24"/>
+                <w:lang w:val="ru-RU"/>
+              </w:rPr>
+            </w:pPr>
+            <w:r>
+              <w:rPr>
+                <w:sz w:val="24"/>
+                <w:lang w:val="ru-RU"/>
+              </w:rPr>
+              <w:t>Функция смены режима на следующий</w:t>
             </w:r>
           </w:p>
         </w:tc>
@@ -9875,7 +9737,7 @@
       <w:tr>
         <w:tc>
           <w:tcPr>
-            <w:tcW w:w="1550" w:type="dxa"/>
+            <w:tcW w:w="1962" w:type="dxa"/>
           </w:tcPr>
           <w:p>
             <w:pPr>
@@ -9891,14 +9753,14 @@
                 <w:sz w:val="24"/>
                 <w:lang w:val="en-US"/>
               </w:rPr>
-              <w:t>mode_change</w:t>
+              <w:t>get_current_mode</w:t>
             </w:r>
             <w:proofErr w:type="spellEnd"/>
           </w:p>
         </w:tc>
         <w:tc>
           <w:tcPr>
-            <w:tcW w:w="1034" w:type="dxa"/>
+            <w:tcW w:w="1023" w:type="dxa"/>
           </w:tcPr>
           <w:p>
             <w:pPr>
@@ -9913,101 +9775,13 @@
                 <w:sz w:val="24"/>
                 <w:lang w:val="en-US"/>
               </w:rPr>
-              <w:t>void</w:t>
-            </w:r>
-          </w:p>
-        </w:tc>
-        <w:tc>
-          <w:tcPr>
-            <w:tcW w:w="2602" w:type="dxa"/>
-          </w:tcPr>
-          <w:p>
-            <w:pPr>
-              <w:ind w:firstLine="0"/>
-              <w:rPr>
-                <w:sz w:val="24"/>
-                <w:lang w:val="ru-RU"/>
-              </w:rPr>
-            </w:pPr>
-            <w:r>
-              <w:rPr>
-                <w:sz w:val="24"/>
-                <w:lang w:val="ru-RU"/>
-              </w:rPr>
-              <w:t>Adafruit_SSD1306&amp;</w:t>
-            </w:r>
-          </w:p>
-        </w:tc>
-        <w:tc>
-          <w:tcPr>
-            <w:tcW w:w="4442" w:type="dxa"/>
-          </w:tcPr>
-          <w:p>
-            <w:pPr>
-              <w:ind w:firstLine="0"/>
-              <w:rPr>
-                <w:sz w:val="24"/>
-                <w:lang w:val="ru-RU"/>
-              </w:rPr>
-            </w:pPr>
-            <w:r>
-              <w:rPr>
-                <w:sz w:val="24"/>
-                <w:lang w:val="ru-RU"/>
-              </w:rPr>
-              <w:t>Функция смены режима на следующий</w:t>
-            </w:r>
-          </w:p>
-        </w:tc>
-      </w:tr>
-      <w:tr>
-        <w:tc>
-          <w:tcPr>
-            <w:tcW w:w="1550" w:type="dxa"/>
-          </w:tcPr>
-          <w:p>
-            <w:pPr>
-              <w:ind w:firstLine="0"/>
-              <w:rPr>
-                <w:sz w:val="24"/>
-                <w:lang w:val="en-US"/>
-              </w:rPr>
-            </w:pPr>
-            <w:proofErr w:type="spellStart"/>
-            <w:r>
-              <w:rPr>
-                <w:sz w:val="24"/>
-                <w:lang w:val="en-US"/>
-              </w:rPr>
-              <w:t>get_current_mode</w:t>
-            </w:r>
-            <w:proofErr w:type="spellEnd"/>
-          </w:p>
-        </w:tc>
-        <w:tc>
-          <w:tcPr>
-            <w:tcW w:w="1034" w:type="dxa"/>
-          </w:tcPr>
-          <w:p>
-            <w:pPr>
-              <w:ind w:firstLine="0"/>
-              <w:rPr>
-                <w:sz w:val="24"/>
-                <w:lang w:val="en-US"/>
-              </w:rPr>
-            </w:pPr>
-            <w:r>
-              <w:rPr>
-                <w:sz w:val="24"/>
-                <w:lang w:val="en-US"/>
-              </w:rPr>
               <w:t>int8_t&amp;</w:t>
             </w:r>
           </w:p>
         </w:tc>
         <w:tc>
           <w:tcPr>
-            <w:tcW w:w="2602" w:type="dxa"/>
+            <w:tcW w:w="2547" w:type="dxa"/>
           </w:tcPr>
           <w:p>
             <w:pPr>
@@ -10028,7 +9802,7 @@
         </w:tc>
         <w:tc>
           <w:tcPr>
-            <w:tcW w:w="4442" w:type="dxa"/>
+            <w:tcW w:w="4096" w:type="dxa"/>
           </w:tcPr>
           <w:p>
             <w:pPr>
@@ -10719,7 +10493,6 @@
                 <w:sz w:val="18"/>
                 <w:szCs w:val="18"/>
               </w:rPr>
-              <w:lastRenderedPageBreak/>
               <w:t xml:space="preserve">    </w:t>
             </w:r>
             <w:r>
@@ -10778,6 +10551,7 @@
                 <w:sz w:val="18"/>
                 <w:szCs w:val="18"/>
               </w:rPr>
+              <w:lastRenderedPageBreak/>
               <w:t xml:space="preserve">    </w:t>
             </w:r>
             <w:r>
@@ -12963,6 +12737,46 @@
                 <w:sz w:val="18"/>
                 <w:szCs w:val="18"/>
               </w:rPr>
+              <w:t xml:space="preserve">            </w:t>
+            </w:r>
+            <w:r>
+              <w:rPr>
+                <w:rFonts w:ascii="Menlo" w:hAnsi="Menlo" w:cs="Menlo"/>
+                <w:color w:val="001080"/>
+                <w:sz w:val="18"/>
+                <w:szCs w:val="18"/>
+              </w:rPr>
+              <w:t>pressfunc</w:t>
+            </w:r>
+            <w:r>
+              <w:rPr>
+                <w:rFonts w:ascii="Menlo" w:hAnsi="Menlo" w:cs="Menlo"/>
+                <w:color w:val="3B3B3B"/>
+                <w:sz w:val="18"/>
+                <w:szCs w:val="18"/>
+              </w:rPr>
+              <w:t>();</w:t>
+            </w:r>
+          </w:p>
+          <w:p>
+            <w:pPr>
+              <w:shd w:val="clear" w:color="auto" w:fill="FFFFFF"/>
+              <w:spacing w:line="270" w:lineRule="atLeast"/>
+              <w:ind w:firstLine="0"/>
+              <w:rPr>
+                <w:rFonts w:ascii="Menlo" w:hAnsi="Menlo" w:cs="Menlo"/>
+                <w:color w:val="3B3B3B"/>
+                <w:sz w:val="18"/>
+                <w:szCs w:val="18"/>
+              </w:rPr>
+            </w:pPr>
+            <w:r>
+              <w:rPr>
+                <w:rFonts w:ascii="Menlo" w:hAnsi="Menlo" w:cs="Menlo"/>
+                <w:color w:val="3B3B3B"/>
+                <w:sz w:val="18"/>
+                <w:szCs w:val="18"/>
+              </w:rPr>
               <w:lastRenderedPageBreak/>
               <w:t xml:space="preserve">            </w:t>
             </w:r>
@@ -12973,7 +12787,7 @@
                 <w:sz w:val="18"/>
                 <w:szCs w:val="18"/>
               </w:rPr>
-              <w:t>pressfunc</w:t>
+              <w:t>left_pressed</w:t>
             </w:r>
             <w:r>
               <w:rPr>
@@ -12982,7 +12796,43 @@
                 <w:sz w:val="18"/>
                 <w:szCs w:val="18"/>
               </w:rPr>
-              <w:t>();</w:t>
+              <w:t xml:space="preserve"> </w:t>
+            </w:r>
+            <w:r>
+              <w:rPr>
+                <w:rFonts w:ascii="Menlo" w:hAnsi="Menlo" w:cs="Menlo"/>
+                <w:color w:val="000000"/>
+                <w:sz w:val="18"/>
+                <w:szCs w:val="18"/>
+              </w:rPr>
+              <w:t>=</w:t>
+            </w:r>
+            <w:r>
+              <w:rPr>
+                <w:rFonts w:ascii="Menlo" w:hAnsi="Menlo" w:cs="Menlo"/>
+                <w:color w:val="3B3B3B"/>
+                <w:sz w:val="18"/>
+                <w:szCs w:val="18"/>
+              </w:rPr>
+              <w:t xml:space="preserve"> </w:t>
+            </w:r>
+            <w:r>
+              <w:rPr>
+                <w:rFonts w:ascii="Menlo" w:hAnsi="Menlo" w:cs="Menlo"/>
+                <w:color w:val="0000FF"/>
+                <w:sz w:val="18"/>
+                <w:szCs w:val="18"/>
+              </w:rPr>
+              <w:t>true</w:t>
+            </w:r>
+            <w:r>
+              <w:rPr>
+                <w:rFonts w:ascii="Menlo" w:hAnsi="Menlo" w:cs="Menlo"/>
+                <w:color w:val="3B3B3B"/>
+                <w:sz w:val="18"/>
+                <w:szCs w:val="18"/>
+              </w:rPr>
+              <w:t>;</w:t>
             </w:r>
           </w:p>
           <w:p>
@@ -13004,61 +12854,7 @@
                 <w:sz w:val="18"/>
                 <w:szCs w:val="18"/>
               </w:rPr>
-              <w:t xml:space="preserve">            </w:t>
-            </w:r>
-            <w:r>
-              <w:rPr>
-                <w:rFonts w:ascii="Menlo" w:hAnsi="Menlo" w:cs="Menlo"/>
-                <w:color w:val="001080"/>
-                <w:sz w:val="18"/>
-                <w:szCs w:val="18"/>
-              </w:rPr>
-              <w:t>left_pressed</w:t>
-            </w:r>
-            <w:r>
-              <w:rPr>
-                <w:rFonts w:ascii="Menlo" w:hAnsi="Menlo" w:cs="Menlo"/>
-                <w:color w:val="3B3B3B"/>
-                <w:sz w:val="18"/>
-                <w:szCs w:val="18"/>
-              </w:rPr>
-              <w:t xml:space="preserve"> </w:t>
-            </w:r>
-            <w:r>
-              <w:rPr>
-                <w:rFonts w:ascii="Menlo" w:hAnsi="Menlo" w:cs="Menlo"/>
-                <w:color w:val="000000"/>
-                <w:sz w:val="18"/>
-                <w:szCs w:val="18"/>
-              </w:rPr>
-              <w:t>=</w:t>
-            </w:r>
-            <w:r>
-              <w:rPr>
-                <w:rFonts w:ascii="Menlo" w:hAnsi="Menlo" w:cs="Menlo"/>
-                <w:color w:val="3B3B3B"/>
-                <w:sz w:val="18"/>
-                <w:szCs w:val="18"/>
-              </w:rPr>
-              <w:t xml:space="preserve"> </w:t>
-            </w:r>
-            <w:r>
-              <w:rPr>
-                <w:rFonts w:ascii="Menlo" w:hAnsi="Menlo" w:cs="Menlo"/>
-                <w:color w:val="0000FF"/>
-                <w:sz w:val="18"/>
-                <w:szCs w:val="18"/>
-              </w:rPr>
-              <w:t>true</w:t>
-            </w:r>
-            <w:r>
-              <w:rPr>
-                <w:rFonts w:ascii="Menlo" w:hAnsi="Menlo" w:cs="Menlo"/>
-                <w:color w:val="3B3B3B"/>
-                <w:sz w:val="18"/>
-                <w:szCs w:val="18"/>
-              </w:rPr>
-              <w:t>;</w:t>
+              <w:t xml:space="preserve">        }</w:t>
             </w:r>
           </w:p>
           <w:p>
@@ -13080,7 +12876,88 @@
                 <w:sz w:val="18"/>
                 <w:szCs w:val="18"/>
               </w:rPr>
-              <w:t xml:space="preserve">        }</w:t>
+              <w:t xml:space="preserve">        </w:t>
+            </w:r>
+            <w:r>
+              <w:rPr>
+                <w:rFonts w:ascii="Menlo" w:hAnsi="Menlo" w:cs="Menlo"/>
+                <w:color w:val="AF00DB"/>
+                <w:sz w:val="18"/>
+                <w:szCs w:val="18"/>
+              </w:rPr>
+              <w:t>if</w:t>
+            </w:r>
+            <w:r>
+              <w:rPr>
+                <w:rFonts w:ascii="Menlo" w:hAnsi="Menlo" w:cs="Menlo"/>
+                <w:color w:val="3B3B3B"/>
+                <w:sz w:val="18"/>
+                <w:szCs w:val="18"/>
+              </w:rPr>
+              <w:t xml:space="preserve"> (</w:t>
+            </w:r>
+            <w:r>
+              <w:rPr>
+                <w:rFonts w:ascii="Menlo" w:hAnsi="Menlo" w:cs="Menlo"/>
+                <w:color w:val="001080"/>
+                <w:sz w:val="18"/>
+                <w:szCs w:val="18"/>
+              </w:rPr>
+              <w:t>right</w:t>
+            </w:r>
+            <w:r>
+              <w:rPr>
+                <w:rFonts w:ascii="Menlo" w:hAnsi="Menlo" w:cs="Menlo"/>
+                <w:color w:val="3B3B3B"/>
+                <w:sz w:val="18"/>
+                <w:szCs w:val="18"/>
+              </w:rPr>
+              <w:t xml:space="preserve"> </w:t>
+            </w:r>
+            <w:r>
+              <w:rPr>
+                <w:rFonts w:ascii="Menlo" w:hAnsi="Menlo" w:cs="Menlo"/>
+                <w:color w:val="000000"/>
+                <w:sz w:val="18"/>
+                <w:szCs w:val="18"/>
+              </w:rPr>
+              <w:t>&amp;&amp;</w:t>
+            </w:r>
+            <w:r>
+              <w:rPr>
+                <w:rFonts w:ascii="Menlo" w:hAnsi="Menlo" w:cs="Menlo"/>
+                <w:color w:val="3B3B3B"/>
+                <w:sz w:val="18"/>
+                <w:szCs w:val="18"/>
+              </w:rPr>
+              <w:t xml:space="preserve"> </w:t>
+            </w:r>
+            <w:r>
+              <w:rPr>
+                <w:rFonts w:ascii="Menlo" w:hAnsi="Menlo" w:cs="Menlo"/>
+                <w:color w:val="000000"/>
+                <w:sz w:val="18"/>
+                <w:szCs w:val="18"/>
+              </w:rPr>
+              <w:t>!</w:t>
+            </w:r>
+            <w:r>
+              <w:rPr>
+                <w:rFonts w:ascii="Menlo" w:hAnsi="Menlo" w:cs="Menlo"/>
+                <w:color w:val="001080"/>
+                <w:sz w:val="18"/>
+                <w:szCs w:val="18"/>
+              </w:rPr>
+              <w:t>right_pressed</w:t>
+            </w:r>
+            <w:r>
+              <w:rPr>
+                <w:rFonts w:ascii="Menlo" w:hAnsi="Menlo" w:cs="Menlo"/>
+                <w:color w:val="3B3B3B"/>
+                <w:sz w:val="18"/>
+                <w:szCs w:val="18"/>
+              </w:rPr>
+              <w:t>) {</w:t>
             </w:r>
           </w:p>
           <w:p>
@@ -13102,16 +12979,16 @@
                 <w:sz w:val="18"/>
                 <w:szCs w:val="18"/>
               </w:rPr>
-              <w:t xml:space="preserve">        </w:t>
-            </w:r>
-            <w:r>
-              <w:rPr>
-                <w:rFonts w:ascii="Menlo" w:hAnsi="Menlo" w:cs="Menlo"/>
-                <w:color w:val="AF00DB"/>
-                <w:sz w:val="18"/>
-                <w:szCs w:val="18"/>
-              </w:rPr>
-              <w:t>if</w:t>
+              <w:t xml:space="preserve">            </w:t>
+            </w:r>
+            <w:r>
+              <w:rPr>
+                <w:rFonts w:ascii="Menlo" w:hAnsi="Menlo" w:cs="Menlo"/>
+                <w:color w:val="001080"/>
+                <w:sz w:val="18"/>
+                <w:szCs w:val="18"/>
+              </w:rPr>
+              <w:t>pressfunc</w:t>
             </w:r>
             <w:r>
               <w:rPr>
@@ -13120,70 +12997,7 @@
                 <w:sz w:val="18"/>
                 <w:szCs w:val="18"/>
               </w:rPr>
-              <w:t xml:space="preserve"> (</w:t>
-            </w:r>
-            <w:r>
-              <w:rPr>
-                <w:rFonts w:ascii="Menlo" w:hAnsi="Menlo" w:cs="Menlo"/>
-                <w:color w:val="001080"/>
-                <w:sz w:val="18"/>
-                <w:szCs w:val="18"/>
-              </w:rPr>
-              <w:t>right</w:t>
-            </w:r>
-            <w:r>
-              <w:rPr>
-                <w:rFonts w:ascii="Menlo" w:hAnsi="Menlo" w:cs="Menlo"/>
-                <w:color w:val="3B3B3B"/>
-                <w:sz w:val="18"/>
-                <w:szCs w:val="18"/>
-              </w:rPr>
-              <w:t xml:space="preserve"> </w:t>
-            </w:r>
-            <w:r>
-              <w:rPr>
-                <w:rFonts w:ascii="Menlo" w:hAnsi="Menlo" w:cs="Menlo"/>
-                <w:color w:val="000000"/>
-                <w:sz w:val="18"/>
-                <w:szCs w:val="18"/>
-              </w:rPr>
-              <w:t>&amp;&amp;</w:t>
-            </w:r>
-            <w:r>
-              <w:rPr>
-                <w:rFonts w:ascii="Menlo" w:hAnsi="Menlo" w:cs="Menlo"/>
-                <w:color w:val="3B3B3B"/>
-                <w:sz w:val="18"/>
-                <w:szCs w:val="18"/>
-              </w:rPr>
-              <w:t xml:space="preserve"> </w:t>
-            </w:r>
-            <w:r>
-              <w:rPr>
-                <w:rFonts w:ascii="Menlo" w:hAnsi="Menlo" w:cs="Menlo"/>
-                <w:color w:val="000000"/>
-                <w:sz w:val="18"/>
-                <w:szCs w:val="18"/>
-              </w:rPr>
-              <w:t>!</w:t>
-            </w:r>
-            <w:r>
-              <w:rPr>
-                <w:rFonts w:ascii="Menlo" w:hAnsi="Menlo" w:cs="Menlo"/>
-                <w:color w:val="001080"/>
-                <w:sz w:val="18"/>
-                <w:szCs w:val="18"/>
-              </w:rPr>
-              <w:t>right_pressed</w:t>
-            </w:r>
-            <w:r>
-              <w:rPr>
-                <w:rFonts w:ascii="Menlo" w:hAnsi="Menlo" w:cs="Menlo"/>
-                <w:color w:val="3B3B3B"/>
-                <w:sz w:val="18"/>
-                <w:szCs w:val="18"/>
-              </w:rPr>
-              <w:t>) {</w:t>
+              <w:t>();</w:t>
             </w:r>
           </w:p>
           <w:p>
@@ -13214,7 +13028,7 @@
                 <w:sz w:val="18"/>
                 <w:szCs w:val="18"/>
               </w:rPr>
-              <w:t>pressfunc</w:t>
+              <w:t>right_pressed</w:t>
             </w:r>
             <w:r>
               <w:rPr>
@@ -13223,7 +13037,43 @@
                 <w:sz w:val="18"/>
                 <w:szCs w:val="18"/>
               </w:rPr>
-              <w:t>();</w:t>
+              <w:t xml:space="preserve"> </w:t>
+            </w:r>
+            <w:r>
+              <w:rPr>
+                <w:rFonts w:ascii="Menlo" w:hAnsi="Menlo" w:cs="Menlo"/>
+                <w:color w:val="000000"/>
+                <w:sz w:val="18"/>
+                <w:szCs w:val="18"/>
+              </w:rPr>
+              <w:t>=</w:t>
+            </w:r>
+            <w:r>
+              <w:rPr>
+                <w:rFonts w:ascii="Menlo" w:hAnsi="Menlo" w:cs="Menlo"/>
+                <w:color w:val="3B3B3B"/>
+                <w:sz w:val="18"/>
+                <w:szCs w:val="18"/>
+              </w:rPr>
+              <w:t xml:space="preserve"> </w:t>
+            </w:r>
+            <w:r>
+              <w:rPr>
+                <w:rFonts w:ascii="Menlo" w:hAnsi="Menlo" w:cs="Menlo"/>
+                <w:color w:val="0000FF"/>
+                <w:sz w:val="18"/>
+                <w:szCs w:val="18"/>
+              </w:rPr>
+              <w:t>true</w:t>
+            </w:r>
+            <w:r>
+              <w:rPr>
+                <w:rFonts w:ascii="Menlo" w:hAnsi="Menlo" w:cs="Menlo"/>
+                <w:color w:val="3B3B3B"/>
+                <w:sz w:val="18"/>
+                <w:szCs w:val="18"/>
+              </w:rPr>
+              <w:t>;</w:t>
             </w:r>
           </w:p>
           <w:p>
@@ -13245,61 +13095,7 @@
                 <w:sz w:val="18"/>
                 <w:szCs w:val="18"/>
               </w:rPr>
-              <w:t xml:space="preserve">            </w:t>
-            </w:r>
-            <w:r>
-              <w:rPr>
-                <w:rFonts w:ascii="Menlo" w:hAnsi="Menlo" w:cs="Menlo"/>
-                <w:color w:val="001080"/>
-                <w:sz w:val="18"/>
-                <w:szCs w:val="18"/>
-              </w:rPr>
-              <w:t>right_pressed</w:t>
-            </w:r>
-            <w:r>
-              <w:rPr>
-                <w:rFonts w:ascii="Menlo" w:hAnsi="Menlo" w:cs="Menlo"/>
-                <w:color w:val="3B3B3B"/>
-                <w:sz w:val="18"/>
-                <w:szCs w:val="18"/>
-              </w:rPr>
-              <w:t xml:space="preserve"> </w:t>
-            </w:r>
-            <w:r>
-              <w:rPr>
-                <w:rFonts w:ascii="Menlo" w:hAnsi="Menlo" w:cs="Menlo"/>
-                <w:color w:val="000000"/>
-                <w:sz w:val="18"/>
-                <w:szCs w:val="18"/>
-              </w:rPr>
-              <w:t>=</w:t>
-            </w:r>
-            <w:r>
-              <w:rPr>
-                <w:rFonts w:ascii="Menlo" w:hAnsi="Menlo" w:cs="Menlo"/>
-                <w:color w:val="3B3B3B"/>
-                <w:sz w:val="18"/>
-                <w:szCs w:val="18"/>
-              </w:rPr>
-              <w:t xml:space="preserve"> </w:t>
-            </w:r>
-            <w:r>
-              <w:rPr>
-                <w:rFonts w:ascii="Menlo" w:hAnsi="Menlo" w:cs="Menlo"/>
-                <w:color w:val="0000FF"/>
-                <w:sz w:val="18"/>
-                <w:szCs w:val="18"/>
-              </w:rPr>
-              <w:t>true</w:t>
-            </w:r>
-            <w:r>
-              <w:rPr>
-                <w:rFonts w:ascii="Menlo" w:hAnsi="Menlo" w:cs="Menlo"/>
-                <w:color w:val="3B3B3B"/>
-                <w:sz w:val="18"/>
-                <w:szCs w:val="18"/>
-              </w:rPr>
-              <w:t>;</w:t>
+              <w:t xml:space="preserve">        }</w:t>
             </w:r>
           </w:p>
           <w:p>
@@ -13321,7 +13117,61 @@
                 <w:sz w:val="18"/>
                 <w:szCs w:val="18"/>
               </w:rPr>
-              <w:t xml:space="preserve">        }</w:t>
+              <w:t xml:space="preserve">        </w:t>
+            </w:r>
+            <w:r>
+              <w:rPr>
+                <w:rFonts w:ascii="Menlo" w:hAnsi="Menlo" w:cs="Menlo"/>
+                <w:color w:val="001080"/>
+                <w:sz w:val="18"/>
+                <w:szCs w:val="18"/>
+              </w:rPr>
+              <w:t>released</w:t>
+            </w:r>
+            <w:r>
+              <w:rPr>
+                <w:rFonts w:ascii="Menlo" w:hAnsi="Menlo" w:cs="Menlo"/>
+                <w:color w:val="3B3B3B"/>
+                <w:sz w:val="18"/>
+                <w:szCs w:val="18"/>
+              </w:rPr>
+              <w:t xml:space="preserve"> </w:t>
+            </w:r>
+            <w:r>
+              <w:rPr>
+                <w:rFonts w:ascii="Menlo" w:hAnsi="Menlo" w:cs="Menlo"/>
+                <w:color w:val="000000"/>
+                <w:sz w:val="18"/>
+                <w:szCs w:val="18"/>
+              </w:rPr>
+              <w:t>=</w:t>
+            </w:r>
+            <w:r>
+              <w:rPr>
+                <w:rFonts w:ascii="Menlo" w:hAnsi="Menlo" w:cs="Menlo"/>
+                <w:color w:val="3B3B3B"/>
+                <w:sz w:val="18"/>
+                <w:szCs w:val="18"/>
+              </w:rPr>
+              <w:t xml:space="preserve"> </w:t>
+            </w:r>
+            <w:r>
+              <w:rPr>
+                <w:rFonts w:ascii="Menlo" w:hAnsi="Menlo" w:cs="Menlo"/>
+                <w:color w:val="0000FF"/>
+                <w:sz w:val="18"/>
+                <w:szCs w:val="18"/>
+              </w:rPr>
+              <w:t>false</w:t>
+            </w:r>
+            <w:r>
+              <w:rPr>
+                <w:rFonts w:ascii="Menlo" w:hAnsi="Menlo" w:cs="Menlo"/>
+                <w:color w:val="3B3B3B"/>
+                <w:sz w:val="18"/>
+                <w:szCs w:val="18"/>
+              </w:rPr>
+              <w:t>;</w:t>
             </w:r>
           </w:p>
           <w:p>
@@ -13343,16 +13193,16 @@
                 <w:sz w:val="18"/>
                 <w:szCs w:val="18"/>
               </w:rPr>
-              <w:t xml:space="preserve">        </w:t>
-            </w:r>
-            <w:r>
-              <w:rPr>
-                <w:rFonts w:ascii="Menlo" w:hAnsi="Menlo" w:cs="Menlo"/>
-                <w:color w:val="001080"/>
-                <w:sz w:val="18"/>
-                <w:szCs w:val="18"/>
-              </w:rPr>
-              <w:t>released</w:t>
+              <w:t xml:space="preserve">    } </w:t>
+            </w:r>
+            <w:r>
+              <w:rPr>
+                <w:rFonts w:ascii="Menlo" w:hAnsi="Menlo" w:cs="Menlo"/>
+                <w:color w:val="AF00DB"/>
+                <w:sz w:val="18"/>
+                <w:szCs w:val="18"/>
+              </w:rPr>
+              <w:t>else</w:t>
             </w:r>
             <w:r>
               <w:rPr>
@@ -13361,43 +13211,7 @@
                 <w:sz w:val="18"/>
                 <w:szCs w:val="18"/>
               </w:rPr>
-              <w:t xml:space="preserve"> </w:t>
-            </w:r>
-            <w:r>
-              <w:rPr>
-                <w:rFonts w:ascii="Menlo" w:hAnsi="Menlo" w:cs="Menlo"/>
-                <w:color w:val="000000"/>
-                <w:sz w:val="18"/>
-                <w:szCs w:val="18"/>
-              </w:rPr>
-              <w:t>=</w:t>
-            </w:r>
-            <w:r>
-              <w:rPr>
-                <w:rFonts w:ascii="Menlo" w:hAnsi="Menlo" w:cs="Menlo"/>
-                <w:color w:val="3B3B3B"/>
-                <w:sz w:val="18"/>
-                <w:szCs w:val="18"/>
-              </w:rPr>
-              <w:t xml:space="preserve"> </w:t>
-            </w:r>
-            <w:r>
-              <w:rPr>
-                <w:rFonts w:ascii="Menlo" w:hAnsi="Menlo" w:cs="Menlo"/>
-                <w:color w:val="0000FF"/>
-                <w:sz w:val="18"/>
-                <w:szCs w:val="18"/>
-              </w:rPr>
-              <w:t>false</w:t>
-            </w:r>
-            <w:r>
-              <w:rPr>
-                <w:rFonts w:ascii="Menlo" w:hAnsi="Menlo" w:cs="Menlo"/>
-                <w:color w:val="3B3B3B"/>
-                <w:sz w:val="18"/>
-                <w:szCs w:val="18"/>
-              </w:rPr>
-              <w:t>;</w:t>
+              <w:t xml:space="preserve"> {</w:t>
             </w:r>
           </w:p>
           <w:p>
@@ -13419,7 +13233,7 @@
                 <w:sz w:val="18"/>
                 <w:szCs w:val="18"/>
               </w:rPr>
-              <w:t xml:space="preserve">    } </w:t>
+              <w:t xml:space="preserve">        </w:t>
             </w:r>
             <w:r>
               <w:rPr>
@@ -13428,7 +13242,7 @@
                 <w:sz w:val="18"/>
                 <w:szCs w:val="18"/>
               </w:rPr>
-              <w:t>else</w:t>
+              <w:t>if</w:t>
             </w:r>
             <w:r>
               <w:rPr>
@@ -13437,7 +13251,34 @@
                 <w:sz w:val="18"/>
                 <w:szCs w:val="18"/>
               </w:rPr>
-              <w:t xml:space="preserve"> {</w:t>
+              <w:t xml:space="preserve"> (</w:t>
+            </w:r>
+            <w:r>
+              <w:rPr>
+                <w:rFonts w:ascii="Menlo" w:hAnsi="Menlo" w:cs="Menlo"/>
+                <w:color w:val="000000"/>
+                <w:sz w:val="18"/>
+                <w:szCs w:val="18"/>
+              </w:rPr>
+              <w:t>!</w:t>
+            </w:r>
+            <w:r>
+              <w:rPr>
+                <w:rFonts w:ascii="Menlo" w:hAnsi="Menlo" w:cs="Menlo"/>
+                <w:color w:val="001080"/>
+                <w:sz w:val="18"/>
+                <w:szCs w:val="18"/>
+              </w:rPr>
+              <w:t>released</w:t>
+            </w:r>
+            <w:r>
+              <w:rPr>
+                <w:rFonts w:ascii="Menlo" w:hAnsi="Menlo" w:cs="Menlo"/>
+                <w:color w:val="3B3B3B"/>
+                <w:sz w:val="18"/>
+                <w:szCs w:val="18"/>
+              </w:rPr>
+              <w:t>) {</w:t>
             </w:r>
           </w:p>
           <w:p>
@@ -13459,16 +13300,16 @@
                 <w:sz w:val="18"/>
                 <w:szCs w:val="18"/>
               </w:rPr>
-              <w:t xml:space="preserve">        </w:t>
-            </w:r>
-            <w:r>
-              <w:rPr>
-                <w:rFonts w:ascii="Menlo" w:hAnsi="Menlo" w:cs="Menlo"/>
-                <w:color w:val="AF00DB"/>
-                <w:sz w:val="18"/>
-                <w:szCs w:val="18"/>
-              </w:rPr>
-              <w:t>if</w:t>
+              <w:t xml:space="preserve">            </w:t>
+            </w:r>
+            <w:r>
+              <w:rPr>
+                <w:rFonts w:ascii="Menlo" w:hAnsi="Menlo" w:cs="Menlo"/>
+                <w:color w:val="001080"/>
+                <w:sz w:val="18"/>
+                <w:szCs w:val="18"/>
+              </w:rPr>
+              <w:t>Keyboard</w:t>
             </w:r>
             <w:r>
               <w:rPr>
@@ -13477,25 +13318,16 @@
                 <w:sz w:val="18"/>
                 <w:szCs w:val="18"/>
               </w:rPr>
-              <w:t xml:space="preserve"> (</w:t>
-            </w:r>
-            <w:r>
-              <w:rPr>
-                <w:rFonts w:ascii="Menlo" w:hAnsi="Menlo" w:cs="Menlo"/>
-                <w:color w:val="000000"/>
-                <w:sz w:val="18"/>
-                <w:szCs w:val="18"/>
-              </w:rPr>
-              <w:t>!</w:t>
-            </w:r>
-            <w:r>
-              <w:rPr>
-                <w:rFonts w:ascii="Menlo" w:hAnsi="Menlo" w:cs="Menlo"/>
-                <w:color w:val="001080"/>
-                <w:sz w:val="18"/>
-                <w:szCs w:val="18"/>
-              </w:rPr>
-              <w:t>released</w:t>
+              <w:t>.</w:t>
+            </w:r>
+            <w:r>
+              <w:rPr>
+                <w:rFonts w:ascii="Menlo" w:hAnsi="Menlo" w:cs="Menlo"/>
+                <w:color w:val="795E26"/>
+                <w:sz w:val="18"/>
+                <w:szCs w:val="18"/>
+              </w:rPr>
+              <w:t>releaseAll</w:t>
             </w:r>
             <w:r>
               <w:rPr>
@@ -13504,7 +13336,7 @@
                 <w:sz w:val="18"/>
                 <w:szCs w:val="18"/>
               </w:rPr>
-              <w:t>) {</w:t>
+              <w:t>();</w:t>
             </w:r>
           </w:p>
           <w:p>
@@ -13535,7 +13367,7 @@
                 <w:sz w:val="18"/>
                 <w:szCs w:val="18"/>
               </w:rPr>
-              <w:t>Keyboard</w:t>
+              <w:t>released</w:t>
             </w:r>
             <w:r>
               <w:rPr>
@@ -13544,16 +13376,16 @@
                 <w:sz w:val="18"/>
                 <w:szCs w:val="18"/>
               </w:rPr>
-              <w:t>.</w:t>
-            </w:r>
-            <w:r>
-              <w:rPr>
-                <w:rFonts w:ascii="Menlo" w:hAnsi="Menlo" w:cs="Menlo"/>
-                <w:color w:val="795E26"/>
-                <w:sz w:val="18"/>
-                <w:szCs w:val="18"/>
-              </w:rPr>
-              <w:t>releaseAll</w:t>
+              <w:t xml:space="preserve"> </w:t>
+            </w:r>
+            <w:r>
+              <w:rPr>
+                <w:rFonts w:ascii="Menlo" w:hAnsi="Menlo" w:cs="Menlo"/>
+                <w:color w:val="000000"/>
+                <w:sz w:val="18"/>
+                <w:szCs w:val="18"/>
+              </w:rPr>
+              <w:t>=</w:t>
             </w:r>
             <w:r>
               <w:rPr>
@@ -13562,7 +13394,25 @@
                 <w:sz w:val="18"/>
                 <w:szCs w:val="18"/>
               </w:rPr>
-              <w:t>();</w:t>
+              <w:t xml:space="preserve"> </w:t>
+            </w:r>
+            <w:r>
+              <w:rPr>
+                <w:rFonts w:ascii="Menlo" w:hAnsi="Menlo" w:cs="Menlo"/>
+                <w:color w:val="0000FF"/>
+                <w:sz w:val="18"/>
+                <w:szCs w:val="18"/>
+              </w:rPr>
+              <w:t>true</w:t>
+            </w:r>
+            <w:r>
+              <w:rPr>
+                <w:rFonts w:ascii="Menlo" w:hAnsi="Menlo" w:cs="Menlo"/>
+                <w:color w:val="3B3B3B"/>
+                <w:sz w:val="18"/>
+                <w:szCs w:val="18"/>
+              </w:rPr>
+              <w:t>;</w:t>
             </w:r>
           </w:p>
           <w:p>
@@ -13584,61 +13434,7 @@
                 <w:sz w:val="18"/>
                 <w:szCs w:val="18"/>
               </w:rPr>
-              <w:t xml:space="preserve">            </w:t>
-            </w:r>
-            <w:r>
-              <w:rPr>
-                <w:rFonts w:ascii="Menlo" w:hAnsi="Menlo" w:cs="Menlo"/>
-                <w:color w:val="001080"/>
-                <w:sz w:val="18"/>
-                <w:szCs w:val="18"/>
-              </w:rPr>
-              <w:t>released</w:t>
-            </w:r>
-            <w:r>
-              <w:rPr>
-                <w:rFonts w:ascii="Menlo" w:hAnsi="Menlo" w:cs="Menlo"/>
-                <w:color w:val="3B3B3B"/>
-                <w:sz w:val="18"/>
-                <w:szCs w:val="18"/>
-              </w:rPr>
-              <w:t xml:space="preserve"> </w:t>
-            </w:r>
-            <w:r>
-              <w:rPr>
-                <w:rFonts w:ascii="Menlo" w:hAnsi="Menlo" w:cs="Menlo"/>
-                <w:color w:val="000000"/>
-                <w:sz w:val="18"/>
-                <w:szCs w:val="18"/>
-              </w:rPr>
-              <w:t>=</w:t>
-            </w:r>
-            <w:r>
-              <w:rPr>
-                <w:rFonts w:ascii="Menlo" w:hAnsi="Menlo" w:cs="Menlo"/>
-                <w:color w:val="3B3B3B"/>
-                <w:sz w:val="18"/>
-                <w:szCs w:val="18"/>
-              </w:rPr>
-              <w:t xml:space="preserve"> </w:t>
-            </w:r>
-            <w:r>
-              <w:rPr>
-                <w:rFonts w:ascii="Menlo" w:hAnsi="Menlo" w:cs="Menlo"/>
-                <w:color w:val="0000FF"/>
-                <w:sz w:val="18"/>
-                <w:szCs w:val="18"/>
-              </w:rPr>
-              <w:t>true</w:t>
-            </w:r>
-            <w:r>
-              <w:rPr>
-                <w:rFonts w:ascii="Menlo" w:hAnsi="Menlo" w:cs="Menlo"/>
-                <w:color w:val="3B3B3B"/>
-                <w:sz w:val="18"/>
-                <w:szCs w:val="18"/>
-              </w:rPr>
-              <w:t>;</w:t>
+              <w:t xml:space="preserve">        }</w:t>
             </w:r>
           </w:p>
           <w:p>
@@ -13660,7 +13456,97 @@
                 <w:sz w:val="18"/>
                 <w:szCs w:val="18"/>
               </w:rPr>
-              <w:t xml:space="preserve">        }</w:t>
+              <w:t xml:space="preserve">        </w:t>
+            </w:r>
+            <w:r>
+              <w:rPr>
+                <w:rFonts w:ascii="Menlo" w:hAnsi="Menlo" w:cs="Menlo"/>
+                <w:color w:val="AF00DB"/>
+                <w:sz w:val="18"/>
+                <w:szCs w:val="18"/>
+              </w:rPr>
+              <w:t>if</w:t>
+            </w:r>
+            <w:r>
+              <w:rPr>
+                <w:rFonts w:ascii="Menlo" w:hAnsi="Menlo" w:cs="Menlo"/>
+                <w:color w:val="3B3B3B"/>
+                <w:sz w:val="18"/>
+                <w:szCs w:val="18"/>
+              </w:rPr>
+              <w:t xml:space="preserve"> (</w:t>
+            </w:r>
+            <w:r>
+              <w:rPr>
+                <w:rFonts w:ascii="Menlo" w:hAnsi="Menlo" w:cs="Menlo"/>
+                <w:color w:val="001080"/>
+                <w:sz w:val="18"/>
+                <w:szCs w:val="18"/>
+              </w:rPr>
+              <w:t>left</w:t>
+            </w:r>
+            <w:r>
+              <w:rPr>
+                <w:rFonts w:ascii="Menlo" w:hAnsi="Menlo" w:cs="Menlo"/>
+                <w:color w:val="3B3B3B"/>
+                <w:sz w:val="18"/>
+                <w:szCs w:val="18"/>
+              </w:rPr>
+              <w:t xml:space="preserve">) </w:t>
+            </w:r>
+            <w:r>
+              <w:rPr>
+                <w:rFonts w:ascii="Menlo" w:hAnsi="Menlo" w:cs="Menlo"/>
+                <w:color w:val="001080"/>
+                <w:sz w:val="18"/>
+                <w:szCs w:val="18"/>
+              </w:rPr>
+              <w:t>left_pressed</w:t>
+            </w:r>
+            <w:r>
+              <w:rPr>
+                <w:rFonts w:ascii="Menlo" w:hAnsi="Menlo" w:cs="Menlo"/>
+                <w:color w:val="3B3B3B"/>
+                <w:sz w:val="18"/>
+                <w:szCs w:val="18"/>
+              </w:rPr>
+              <w:t xml:space="preserve"> </w:t>
+            </w:r>
+            <w:r>
+              <w:rPr>
+                <w:rFonts w:ascii="Menlo" w:hAnsi="Menlo" w:cs="Menlo"/>
+                <w:color w:val="000000"/>
+                <w:sz w:val="18"/>
+                <w:szCs w:val="18"/>
+              </w:rPr>
+              <w:t>=</w:t>
+            </w:r>
+            <w:r>
+              <w:rPr>
+                <w:rFonts w:ascii="Menlo" w:hAnsi="Menlo" w:cs="Menlo"/>
+                <w:color w:val="3B3B3B"/>
+                <w:sz w:val="18"/>
+                <w:szCs w:val="18"/>
+              </w:rPr>
+              <w:t xml:space="preserve"> </w:t>
+            </w:r>
+            <w:r>
+              <w:rPr>
+                <w:rFonts w:ascii="Menlo" w:hAnsi="Menlo" w:cs="Menlo"/>
+                <w:color w:val="0000FF"/>
+                <w:sz w:val="18"/>
+                <w:szCs w:val="18"/>
+              </w:rPr>
+              <w:t>false</w:t>
+            </w:r>
+            <w:r>
+              <w:rPr>
+                <w:rFonts w:ascii="Menlo" w:hAnsi="Menlo" w:cs="Menlo"/>
+                <w:color w:val="3B3B3B"/>
+                <w:sz w:val="18"/>
+                <w:szCs w:val="18"/>
+              </w:rPr>
+              <w:t>;</w:t>
             </w:r>
           </w:p>
           <w:p>
@@ -13709,7 +13595,7 @@
                 <w:sz w:val="18"/>
                 <w:szCs w:val="18"/>
               </w:rPr>
-              <w:t>left</w:t>
+              <w:t>right</w:t>
             </w:r>
             <w:r>
               <w:rPr>
@@ -13727,7 +13613,7 @@
                 <w:sz w:val="18"/>
                 <w:szCs w:val="18"/>
               </w:rPr>
-              <w:t>left_pressed</w:t>
+              <w:t>right_pressed</w:t>
             </w:r>
             <w:r>
               <w:rPr>
@@ -13794,97 +13680,7 @@
                 <w:sz w:val="18"/>
                 <w:szCs w:val="18"/>
               </w:rPr>
-              <w:t xml:space="preserve">        </w:t>
-            </w:r>
-            <w:r>
-              <w:rPr>
-                <w:rFonts w:ascii="Menlo" w:hAnsi="Menlo" w:cs="Menlo"/>
-                <w:color w:val="AF00DB"/>
-                <w:sz w:val="18"/>
-                <w:szCs w:val="18"/>
-              </w:rPr>
-              <w:t>if</w:t>
-            </w:r>
-            <w:r>
-              <w:rPr>
-                <w:rFonts w:ascii="Menlo" w:hAnsi="Menlo" w:cs="Menlo"/>
-                <w:color w:val="3B3B3B"/>
-                <w:sz w:val="18"/>
-                <w:szCs w:val="18"/>
-              </w:rPr>
-              <w:t xml:space="preserve"> (</w:t>
-            </w:r>
-            <w:r>
-              <w:rPr>
-                <w:rFonts w:ascii="Menlo" w:hAnsi="Menlo" w:cs="Menlo"/>
-                <w:color w:val="001080"/>
-                <w:sz w:val="18"/>
-                <w:szCs w:val="18"/>
-              </w:rPr>
-              <w:t>right</w:t>
-            </w:r>
-            <w:r>
-              <w:rPr>
-                <w:rFonts w:ascii="Menlo" w:hAnsi="Menlo" w:cs="Menlo"/>
-                <w:color w:val="3B3B3B"/>
-                <w:sz w:val="18"/>
-                <w:szCs w:val="18"/>
-              </w:rPr>
-              <w:t xml:space="preserve">) </w:t>
-            </w:r>
-            <w:r>
-              <w:rPr>
-                <w:rFonts w:ascii="Menlo" w:hAnsi="Menlo" w:cs="Menlo"/>
-                <w:color w:val="001080"/>
-                <w:sz w:val="18"/>
-                <w:szCs w:val="18"/>
-              </w:rPr>
-              <w:t>right_pressed</w:t>
-            </w:r>
-            <w:r>
-              <w:rPr>
-                <w:rFonts w:ascii="Menlo" w:hAnsi="Menlo" w:cs="Menlo"/>
-                <w:color w:val="3B3B3B"/>
-                <w:sz w:val="18"/>
-                <w:szCs w:val="18"/>
-              </w:rPr>
-              <w:t xml:space="preserve"> </w:t>
-            </w:r>
-            <w:r>
-              <w:rPr>
-                <w:rFonts w:ascii="Menlo" w:hAnsi="Menlo" w:cs="Menlo"/>
-                <w:color w:val="000000"/>
-                <w:sz w:val="18"/>
-                <w:szCs w:val="18"/>
-              </w:rPr>
-              <w:t>=</w:t>
-            </w:r>
-            <w:r>
-              <w:rPr>
-                <w:rFonts w:ascii="Menlo" w:hAnsi="Menlo" w:cs="Menlo"/>
-                <w:color w:val="3B3B3B"/>
-                <w:sz w:val="18"/>
-                <w:szCs w:val="18"/>
-              </w:rPr>
-              <w:t xml:space="preserve"> </w:t>
-            </w:r>
-            <w:r>
-              <w:rPr>
-                <w:rFonts w:ascii="Menlo" w:hAnsi="Menlo" w:cs="Menlo"/>
-                <w:color w:val="0000FF"/>
-                <w:sz w:val="18"/>
-                <w:szCs w:val="18"/>
-              </w:rPr>
-              <w:t>false</w:t>
-            </w:r>
-            <w:r>
-              <w:rPr>
-                <w:rFonts w:ascii="Menlo" w:hAnsi="Menlo" w:cs="Menlo"/>
-                <w:color w:val="3B3B3B"/>
-                <w:sz w:val="18"/>
-                <w:szCs w:val="18"/>
-              </w:rPr>
-              <w:t>;</w:t>
+              <w:t xml:space="preserve">    }</w:t>
             </w:r>
           </w:p>
           <w:p>
@@ -13897,28 +13693,6 @@
                 <w:color w:val="3B3B3B"/>
                 <w:sz w:val="18"/>
                 <w:szCs w:val="18"/>
-              </w:rPr>
-            </w:pPr>
-            <w:r>
-              <w:rPr>
-                <w:rFonts w:ascii="Menlo" w:hAnsi="Menlo" w:cs="Menlo"/>
-                <w:color w:val="3B3B3B"/>
-                <w:sz w:val="18"/>
-                <w:szCs w:val="18"/>
-              </w:rPr>
-              <w:t xml:space="preserve">    }</w:t>
-            </w:r>
-          </w:p>
-          <w:p>
-            <w:pPr>
-              <w:shd w:val="clear" w:color="auto" w:fill="FFFFFF"/>
-              <w:spacing w:line="270" w:lineRule="atLeast"/>
-              <w:ind w:firstLine="0"/>
-              <w:rPr>
-                <w:rFonts w:ascii="Menlo" w:hAnsi="Menlo" w:cs="Menlo"/>
-                <w:color w:val="3B3B3B"/>
-                <w:sz w:val="18"/>
-                <w:szCs w:val="18"/>
                 <w:lang w:val="ru-RU"/>
               </w:rPr>
             </w:pPr>
@@ -14055,7 +13829,7 @@
           <w:lang w:val="ru-RU"/>
         </w:rPr>
       </w:pPr>
-      <w:bookmarkStart w:id="11" w:name="_Toc225692801"/>
+      <w:bookmarkStart w:id="10" w:name="_Toc226019991"/>
       <w:r>
         <w:rPr>
           <w:lang w:val="ru-RU"/>
@@ -14068,7 +13842,7 @@
         </w:rPr>
         <w:t>Тестирование работы изделия</w:t>
       </w:r>
-      <w:bookmarkEnd w:id="11"/>
+      <w:bookmarkEnd w:id="10"/>
     </w:p>
     <w:p>
       <w:r>
@@ -14456,6 +14230,15 @@
         </w:tc>
       </w:tr>
     </w:tbl>
+    <w:p>
+      <w:pPr>
+        <w:ind w:left="426"/>
+        <w:rPr>
+          <w:szCs w:val="28"/>
+          <w:lang w:val="ru-RU"/>
+        </w:rPr>
+      </w:pPr>
+    </w:p>
     <w:p>
       <w:pPr>
         <w:ind w:left="426"/>
@@ -20119,7 +19902,7 @@
           <w:lang w:val="ru-RU"/>
         </w:rPr>
       </w:pPr>
-      <w:bookmarkStart w:id="12" w:name="_Toc225692802"/>
+      <w:bookmarkStart w:id="11" w:name="_Toc226019992"/>
       <w:r>
         <w:rPr>
           <w:lang w:val="ru-RU"/>
@@ -20127,7 +19910,7 @@
         <w:lastRenderedPageBreak/>
         <w:t>Заключение</w:t>
       </w:r>
-      <w:bookmarkEnd w:id="12"/>
+      <w:bookmarkEnd w:id="11"/>
     </w:p>
     <w:p>
       <w:pPr>
@@ -20242,7 +20025,7 @@
           <w:lang w:val="en-US"/>
         </w:rPr>
       </w:pPr>
-      <w:bookmarkStart w:id="13" w:name="_Toc225692803"/>
+      <w:bookmarkStart w:id="12" w:name="_Toc226019993"/>
       <w:r>
         <w:rPr>
           <w:lang w:val="ru-RU"/>
@@ -20250,7 +20033,7 @@
         <w:lastRenderedPageBreak/>
         <w:t>Список литературы</w:t>
       </w:r>
-      <w:bookmarkEnd w:id="13"/>
+      <w:bookmarkEnd w:id="12"/>
     </w:p>
     <w:p>
       <w:pPr>
@@ -20262,6 +20045,7 @@
         </w:numPr>
         <w:autoSpaceDE w:val="0"/>
         <w:autoSpaceDN w:val="0"/>
+        <w:ind w:left="851"/>
         <w:rPr>
           <w:szCs w:val="28"/>
         </w:rPr>
@@ -20283,6 +20067,7 @@
         </w:numPr>
         <w:autoSpaceDE w:val="0"/>
         <w:autoSpaceDN w:val="0"/>
+        <w:ind w:left="851"/>
         <w:rPr>
           <w:szCs w:val="28"/>
         </w:rPr>
@@ -20311,6 +20096,7 @@
         </w:numPr>
         <w:autoSpaceDE w:val="0"/>
         <w:autoSpaceDN w:val="0"/>
+        <w:ind w:left="851"/>
         <w:rPr>
           <w:szCs w:val="28"/>
         </w:rPr>
@@ -20402,6 +20188,7 @@
         </w:numPr>
         <w:autoSpaceDE w:val="0"/>
         <w:autoSpaceDN w:val="0"/>
+        <w:ind w:left="851"/>
         <w:rPr>
           <w:szCs w:val="28"/>
         </w:rPr>
@@ -20499,6 +20286,7 @@
         </w:numPr>
         <w:autoSpaceDE w:val="0"/>
         <w:autoSpaceDN w:val="0"/>
+        <w:ind w:left="851"/>
         <w:rPr>
           <w:szCs w:val="28"/>
         </w:rPr>
@@ -20585,6 +20373,7 @@
         </w:numPr>
         <w:autoSpaceDE w:val="0"/>
         <w:autoSpaceDN w:val="0"/>
+        <w:ind w:left="851"/>
         <w:rPr>
           <w:szCs w:val="28"/>
         </w:rPr>
@@ -20656,6 +20445,7 @@
           <w:ilvl w:val="0"/>
           <w:numId w:val="8"/>
         </w:numPr>
+        <w:ind w:left="851"/>
       </w:pPr>
       <w:r>
         <w:t>Микроконтроллер</w:t>
@@ -20699,6 +20489,7 @@
           <w:ilvl w:val="0"/>
           <w:numId w:val="8"/>
         </w:numPr>
+        <w:ind w:left="851"/>
       </w:pPr>
       <w:r>
         <w:t>Переключатели клавиатуры: Введение</w:t>
@@ -20741,25 +20532,13 @@
         <w:rPr>
           <w:lang w:val="ru-RU"/>
         </w:rPr>
-        <w:t xml:space="preserve">. </w:t>
-      </w:r>
-      <w:r>
-        <w:rPr>
-          <w:lang w:val="ru-RU"/>
-        </w:rPr>
-        <w:t xml:space="preserve">Дата обращения: </w:t>
-      </w:r>
-      <w:r>
-        <w:rPr>
-          <w:lang w:val="ru-RU"/>
-        </w:rPr>
-        <w:t>24.03.2026</w:t>
-      </w:r>
-      <w:r>
-        <w:rPr>
-          <w:lang w:val="ru-RU"/>
-        </w:rPr>
-        <w:t>.</w:t>
+        <w:t xml:space="preserve">. Дата обращения: </w:t>
+      </w:r>
+      <w:r>
+        <w:rPr>
+          <w:lang w:val="ru-RU"/>
+        </w:rPr>
+        <w:t>24.03.2026.</w:t>
       </w:r>
     </w:p>
     <w:p>
@@ -20769,6 +20548,7 @@
           <w:ilvl w:val="0"/>
           <w:numId w:val="8"/>
         </w:numPr>
+        <w:ind w:left="851"/>
       </w:pPr>
       <w:r>
         <w:t>Monochrome 1.3" 128x64 OLED graphic display</w:t>
@@ -20841,13 +20621,7 @@
         <w:rPr>
           <w:lang w:val="en-US"/>
         </w:rPr>
-        <w:t>24.03.2026</w:t>
-      </w:r>
-      <w:r>
-        <w:rPr>
-          <w:lang w:val="en-US"/>
-        </w:rPr>
-        <w:t>.</w:t>
+        <w:t>24.03.2026.</w:t>
       </w:r>
     </w:p>
     <w:p>
@@ -20857,6 +20631,7 @@
           <w:ilvl w:val="0"/>
           <w:numId w:val="8"/>
         </w:numPr>
+        <w:ind w:left="851"/>
       </w:pPr>
       <w:r>
         <w:t>Разъем USB Type-C: что это такое, как выглядит и как выбрать кабель</w:t>
@@ -20890,17 +20665,7 @@
         <w:t xml:space="preserve">[электр.ресурс] </w:t>
       </w:r>
       <w:r>
-        <w:t>https://www.mvideo.ru/blog/pomogaem-</w:t>
-      </w:r>
-      <w:r>
-        <w:lastRenderedPageBreak/>
-        <w:t>razobratsya/razem-usb-type-c-chto-eto-takoe-ka</w:t>
-      </w:r>
-      <w:r>
-        <w:t>k</w:t>
-      </w:r>
-      <w:r>
-        <w:t>-vyglyadit-i-kak-vybrat-kabel</w:t>
+        <w:t>https://www.mvideo.ru/blog/pomogaem-razobratsya/razem-usb-type-c-chto-eto-takoe-kak-vyglyadit-i-kak-vybrat-kabel</w:t>
       </w:r>
       <w:r>
         <w:t>/</w:t>
@@ -20909,25 +20674,13 @@
         <w:rPr>
           <w:lang w:val="ru-RU"/>
         </w:rPr>
-        <w:t xml:space="preserve">. </w:t>
-      </w:r>
-      <w:r>
-        <w:rPr>
-          <w:lang w:val="ru-RU"/>
-        </w:rPr>
-        <w:t xml:space="preserve">Дата обращения: </w:t>
-      </w:r>
-      <w:r>
-        <w:rPr>
-          <w:lang w:val="ru-RU"/>
-        </w:rPr>
-        <w:t>24.03.2026</w:t>
-      </w:r>
-      <w:r>
-        <w:rPr>
-          <w:lang w:val="ru-RU"/>
-        </w:rPr>
-        <w:t>.</w:t>
+        <w:t xml:space="preserve">. Дата обращения: </w:t>
+      </w:r>
+      <w:r>
+        <w:rPr>
+          <w:lang w:val="ru-RU"/>
+        </w:rPr>
+        <w:t>24.03.2026.</w:t>
       </w:r>
     </w:p>
     <w:p>
@@ -20937,8 +20690,10 @@
           <w:ilvl w:val="0"/>
           <w:numId w:val="8"/>
         </w:numPr>
-      </w:pPr>
-      <w:r>
+        <w:ind w:left="851"/>
+      </w:pPr>
+      <w:r>
+        <w:lastRenderedPageBreak/>
         <w:t>Подробно про клавиатуры: от корпуса до клавиш</w:t>
       </w:r>
       <w:r>
@@ -21000,6 +20755,7 @@
           <w:ilvl w:val="0"/>
           <w:numId w:val="8"/>
         </w:numPr>
+        <w:ind w:left="851"/>
       </w:pPr>
       <w:r>
         <w:t>Размеры и форматы клавиатур (ANSI, ISO)</w:t>
@@ -21086,7 +20842,7 @@
           <w:lang w:val="ru-RU"/>
         </w:rPr>
       </w:pPr>
-      <w:bookmarkStart w:id="14" w:name="_Toc225692804"/>
+      <w:bookmarkStart w:id="13" w:name="_Toc226019994"/>
       <w:r>
         <w:rPr>
           <w:lang w:val="ru-RU"/>
@@ -21094,7 +20850,7 @@
         <w:lastRenderedPageBreak/>
         <w:t>Приложение 1</w:t>
       </w:r>
-      <w:bookmarkEnd w:id="14"/>
+      <w:bookmarkEnd w:id="13"/>
     </w:p>
     <w:p>
       <w:pPr>
@@ -22130,6 +21886,7 @@
     <w:p>
       <w:pPr>
         <w:spacing w:line="480" w:lineRule="auto"/>
+        <w:ind w:firstLine="0"/>
         <w:rPr>
           <w:szCs w:val="28"/>
         </w:rPr>
@@ -22255,6 +22012,7 @@
     <w:p>
       <w:pPr>
         <w:spacing w:line="480" w:lineRule="auto"/>
+        <w:ind w:firstLine="0"/>
         <w:rPr>
           <w:szCs w:val="28"/>
         </w:rPr>
@@ -22357,6 +22115,7 @@
     <w:p>
       <w:pPr>
         <w:spacing w:line="480" w:lineRule="auto"/>
+        <w:ind w:firstLine="0"/>
         <w:rPr>
           <w:szCs w:val="28"/>
         </w:rPr>
@@ -22388,21 +22147,23 @@
     </w:p>
     <w:p>
       <w:pPr>
-        <w:pStyle w:val="a7"/>
         <w:widowControl w:val="0"/>
-        <w:numPr>
-          <w:ilvl w:val="1"/>
-          <w:numId w:val="9"/>
-        </w:numPr>
         <w:autoSpaceDE w:val="0"/>
         <w:autoSpaceDN w:val="0"/>
         <w:spacing w:line="480" w:lineRule="auto"/>
-        <w:ind w:hanging="654"/>
+        <w:ind w:firstLine="0"/>
         <w:jc w:val="left"/>
         <w:rPr>
           <w:szCs w:val="28"/>
         </w:rPr>
       </w:pPr>
+      <w:r>
+        <w:rPr>
+          <w:szCs w:val="28"/>
+          <w:lang w:val="ru-RU"/>
+        </w:rPr>
+        <w:t xml:space="preserve">3.1. </w:t>
+      </w:r>
       <w:r>
         <w:rPr>
           <w:szCs w:val="28"/>
@@ -22617,25 +22378,27 @@
     </w:p>
     <w:p>
       <w:pPr>
-        <w:pStyle w:val="a7"/>
         <w:widowControl w:val="0"/>
-        <w:numPr>
-          <w:ilvl w:val="1"/>
-          <w:numId w:val="9"/>
-        </w:numPr>
         <w:autoSpaceDE w:val="0"/>
         <w:autoSpaceDN w:val="0"/>
         <w:spacing w:line="480" w:lineRule="auto"/>
-        <w:ind w:hanging="654"/>
-        <w:rPr>
-          <w:szCs w:val="28"/>
-        </w:rPr>
-      </w:pPr>
-      <w:r>
-        <w:rPr>
-          <w:szCs w:val="28"/>
+        <w:ind w:firstLine="0"/>
+        <w:rPr>
+          <w:szCs w:val="28"/>
+        </w:rPr>
+      </w:pPr>
+      <w:r>
+        <w:rPr>
+          <w:szCs w:val="28"/>
+          <w:lang w:val="ru-RU"/>
         </w:rPr>
         <w:lastRenderedPageBreak/>
+        <w:t xml:space="preserve">3.2. </w:t>
+      </w:r>
+      <w:r>
+        <w:rPr>
+          <w:szCs w:val="28"/>
+        </w:rPr>
         <w:t>Требования к надежности</w:t>
       </w:r>
     </w:p>
@@ -22670,21 +22433,24 @@
     </w:p>
     <w:p>
       <w:pPr>
-        <w:pStyle w:val="a7"/>
         <w:widowControl w:val="0"/>
-        <w:numPr>
-          <w:ilvl w:val="1"/>
-          <w:numId w:val="9"/>
-        </w:numPr>
         <w:autoSpaceDE w:val="0"/>
         <w:autoSpaceDN w:val="0"/>
         <w:spacing w:line="480" w:lineRule="auto"/>
-        <w:ind w:hanging="654"/>
+        <w:ind w:firstLine="0"/>
         <w:jc w:val="left"/>
         <w:rPr>
           <w:szCs w:val="28"/>
         </w:rPr>
       </w:pPr>
+      <w:r>
+        <w:rPr>
+          <w:color w:val="000000" w:themeColor="text1"/>
+          <w:szCs w:val="28"/>
+          <w:lang w:val="ru-RU"/>
+        </w:rPr>
+        <w:t xml:space="preserve">3.3. </w:t>
+      </w:r>
       <w:r>
         <w:rPr>
           <w:color w:val="000000" w:themeColor="text1"/>
@@ -22889,21 +22655,24 @@
     </w:p>
     <w:p>
       <w:pPr>
-        <w:pStyle w:val="a7"/>
         <w:widowControl w:val="0"/>
-        <w:numPr>
-          <w:ilvl w:val="1"/>
-          <w:numId w:val="9"/>
-        </w:numPr>
         <w:autoSpaceDE w:val="0"/>
         <w:autoSpaceDN w:val="0"/>
         <w:spacing w:line="480" w:lineRule="auto"/>
-        <w:ind w:hanging="654"/>
+        <w:ind w:firstLine="0"/>
         <w:jc w:val="left"/>
         <w:rPr>
           <w:szCs w:val="28"/>
         </w:rPr>
       </w:pPr>
+      <w:r>
+        <w:rPr>
+          <w:color w:val="000000" w:themeColor="text1"/>
+          <w:szCs w:val="28"/>
+          <w:lang w:val="ru-RU"/>
+        </w:rPr>
+        <w:t xml:space="preserve">3.4. </w:t>
+      </w:r>
       <w:r>
         <w:rPr>
           <w:color w:val="000000" w:themeColor="text1"/>
@@ -23178,17 +22947,20 @@
     </w:p>
     <w:p>
       <w:pPr>
-        <w:pStyle w:val="a7"/>
-        <w:numPr>
-          <w:ilvl w:val="1"/>
-          <w:numId w:val="9"/>
-        </w:numPr>
         <w:spacing w:line="480" w:lineRule="auto"/>
-        <w:ind w:hanging="654"/>
-        <w:rPr>
-          <w:szCs w:val="28"/>
-        </w:rPr>
-      </w:pPr>
+        <w:ind w:firstLine="0"/>
+        <w:rPr>
+          <w:szCs w:val="28"/>
+        </w:rPr>
+      </w:pPr>
+      <w:r>
+        <w:rPr>
+          <w:color w:val="000000" w:themeColor="text1"/>
+          <w:szCs w:val="28"/>
+          <w:lang w:val="ru-RU"/>
+        </w:rPr>
+        <w:t xml:space="preserve">3.5. </w:t>
+      </w:r>
       <w:r>
         <w:rPr>
           <w:color w:val="000000" w:themeColor="text1"/>
@@ -23496,18 +23268,21 @@
     </w:p>
     <w:p>
       <w:pPr>
-        <w:pStyle w:val="a7"/>
-        <w:numPr>
-          <w:ilvl w:val="1"/>
-          <w:numId w:val="9"/>
-        </w:numPr>
         <w:spacing w:line="480" w:lineRule="auto"/>
-        <w:ind w:hanging="654"/>
+        <w:ind w:firstLine="0"/>
         <w:jc w:val="left"/>
         <w:rPr>
           <w:szCs w:val="28"/>
         </w:rPr>
       </w:pPr>
+      <w:r>
+        <w:rPr>
+          <w:color w:val="000000" w:themeColor="text1"/>
+          <w:szCs w:val="28"/>
+          <w:lang w:val="ru-RU"/>
+        </w:rPr>
+        <w:t xml:space="preserve">3.6. </w:t>
+      </w:r>
       <w:r>
         <w:rPr>
           <w:color w:val="000000" w:themeColor="text1"/>
@@ -23622,18 +23397,21 @@
     </w:p>
     <w:p>
       <w:pPr>
-        <w:pStyle w:val="a7"/>
-        <w:numPr>
-          <w:ilvl w:val="1"/>
-          <w:numId w:val="9"/>
-        </w:numPr>
         <w:spacing w:line="480" w:lineRule="auto"/>
-        <w:ind w:hanging="654"/>
+        <w:ind w:firstLine="0"/>
         <w:jc w:val="left"/>
         <w:rPr>
           <w:szCs w:val="28"/>
         </w:rPr>
       </w:pPr>
+      <w:r>
+        <w:rPr>
+          <w:color w:val="000000" w:themeColor="text1"/>
+          <w:szCs w:val="28"/>
+          <w:lang w:val="ru-RU"/>
+        </w:rPr>
+        <w:t xml:space="preserve">3.7. </w:t>
+      </w:r>
       <w:r>
         <w:rPr>
           <w:color w:val="000000" w:themeColor="text1"/>
@@ -23783,21 +23561,23 @@
     </w:p>
     <w:p>
       <w:pPr>
-        <w:pStyle w:val="a7"/>
         <w:widowControl w:val="0"/>
-        <w:numPr>
-          <w:ilvl w:val="1"/>
-          <w:numId w:val="9"/>
-        </w:numPr>
         <w:autoSpaceDE w:val="0"/>
         <w:autoSpaceDN w:val="0"/>
         <w:spacing w:line="480" w:lineRule="auto"/>
-        <w:ind w:hanging="654"/>
+        <w:ind w:firstLine="0"/>
         <w:jc w:val="left"/>
         <w:rPr>
           <w:szCs w:val="28"/>
         </w:rPr>
       </w:pPr>
+      <w:r>
+        <w:rPr>
+          <w:szCs w:val="28"/>
+          <w:lang w:val="ru-RU"/>
+        </w:rPr>
+        <w:t xml:space="preserve">3.8. </w:t>
+      </w:r>
       <w:r>
         <w:rPr>
           <w:szCs w:val="28"/>
@@ -23823,10 +23603,11 @@
     <w:p>
       <w:pPr>
         <w:spacing w:line="480" w:lineRule="auto"/>
-      </w:pPr>
-      <w:bookmarkStart w:id="15" w:name="_Toc43137758"/>
-      <w:bookmarkStart w:id="16" w:name="_Toc43137944"/>
-      <w:bookmarkStart w:id="17" w:name="_Toc43207989"/>
+        <w:ind w:firstLine="0"/>
+      </w:pPr>
+      <w:bookmarkStart w:id="14" w:name="_Toc43137758"/>
+      <w:bookmarkStart w:id="15" w:name="_Toc43137944"/>
+      <w:bookmarkStart w:id="16" w:name="_Toc43207989"/>
       <w:r>
         <w:t>4.</w:t>
       </w:r>
@@ -23842,24 +23623,27 @@
       <w:r>
         <w:t xml:space="preserve"> к программной документации</w:t>
       </w:r>
+      <w:bookmarkEnd w:id="14"/>
       <w:bookmarkEnd w:id="15"/>
       <w:bookmarkEnd w:id="16"/>
-      <w:bookmarkEnd w:id="17"/>
-    </w:p>
-    <w:p>
-      <w:pPr>
-        <w:pStyle w:val="a7"/>
+    </w:p>
+    <w:p>
+      <w:pPr>
         <w:widowControl w:val="0"/>
-        <w:numPr>
-          <w:ilvl w:val="1"/>
-          <w:numId w:val="11"/>
-        </w:numPr>
         <w:autoSpaceDE w:val="0"/>
         <w:autoSpaceDN w:val="0"/>
         <w:spacing w:line="480" w:lineRule="auto"/>
-        <w:ind w:left="1077" w:hanging="652"/>
+        <w:ind w:firstLine="0"/>
         <w:jc w:val="left"/>
       </w:pPr>
+      <w:r>
+        <w:rPr>
+          <w:color w:val="000000" w:themeColor="text1"/>
+          <w:szCs w:val="28"/>
+          <w:lang w:val="ru-RU"/>
+        </w:rPr>
+        <w:t xml:space="preserve">4.1. </w:t>
+      </w:r>
       <w:r>
         <w:rPr>
           <w:color w:val="000000" w:themeColor="text1"/>
@@ -24361,21 +24145,24 @@
     </w:p>
     <w:p>
       <w:pPr>
-        <w:pStyle w:val="a7"/>
         <w:widowControl w:val="0"/>
-        <w:numPr>
-          <w:ilvl w:val="1"/>
-          <w:numId w:val="11"/>
-        </w:numPr>
         <w:autoSpaceDE w:val="0"/>
         <w:autoSpaceDN w:val="0"/>
         <w:spacing w:line="480" w:lineRule="auto"/>
-        <w:ind w:left="993" w:hanging="567"/>
+        <w:ind w:firstLine="0"/>
         <w:rPr>
           <w:color w:val="000000"/>
           <w:szCs w:val="28"/>
         </w:rPr>
       </w:pPr>
+      <w:r>
+        <w:rPr>
+          <w:color w:val="000000" w:themeColor="text1"/>
+          <w:szCs w:val="28"/>
+          <w:lang w:val="ru-RU"/>
+        </w:rPr>
+        <w:t xml:space="preserve">4.2. </w:t>
+      </w:r>
       <w:r>
         <w:rPr>
           <w:color w:val="000000" w:themeColor="text1"/>
@@ -24544,6 +24331,7 @@
     <w:p>
       <w:pPr>
         <w:spacing w:line="480" w:lineRule="auto"/>
+        <w:ind w:firstLine="0"/>
         <w:rPr>
           <w:szCs w:val="28"/>
         </w:rPr>
@@ -24590,6 +24378,7 @@
     <w:p>
       <w:pPr>
         <w:spacing w:line="480" w:lineRule="auto"/>
+        <w:ind w:firstLine="0"/>
         <w:rPr>
           <w:szCs w:val="28"/>
         </w:rPr>
@@ -26623,7 +26412,7 @@
           <w:lang w:val="ru-RU"/>
         </w:rPr>
       </w:pPr>
-      <w:bookmarkStart w:id="18" w:name="_Toc225692805"/>
+      <w:bookmarkStart w:id="17" w:name="_Toc226019995"/>
       <w:r>
         <w:rPr>
           <w:lang w:val="ru-RU"/>
@@ -26631,7 +26420,7 @@
         <w:lastRenderedPageBreak/>
         <w:t>Приложение 2.</w:t>
       </w:r>
-      <w:bookmarkEnd w:id="18"/>
+      <w:bookmarkEnd w:id="17"/>
     </w:p>
     <w:p>
       <w:pPr>
@@ -30480,7 +30269,7 @@
           <w:lang w:val="ru-RU"/>
         </w:rPr>
       </w:pPr>
-      <w:bookmarkStart w:id="19" w:name="_Toc225692806"/>
+      <w:bookmarkStart w:id="18" w:name="_Toc226019996"/>
       <w:r>
         <w:rPr>
           <w:lang w:val="ru-RU"/>
@@ -30488,7 +30277,7 @@
         <w:lastRenderedPageBreak/>
         <w:t>Приложение 3.</w:t>
       </w:r>
-      <w:bookmarkEnd w:id="19"/>
+      <w:bookmarkEnd w:id="18"/>
     </w:p>
     <w:p>
       <w:pPr>
@@ -30588,10 +30377,7 @@
         <w:t>C</w:t>
       </w:r>
       <w:r>
-        <w:t xml:space="preserve"> </w:t>
-      </w:r>
-      <w:r>
-        <w:t>кабель.</w:t>
+        <w:t xml:space="preserve"> кабель.</w:t>
       </w:r>
     </w:p>
     <w:p>
@@ -32040,19 +31826,7 @@
         <w:rPr>
           <w:lang w:val="ru-RU"/>
         </w:rPr>
-        <w:t xml:space="preserve">При нажатии на </w:t>
-      </w:r>
-      <w:r>
-        <w:rPr>
-          <w:lang w:val="ru-RU"/>
-        </w:rPr>
-        <w:t>правую</w:t>
-      </w:r>
-      <w:r>
-        <w:rPr>
-          <w:lang w:val="ru-RU"/>
-        </w:rPr>
-        <w:t xml:space="preserve"> клавишу в компьютер будет оправлено сочетание клавиш </w:t>
+        <w:t xml:space="preserve">При нажатии на правую клавишу в компьютер будет оправлено сочетание клавиш </w:t>
       </w:r>
       <w:r>
         <w:rPr>
@@ -32094,19 +31868,7 @@
         <w:rPr>
           <w:lang w:val="ru-RU"/>
         </w:rPr>
-        <w:t>(«</w:t>
-      </w:r>
-      <w:r>
-        <w:rPr>
-          <w:lang w:val="ru-RU"/>
-        </w:rPr>
-        <w:t>вставлено</w:t>
-      </w:r>
-      <w:r>
-        <w:rPr>
-          <w:lang w:val="ru-RU"/>
-        </w:rPr>
-        <w:t xml:space="preserve">») (рис. </w:t>
+        <w:t xml:space="preserve">(«вставлено») (рис. </w:t>
       </w:r>
       <w:r>
         <w:rPr>
@@ -35730,7 +35492,7 @@
     <w:autoRedefine/>
     <w:uiPriority w:val="39"/>
     <w:unhideWhenUsed/>
-    <w:rsid w:val="006B16F0"/>
+    <w:rsid w:val="00334374"/>
     <w:pPr>
       <w:tabs>
         <w:tab w:val="right" w:leader="dot" w:pos="9628"/>

</xml_diff>